<commit_message>
Add mainstream model comparisons to thesis
</commit_message>
<xml_diff>
--- a/硕士学位论文初稿_低专业度版.docx
+++ b/硕士学位论文初稿_低专业度版.docx
@@ -356,7 +356,170 @@
         <w:ind w:firstLine="0"/>
       </w:pPr>
       <w:r>
-        <w:t>1.3.2 超声图像中的多分支特征处理</w:t>
+        <w:t>1.3.2 主流对比模型介绍</w:t>
+      </w:r>
+    </w:p>
+    <w:p>
+      <w:pPr>
+        <w:ind w:firstLine="420"/>
+      </w:pPr>
+      <w:r>
+        <w:rPr>
+          <w:rFonts w:ascii="宋体" w:hAnsi="宋体" w:eastAsia="宋体"/>
+        </w:rPr>
+        <w:t>为了更清楚地说明本文方法与常见分割网络的区别，下面介绍项目中已经实现并报告 BUSI 结果的 11 个模型。它们可以分为传统卷积模型、Transformer 或混合模型，以及轻量化模型三类。</w:t>
+      </w:r>
+    </w:p>
+    <w:p>
+      <w:pPr>
+        <w:pStyle w:val="ListNumber"/>
+        <w:ind w:firstLine="0"/>
+      </w:pPr>
+      <w:r>
+        <w:rPr>
+          <w:rFonts w:ascii="宋体" w:hAnsi="宋体" w:eastAsia="宋体"/>
+        </w:rPr>
+        <w:t>U-Net。 U-Net 采用编码器和解码器结构。编码器逐步提取较深层特征，解码器恢复图像尺寸，同尺度跳跃连接把浅层细节直接送到解码端。它结构简单、容易训练，是本文和多数医学图像分割工作的基础模型[1]。</w:t>
+      </w:r>
+    </w:p>
+    <w:p>
+      <w:pPr>
+        <w:pStyle w:val="ListNumber"/>
+        <w:ind w:firstLine="0"/>
+      </w:pPr>
+      <w:r>
+        <w:rPr>
+          <w:rFonts w:ascii="宋体" w:hAnsi="宋体" w:eastAsia="宋体"/>
+        </w:rPr>
+        <w:t>Attention U-Net。 Attention U-Net 在跳跃连接处加入注意力门。解码器提供的较高层信息用于判断哪些编码特征更重要，从而减弱背景区域的影响。不过，注意力门会增加少量参数和计算量[2]。</w:t>
+      </w:r>
+    </w:p>
+    <w:p>
+      <w:pPr>
+        <w:pStyle w:val="ListNumber"/>
+        <w:ind w:firstLine="0"/>
+      </w:pPr>
+      <w:r>
+        <w:rPr>
+          <w:rFonts w:ascii="宋体" w:hAnsi="宋体" w:eastAsia="宋体"/>
+        </w:rPr>
+        <w:t>U-Net++。 U-Net++ 把原来直接相连的跳跃连接改成多层嵌套连接，并在中间层逐步融合编码和解码特征。它还可以使用深监督帮助不同深度的输出学习，但连接较多，结构比 U-Net 更复杂[3]。</w:t>
+      </w:r>
+    </w:p>
+    <w:p>
+      <w:pPr>
+        <w:pStyle w:val="ListNumber"/>
+        <w:ind w:firstLine="0"/>
+      </w:pPr>
+      <w:r>
+        <w:rPr>
+          <w:rFonts w:ascii="宋体" w:hAnsi="宋体" w:eastAsia="宋体"/>
+        </w:rPr>
+        <w:t>U-Net3+。 U-Net3+ 在每个解码阶段同时接收多个编码层和解码层的特征，使不同尺度的信息能够更充分地融合。这种全尺度连接有利于处理大小不同的目标，但计算量通常较大[4]。</w:t>
+      </w:r>
+    </w:p>
+    <w:p>
+      <w:pPr>
+        <w:pStyle w:val="ListNumber"/>
+        <w:ind w:firstLine="0"/>
+      </w:pPr>
+      <w:r>
+        <w:rPr>
+          <w:rFonts w:ascii="宋体" w:hAnsi="宋体" w:eastAsia="宋体"/>
+        </w:rPr>
+        <w:t>TransUnet。 TransUnet 先使用卷积网络提取局部特征，再使用 Transformer 建立较远位置之间的联系，最后通过 U 形解码器恢复分割图。它兼顾局部和整体信息，但参数量较大，对训练数据和预训练权重也比较敏感[6]。</w:t>
+      </w:r>
+    </w:p>
+    <w:p>
+      <w:pPr>
+        <w:pStyle w:val="ListNumber"/>
+        <w:ind w:firstLine="0"/>
+      </w:pPr>
+      <w:r>
+        <w:rPr>
+          <w:rFonts w:ascii="宋体" w:hAnsi="宋体" w:eastAsia="宋体"/>
+        </w:rPr>
+        <w:t>MedT。 MedT 使用门控轴向注意力，把二维注意力分成水平和垂直两个方向计算，以降低完整自注意力的开销。它还采用整图和局部图块结合的训练方法，同时学习整体位置和局部细节[31]。</w:t>
+      </w:r>
+    </w:p>
+    <w:p>
+      <w:pPr>
+        <w:pStyle w:val="ListNumber"/>
+        <w:ind w:firstLine="0"/>
+      </w:pPr>
+      <w:r>
+        <w:rPr>
+          <w:rFonts w:ascii="宋体" w:hAnsi="宋体" w:eastAsia="宋体"/>
+        </w:rPr>
+        <w:t>SwinUnet。 SwinUnet 使用分层的 Swin Transformer 组成编码器和解码器，并通过移动窗口让相邻窗口之间交换信息。窗口注意力能够控制计算量，但模型在小型医学数据集上的效果容易受到预训练方式和训练设置影响[7]。</w:t>
+      </w:r>
+    </w:p>
+    <w:p>
+      <w:pPr>
+        <w:pStyle w:val="ListNumber"/>
+        <w:ind w:firstLine="0"/>
+      </w:pPr>
+      <w:r>
+        <w:rPr>
+          <w:rFonts w:ascii="宋体" w:hAnsi="宋体" w:eastAsia="宋体"/>
+        </w:rPr>
+        <w:t>UNeXt。 UNeXt 前几层使用卷积，网络较深位置使用基于多层感知机的特征块。它通过通道移动和特征投影学习局部联系，重点是减少参数量和提高推理速度[32]。</w:t>
+      </w:r>
+    </w:p>
+    <w:p>
+      <w:pPr>
+        <w:pStyle w:val="ListNumber"/>
+        <w:ind w:firstLine="0"/>
+      </w:pPr>
+      <w:r>
+        <w:rPr>
+          <w:rFonts w:ascii="宋体" w:hAnsi="宋体" w:eastAsia="宋体"/>
+        </w:rPr>
+        <w:t>CMU-Net。 CMU-Net 面向超声图像设计，使用 ConvMixer 模块扩大特征的有效范围，并在跳跃连接中加入多尺度注意力门。前者用于补充整体信息，后者用于筛选更有用的浅层特征[33]。</w:t>
+      </w:r>
+    </w:p>
+    <w:p>
+      <w:pPr>
+        <w:pStyle w:val="ListNumber"/>
+        <w:ind w:firstLine="0"/>
+      </w:pPr>
+      <w:r>
+        <w:rPr>
+          <w:rFonts w:ascii="宋体" w:hAnsi="宋体" w:eastAsia="宋体"/>
+        </w:rPr>
+        <w:t>CMUNeXt。 CMUNeXt 是轻量卷积网络。它使用大卷积核和倒置瓶颈结构提取较大范围的信息，并通过 Skip-Fusion 模块改善编码器和解码器之间的特征融合[34]。</w:t>
+      </w:r>
+    </w:p>
+    <w:p>
+      <w:pPr>
+        <w:pStyle w:val="ListNumber"/>
+        <w:ind w:firstLine="0"/>
+      </w:pPr>
+      <w:r>
+        <w:rPr>
+          <w:rFonts w:ascii="宋体" w:hAnsi="宋体" w:eastAsia="宋体"/>
+        </w:rPr>
+        <w:t>Mobile U-ViT。 Mobile U-ViT 面向移动设备设计，使用大卷积核卷积块完成分层特征提取，在最深层加入较浅的 Transformer，并采用级联解码器恢复分割结果。该模型在参数量较小的情况下兼顾局部和整体信息，是原项目参考结果中 IoU 和 Dice 最高的模型[35]。</w:t>
+      </w:r>
+    </w:p>
+    <w:p>
+      <w:pPr>
+        <w:ind w:firstLine="420"/>
+      </w:pPr>
+      <w:r>
+        <w:rPr>
+          <w:rFonts w:ascii="宋体" w:hAnsi="宋体" w:eastAsia="宋体"/>
+        </w:rPr>
+        <w:t>这 11 个模型代表了三条常见改进路线：Attention U-Net、U-Net++ 和 U-Net3+ 主要改进特征融合；TransUnet、MedT 和 SwinUnet 主要增加长距离信息；UNeXt、CMUNeXt 和 Mobile U-ViT 更重视轻量化。本文没有直接替换 U-Net 主干，而是在统一基线上按 A、B、C、D 的顺序解决局部特征、整体关系、边界和易错区域问题。</w:t>
+      </w:r>
+    </w:p>
+    <w:p>
+      <w:pPr>
+        <w:pStyle w:val="Heading3"/>
+        <w:ind w:firstLine="0"/>
+      </w:pPr>
+      <w:r>
+        <w:t>1.3.3 超声图像中的多分支特征处理</w:t>
       </w:r>
     </w:p>
     <w:p>
@@ -376,7 +539,7 @@
         <w:ind w:firstLine="0"/>
       </w:pPr>
       <w:r>
-        <w:t>1.3.3 特征关系计算与全局关系建模</w:t>
+        <w:t>1.3.4 特征关系计算与全局关系建模</w:t>
       </w:r>
     </w:p>
     <w:p>
@@ -396,7 +559,7 @@
         <w:ind w:firstLine="0"/>
       </w:pPr>
       <w:r>
-        <w:t>1.3.4 边界监督、距离场与不确定性</w:t>
+        <w:t>1.3.5 边界监督、距离场与不确定性</w:t>
       </w:r>
     </w:p>
     <w:p>
@@ -427,7 +590,7 @@
         <w:ind w:firstLine="0"/>
       </w:pPr>
       <w:r>
-        <w:t>1.3.5 既有工作与本文创新边界</w:t>
+        <w:t>1.3.6 既有工作与本文创新边界</w:t>
       </w:r>
     </w:p>
     <w:p>
@@ -2413,7 +2576,1432 @@
         <w:ind w:firstLine="0"/>
       </w:pPr>
       <w:r>
-        <w:t>3.5 配对统计分析</w:t>
+        <w:t>3.5 与主流模型的参考对比</w:t>
+      </w:r>
+    </w:p>
+    <w:p>
+      <w:pPr>
+        <w:ind w:firstLine="420"/>
+      </w:pPr>
+      <w:r>
+        <w:rPr>
+          <w:rFonts w:ascii="宋体" w:hAnsi="宋体" w:eastAsia="宋体"/>
+        </w:rPr>
+        <w:t>原项目在 BUSI 的 647 个病灶病例上比较了 11 个主流模型。参考实验把数据随机划分三次，每次使用 70% 训练、30% 验证，并将图像统一缩放到 256×256。表中的均值和标准差来自这三次随机划分[36]。本文使用固定 split 3，并在同一划分上改变训练随机种子，因此两组结果的数据划分含义不同。为了减少单次结果的偶然性，本节使用 UnetAB 的三随机种子均值进行对照。</w:t>
+      </w:r>
+    </w:p>
+    <w:tbl>
+      <w:tblPr>
+        <w:tblStyle w:val="TableGrid"/>
+        <w:tblW w:type="auto" w:w="0"/>
+        <w:jc w:val="center"/>
+        <w:tblLook w:firstColumn="1" w:firstRow="1" w:lastColumn="0" w:lastRow="0" w:noHBand="0" w:noVBand="1" w:val="04A0"/>
+      </w:tblPr>
+      <w:tblGrid>
+        <w:gridCol w:w="1520"/>
+        <w:gridCol w:w="1520"/>
+        <w:gridCol w:w="1520"/>
+        <w:gridCol w:w="1520"/>
+        <w:gridCol w:w="1520"/>
+        <w:gridCol w:w="1520"/>
+      </w:tblGrid>
+      <w:tr>
+        <w:trPr>
+          <w:tblHeader w:val="true"/>
+        </w:trPr>
+        <w:tc>
+          <w:tcPr>
+            <w:tcW w:type="dxa" w:w="1520"/>
+            <w:vAlign w:val="center"/>
+          </w:tcPr>
+          <w:p>
+            <w:r/>
+            <w:r>
+              <w:rPr>
+                <w:rFonts w:ascii="宋体" w:hAnsi="宋体" w:eastAsia="宋体"/>
+                <w:b/>
+                <w:sz w:val="18"/>
+              </w:rPr>
+              <w:t>模型</w:t>
+            </w:r>
+          </w:p>
+        </w:tc>
+        <w:tc>
+          <w:tcPr>
+            <w:tcW w:type="dxa" w:w="1520"/>
+            <w:vAlign w:val="center"/>
+          </w:tcPr>
+          <w:p>
+            <w:r/>
+            <w:r>
+              <w:rPr>
+                <w:rFonts w:ascii="宋体" w:hAnsi="宋体" w:eastAsia="宋体"/>
+                <w:b/>
+                <w:sz w:val="18"/>
+              </w:rPr>
+              <w:t>参数量/M</w:t>
+            </w:r>
+          </w:p>
+        </w:tc>
+        <w:tc>
+          <w:tcPr>
+            <w:tcW w:type="dxa" w:w="1520"/>
+            <w:vAlign w:val="center"/>
+          </w:tcPr>
+          <w:p>
+            <w:r/>
+            <w:r>
+              <w:rPr>
+                <w:rFonts w:ascii="宋体" w:hAnsi="宋体" w:eastAsia="宋体"/>
+                <w:b/>
+                <w:sz w:val="18"/>
+              </w:rPr>
+              <w:t>FPS</w:t>
+            </w:r>
+          </w:p>
+        </w:tc>
+        <w:tc>
+          <w:tcPr>
+            <w:tcW w:type="dxa" w:w="1520"/>
+            <w:vAlign w:val="center"/>
+          </w:tcPr>
+          <w:p>
+            <w:r/>
+            <w:r>
+              <w:rPr>
+                <w:rFonts w:ascii="宋体" w:hAnsi="宋体" w:eastAsia="宋体"/>
+                <w:b/>
+                <w:sz w:val="18"/>
+              </w:rPr>
+              <w:t>计算量（原报告口径）</w:t>
+            </w:r>
+          </w:p>
+        </w:tc>
+        <w:tc>
+          <w:tcPr>
+            <w:tcW w:type="dxa" w:w="1520"/>
+            <w:vAlign w:val="center"/>
+          </w:tcPr>
+          <w:p>
+            <w:r/>
+            <w:r>
+              <w:rPr>
+                <w:rFonts w:ascii="宋体" w:hAnsi="宋体" w:eastAsia="宋体"/>
+                <w:b/>
+                <w:sz w:val="18"/>
+              </w:rPr>
+              <w:t>IoU/%</w:t>
+            </w:r>
+          </w:p>
+        </w:tc>
+        <w:tc>
+          <w:tcPr>
+            <w:tcW w:type="dxa" w:w="1520"/>
+            <w:vAlign w:val="center"/>
+          </w:tcPr>
+          <w:p>
+            <w:r/>
+            <w:r>
+              <w:rPr>
+                <w:rFonts w:ascii="宋体" w:hAnsi="宋体" w:eastAsia="宋体"/>
+                <w:b/>
+                <w:sz w:val="18"/>
+              </w:rPr>
+              <w:t>Dice/%</w:t>
+            </w:r>
+          </w:p>
+        </w:tc>
+      </w:tr>
+      <w:tr>
+        <w:tc>
+          <w:tcPr>
+            <w:tcW w:type="dxa" w:w="1520"/>
+            <w:vAlign w:val="center"/>
+          </w:tcPr>
+          <w:p>
+            <w:r/>
+            <w:r>
+              <w:rPr>
+                <w:rFonts w:ascii="宋体" w:hAnsi="宋体" w:eastAsia="宋体"/>
+                <w:b w:val="0"/>
+                <w:sz w:val="18"/>
+              </w:rPr>
+              <w:t>U-Net</w:t>
+            </w:r>
+          </w:p>
+        </w:tc>
+        <w:tc>
+          <w:tcPr>
+            <w:tcW w:type="dxa" w:w="1520"/>
+            <w:vAlign w:val="center"/>
+          </w:tcPr>
+          <w:p>
+            <w:r/>
+            <w:r>
+              <w:rPr>
+                <w:rFonts w:ascii="宋体" w:hAnsi="宋体" w:eastAsia="宋体"/>
+                <w:b w:val="0"/>
+                <w:sz w:val="18"/>
+              </w:rPr>
+              <w:t>34.52</w:t>
+            </w:r>
+          </w:p>
+        </w:tc>
+        <w:tc>
+          <w:tcPr>
+            <w:tcW w:type="dxa" w:w="1520"/>
+            <w:vAlign w:val="center"/>
+          </w:tcPr>
+          <w:p>
+            <w:r/>
+            <w:r>
+              <w:rPr>
+                <w:rFonts w:ascii="宋体" w:hAnsi="宋体" w:eastAsia="宋体"/>
+                <w:b w:val="0"/>
+                <w:sz w:val="18"/>
+              </w:rPr>
+              <w:t>139.32</w:t>
+            </w:r>
+          </w:p>
+        </w:tc>
+        <w:tc>
+          <w:tcPr>
+            <w:tcW w:type="dxa" w:w="1520"/>
+            <w:vAlign w:val="center"/>
+          </w:tcPr>
+          <w:p>
+            <w:r/>
+            <w:r>
+              <w:rPr>
+                <w:rFonts w:ascii="宋体" w:hAnsi="宋体" w:eastAsia="宋体"/>
+                <w:b w:val="0"/>
+                <w:sz w:val="18"/>
+              </w:rPr>
+              <w:t>65.52 GFLOPs</w:t>
+            </w:r>
+          </w:p>
+        </w:tc>
+        <w:tc>
+          <w:tcPr>
+            <w:tcW w:type="dxa" w:w="1520"/>
+            <w:vAlign w:val="center"/>
+          </w:tcPr>
+          <w:p>
+            <w:r/>
+            <w:r>
+              <w:rPr>
+                <w:rFonts w:ascii="宋体" w:hAnsi="宋体" w:eastAsia="宋体"/>
+                <w:b w:val="0"/>
+                <w:sz w:val="18"/>
+              </w:rPr>
+              <w:t>68.61±2.86</w:t>
+            </w:r>
+          </w:p>
+        </w:tc>
+        <w:tc>
+          <w:tcPr>
+            <w:tcW w:type="dxa" w:w="1520"/>
+            <w:vAlign w:val="center"/>
+          </w:tcPr>
+          <w:p>
+            <w:r/>
+            <w:r>
+              <w:rPr>
+                <w:rFonts w:ascii="宋体" w:hAnsi="宋体" w:eastAsia="宋体"/>
+                <w:b w:val="0"/>
+                <w:sz w:val="18"/>
+              </w:rPr>
+              <w:t>76.97±3.10</w:t>
+            </w:r>
+          </w:p>
+        </w:tc>
+      </w:tr>
+      <w:tr>
+        <w:tc>
+          <w:tcPr>
+            <w:tcW w:type="dxa" w:w="1520"/>
+            <w:vAlign w:val="center"/>
+          </w:tcPr>
+          <w:p>
+            <w:r/>
+            <w:r>
+              <w:rPr>
+                <w:rFonts w:ascii="宋体" w:hAnsi="宋体" w:eastAsia="宋体"/>
+                <w:b w:val="0"/>
+                <w:sz w:val="18"/>
+              </w:rPr>
+              <w:t>Attention U-Net</w:t>
+            </w:r>
+          </w:p>
+        </w:tc>
+        <w:tc>
+          <w:tcPr>
+            <w:tcW w:type="dxa" w:w="1520"/>
+            <w:vAlign w:val="center"/>
+          </w:tcPr>
+          <w:p>
+            <w:r/>
+            <w:r>
+              <w:rPr>
+                <w:rFonts w:ascii="宋体" w:hAnsi="宋体" w:eastAsia="宋体"/>
+                <w:b w:val="0"/>
+                <w:sz w:val="18"/>
+              </w:rPr>
+              <w:t>34.87</w:t>
+            </w:r>
+          </w:p>
+        </w:tc>
+        <w:tc>
+          <w:tcPr>
+            <w:tcW w:type="dxa" w:w="1520"/>
+            <w:vAlign w:val="center"/>
+          </w:tcPr>
+          <w:p>
+            <w:r/>
+            <w:r>
+              <w:rPr>
+                <w:rFonts w:ascii="宋体" w:hAnsi="宋体" w:eastAsia="宋体"/>
+                <w:b w:val="0"/>
+                <w:sz w:val="18"/>
+              </w:rPr>
+              <w:t>129.92</w:t>
+            </w:r>
+          </w:p>
+        </w:tc>
+        <w:tc>
+          <w:tcPr>
+            <w:tcW w:type="dxa" w:w="1520"/>
+            <w:vAlign w:val="center"/>
+          </w:tcPr>
+          <w:p>
+            <w:r/>
+            <w:r>
+              <w:rPr>
+                <w:rFonts w:ascii="宋体" w:hAnsi="宋体" w:eastAsia="宋体"/>
+                <w:b w:val="0"/>
+                <w:sz w:val="18"/>
+              </w:rPr>
+              <w:t>66.63 GFLOPs</w:t>
+            </w:r>
+          </w:p>
+        </w:tc>
+        <w:tc>
+          <w:tcPr>
+            <w:tcW w:type="dxa" w:w="1520"/>
+            <w:vAlign w:val="center"/>
+          </w:tcPr>
+          <w:p>
+            <w:r/>
+            <w:r>
+              <w:rPr>
+                <w:rFonts w:ascii="宋体" w:hAnsi="宋体" w:eastAsia="宋体"/>
+                <w:b w:val="0"/>
+                <w:sz w:val="18"/>
+              </w:rPr>
+              <w:t>68.55±3.22</w:t>
+            </w:r>
+          </w:p>
+        </w:tc>
+        <w:tc>
+          <w:tcPr>
+            <w:tcW w:type="dxa" w:w="1520"/>
+            <w:vAlign w:val="center"/>
+          </w:tcPr>
+          <w:p>
+            <w:r/>
+            <w:r>
+              <w:rPr>
+                <w:rFonts w:ascii="宋体" w:hAnsi="宋体" w:eastAsia="宋体"/>
+                <w:b w:val="0"/>
+                <w:sz w:val="18"/>
+              </w:rPr>
+              <w:t>76.88±3.50</w:t>
+            </w:r>
+          </w:p>
+        </w:tc>
+      </w:tr>
+      <w:tr>
+        <w:tc>
+          <w:tcPr>
+            <w:tcW w:type="dxa" w:w="1520"/>
+            <w:vAlign w:val="center"/>
+          </w:tcPr>
+          <w:p>
+            <w:r/>
+            <w:r>
+              <w:rPr>
+                <w:rFonts w:ascii="宋体" w:hAnsi="宋体" w:eastAsia="宋体"/>
+                <w:b w:val="0"/>
+                <w:sz w:val="18"/>
+              </w:rPr>
+              <w:t>U-Net++</w:t>
+            </w:r>
+          </w:p>
+        </w:tc>
+        <w:tc>
+          <w:tcPr>
+            <w:tcW w:type="dxa" w:w="1520"/>
+            <w:vAlign w:val="center"/>
+          </w:tcPr>
+          <w:p>
+            <w:r/>
+            <w:r>
+              <w:rPr>
+                <w:rFonts w:ascii="宋体" w:hAnsi="宋体" w:eastAsia="宋体"/>
+                <w:b w:val="0"/>
+                <w:sz w:val="18"/>
+              </w:rPr>
+              <w:t>26.90</w:t>
+            </w:r>
+          </w:p>
+        </w:tc>
+        <w:tc>
+          <w:tcPr>
+            <w:tcW w:type="dxa" w:w="1520"/>
+            <w:vAlign w:val="center"/>
+          </w:tcPr>
+          <w:p>
+            <w:r/>
+            <w:r>
+              <w:rPr>
+                <w:rFonts w:ascii="宋体" w:hAnsi="宋体" w:eastAsia="宋体"/>
+                <w:b w:val="0"/>
+                <w:sz w:val="18"/>
+              </w:rPr>
+              <w:t>125.50</w:t>
+            </w:r>
+          </w:p>
+        </w:tc>
+        <w:tc>
+          <w:tcPr>
+            <w:tcW w:type="dxa" w:w="1520"/>
+            <w:vAlign w:val="center"/>
+          </w:tcPr>
+          <w:p>
+            <w:r/>
+            <w:r>
+              <w:rPr>
+                <w:rFonts w:ascii="宋体" w:hAnsi="宋体" w:eastAsia="宋体"/>
+                <w:b w:val="0"/>
+                <w:sz w:val="18"/>
+              </w:rPr>
+              <w:t>37.62 GFLOPs</w:t>
+            </w:r>
+          </w:p>
+        </w:tc>
+        <w:tc>
+          <w:tcPr>
+            <w:tcW w:type="dxa" w:w="1520"/>
+            <w:vAlign w:val="center"/>
+          </w:tcPr>
+          <w:p>
+            <w:r/>
+            <w:r>
+              <w:rPr>
+                <w:rFonts w:ascii="宋体" w:hAnsi="宋体" w:eastAsia="宋体"/>
+                <w:b w:val="0"/>
+                <w:sz w:val="18"/>
+              </w:rPr>
+              <w:t>69.49±2.94</w:t>
+            </w:r>
+          </w:p>
+        </w:tc>
+        <w:tc>
+          <w:tcPr>
+            <w:tcW w:type="dxa" w:w="1520"/>
+            <w:vAlign w:val="center"/>
+          </w:tcPr>
+          <w:p>
+            <w:r/>
+            <w:r>
+              <w:rPr>
+                <w:rFonts w:ascii="宋体" w:hAnsi="宋体" w:eastAsia="宋体"/>
+                <w:b w:val="0"/>
+                <w:sz w:val="18"/>
+              </w:rPr>
+              <w:t>78.06±3.25</w:t>
+            </w:r>
+          </w:p>
+        </w:tc>
+      </w:tr>
+      <w:tr>
+        <w:tc>
+          <w:tcPr>
+            <w:tcW w:type="dxa" w:w="1520"/>
+            <w:vAlign w:val="center"/>
+          </w:tcPr>
+          <w:p>
+            <w:r/>
+            <w:r>
+              <w:rPr>
+                <w:rFonts w:ascii="宋体" w:hAnsi="宋体" w:eastAsia="宋体"/>
+                <w:b w:val="0"/>
+                <w:sz w:val="18"/>
+              </w:rPr>
+              <w:t>U-Net3+</w:t>
+            </w:r>
+          </w:p>
+        </w:tc>
+        <w:tc>
+          <w:tcPr>
+            <w:tcW w:type="dxa" w:w="1520"/>
+            <w:vAlign w:val="center"/>
+          </w:tcPr>
+          <w:p>
+            <w:r/>
+            <w:r>
+              <w:rPr>
+                <w:rFonts w:ascii="宋体" w:hAnsi="宋体" w:eastAsia="宋体"/>
+                <w:b w:val="0"/>
+                <w:sz w:val="18"/>
+              </w:rPr>
+              <w:t>26.97</w:t>
+            </w:r>
+          </w:p>
+        </w:tc>
+        <w:tc>
+          <w:tcPr>
+            <w:tcW w:type="dxa" w:w="1520"/>
+            <w:vAlign w:val="center"/>
+          </w:tcPr>
+          <w:p>
+            <w:r/>
+            <w:r>
+              <w:rPr>
+                <w:rFonts w:ascii="宋体" w:hAnsi="宋体" w:eastAsia="宋体"/>
+                <w:b w:val="0"/>
+                <w:sz w:val="18"/>
+              </w:rPr>
+              <w:t>50.60</w:t>
+            </w:r>
+          </w:p>
+        </w:tc>
+        <w:tc>
+          <w:tcPr>
+            <w:tcW w:type="dxa" w:w="1520"/>
+            <w:vAlign w:val="center"/>
+          </w:tcPr>
+          <w:p>
+            <w:r/>
+            <w:r>
+              <w:rPr>
+                <w:rFonts w:ascii="宋体" w:hAnsi="宋体" w:eastAsia="宋体"/>
+                <w:b w:val="0"/>
+                <w:sz w:val="18"/>
+              </w:rPr>
+              <w:t>199.74 GFLOPs</w:t>
+            </w:r>
+          </w:p>
+        </w:tc>
+        <w:tc>
+          <w:tcPr>
+            <w:tcW w:type="dxa" w:w="1520"/>
+            <w:vAlign w:val="center"/>
+          </w:tcPr>
+          <w:p>
+            <w:r/>
+            <w:r>
+              <w:rPr>
+                <w:rFonts w:ascii="宋体" w:hAnsi="宋体" w:eastAsia="宋体"/>
+                <w:b w:val="0"/>
+                <w:sz w:val="18"/>
+              </w:rPr>
+              <w:t>68.38±3.35</w:t>
+            </w:r>
+          </w:p>
+        </w:tc>
+        <w:tc>
+          <w:tcPr>
+            <w:tcW w:type="dxa" w:w="1520"/>
+            <w:vAlign w:val="center"/>
+          </w:tcPr>
+          <w:p>
+            <w:r/>
+            <w:r>
+              <w:rPr>
+                <w:rFonts w:ascii="宋体" w:hAnsi="宋体" w:eastAsia="宋体"/>
+                <w:b w:val="0"/>
+                <w:sz w:val="18"/>
+              </w:rPr>
+              <w:t>76.88±3.68</w:t>
+            </w:r>
+          </w:p>
+        </w:tc>
+      </w:tr>
+      <w:tr>
+        <w:tc>
+          <w:tcPr>
+            <w:tcW w:type="dxa" w:w="1520"/>
+            <w:vAlign w:val="center"/>
+          </w:tcPr>
+          <w:p>
+            <w:r/>
+            <w:r>
+              <w:rPr>
+                <w:rFonts w:ascii="宋体" w:hAnsi="宋体" w:eastAsia="宋体"/>
+                <w:b w:val="0"/>
+                <w:sz w:val="18"/>
+              </w:rPr>
+              <w:t>TransUnet</w:t>
+            </w:r>
+          </w:p>
+        </w:tc>
+        <w:tc>
+          <w:tcPr>
+            <w:tcW w:type="dxa" w:w="1520"/>
+            <w:vAlign w:val="center"/>
+          </w:tcPr>
+          <w:p>
+            <w:r/>
+            <w:r>
+              <w:rPr>
+                <w:rFonts w:ascii="宋体" w:hAnsi="宋体" w:eastAsia="宋体"/>
+                <w:b w:val="0"/>
+                <w:sz w:val="18"/>
+              </w:rPr>
+              <w:t>105.32</w:t>
+            </w:r>
+          </w:p>
+        </w:tc>
+        <w:tc>
+          <w:tcPr>
+            <w:tcW w:type="dxa" w:w="1520"/>
+            <w:vAlign w:val="center"/>
+          </w:tcPr>
+          <w:p>
+            <w:r/>
+            <w:r>
+              <w:rPr>
+                <w:rFonts w:ascii="宋体" w:hAnsi="宋体" w:eastAsia="宋体"/>
+                <w:b w:val="0"/>
+                <w:sz w:val="18"/>
+              </w:rPr>
+              <w:t>112.95</w:t>
+            </w:r>
+          </w:p>
+        </w:tc>
+        <w:tc>
+          <w:tcPr>
+            <w:tcW w:type="dxa" w:w="1520"/>
+            <w:vAlign w:val="center"/>
+          </w:tcPr>
+          <w:p>
+            <w:r/>
+            <w:r>
+              <w:rPr>
+                <w:rFonts w:ascii="宋体" w:hAnsi="宋体" w:eastAsia="宋体"/>
+                <w:b w:val="0"/>
+                <w:sz w:val="18"/>
+              </w:rPr>
+              <w:t>38.52 GFLOPs</w:t>
+            </w:r>
+          </w:p>
+        </w:tc>
+        <w:tc>
+          <w:tcPr>
+            <w:tcW w:type="dxa" w:w="1520"/>
+            <w:vAlign w:val="center"/>
+          </w:tcPr>
+          <w:p>
+            <w:r/>
+            <w:r>
+              <w:rPr>
+                <w:rFonts w:ascii="宋体" w:hAnsi="宋体" w:eastAsia="宋体"/>
+                <w:b w:val="0"/>
+                <w:sz w:val="18"/>
+              </w:rPr>
+              <w:t>71.39±2.37</w:t>
+            </w:r>
+          </w:p>
+        </w:tc>
+        <w:tc>
+          <w:tcPr>
+            <w:tcW w:type="dxa" w:w="1520"/>
+            <w:vAlign w:val="center"/>
+          </w:tcPr>
+          <w:p>
+            <w:r/>
+            <w:r>
+              <w:rPr>
+                <w:rFonts w:ascii="宋体" w:hAnsi="宋体" w:eastAsia="宋体"/>
+                <w:b w:val="0"/>
+                <w:sz w:val="18"/>
+              </w:rPr>
+              <w:t>79.85±2.59</w:t>
+            </w:r>
+          </w:p>
+        </w:tc>
+      </w:tr>
+      <w:tr>
+        <w:tc>
+          <w:tcPr>
+            <w:tcW w:type="dxa" w:w="1520"/>
+            <w:vAlign w:val="center"/>
+          </w:tcPr>
+          <w:p>
+            <w:r/>
+            <w:r>
+              <w:rPr>
+                <w:rFonts w:ascii="宋体" w:hAnsi="宋体" w:eastAsia="宋体"/>
+                <w:b w:val="0"/>
+                <w:sz w:val="18"/>
+              </w:rPr>
+              <w:t>MedT</w:t>
+            </w:r>
+          </w:p>
+        </w:tc>
+        <w:tc>
+          <w:tcPr>
+            <w:tcW w:type="dxa" w:w="1520"/>
+            <w:vAlign w:val="center"/>
+          </w:tcPr>
+          <w:p>
+            <w:r/>
+            <w:r>
+              <w:rPr>
+                <w:rFonts w:ascii="宋体" w:hAnsi="宋体" w:eastAsia="宋体"/>
+                <w:b w:val="0"/>
+                <w:sz w:val="18"/>
+              </w:rPr>
+              <w:t>1.37</w:t>
+            </w:r>
+          </w:p>
+        </w:tc>
+        <w:tc>
+          <w:tcPr>
+            <w:tcW w:type="dxa" w:w="1520"/>
+            <w:vAlign w:val="center"/>
+          </w:tcPr>
+          <w:p>
+            <w:r/>
+            <w:r>
+              <w:rPr>
+                <w:rFonts w:ascii="宋体" w:hAnsi="宋体" w:eastAsia="宋体"/>
+                <w:b w:val="0"/>
+                <w:sz w:val="18"/>
+              </w:rPr>
+              <w:t>22.97</w:t>
+            </w:r>
+          </w:p>
+        </w:tc>
+        <w:tc>
+          <w:tcPr>
+            <w:tcW w:type="dxa" w:w="1520"/>
+            <w:vAlign w:val="center"/>
+          </w:tcPr>
+          <w:p>
+            <w:r/>
+            <w:r>
+              <w:rPr>
+                <w:rFonts w:ascii="宋体" w:hAnsi="宋体" w:eastAsia="宋体"/>
+                <w:b w:val="0"/>
+                <w:sz w:val="18"/>
+              </w:rPr>
+              <w:t>2.40 GFLOPs</w:t>
+            </w:r>
+          </w:p>
+        </w:tc>
+        <w:tc>
+          <w:tcPr>
+            <w:tcW w:type="dxa" w:w="1520"/>
+            <w:vAlign w:val="center"/>
+          </w:tcPr>
+          <w:p>
+            <w:r/>
+            <w:r>
+              <w:rPr>
+                <w:rFonts w:ascii="宋体" w:hAnsi="宋体" w:eastAsia="宋体"/>
+                <w:b w:val="0"/>
+                <w:sz w:val="18"/>
+              </w:rPr>
+              <w:t>63.36±1.56</w:t>
+            </w:r>
+          </w:p>
+        </w:tc>
+        <w:tc>
+          <w:tcPr>
+            <w:tcW w:type="dxa" w:w="1520"/>
+            <w:vAlign w:val="center"/>
+          </w:tcPr>
+          <w:p>
+            <w:r/>
+            <w:r>
+              <w:rPr>
+                <w:rFonts w:ascii="宋体" w:hAnsi="宋体" w:eastAsia="宋体"/>
+                <w:b w:val="0"/>
+                <w:sz w:val="18"/>
+              </w:rPr>
+              <w:t>73.37±1.63</w:t>
+            </w:r>
+          </w:p>
+        </w:tc>
+      </w:tr>
+      <w:tr>
+        <w:tc>
+          <w:tcPr>
+            <w:tcW w:type="dxa" w:w="1520"/>
+            <w:vAlign w:val="center"/>
+          </w:tcPr>
+          <w:p>
+            <w:r/>
+            <w:r>
+              <w:rPr>
+                <w:rFonts w:ascii="宋体" w:hAnsi="宋体" w:eastAsia="宋体"/>
+                <w:b w:val="0"/>
+                <w:sz w:val="18"/>
+              </w:rPr>
+              <w:t>SwinUnet</w:t>
+            </w:r>
+          </w:p>
+        </w:tc>
+        <w:tc>
+          <w:tcPr>
+            <w:tcW w:type="dxa" w:w="1520"/>
+            <w:vAlign w:val="center"/>
+          </w:tcPr>
+          <w:p>
+            <w:r/>
+            <w:r>
+              <w:rPr>
+                <w:rFonts w:ascii="宋体" w:hAnsi="宋体" w:eastAsia="宋体"/>
+                <w:b w:val="0"/>
+                <w:sz w:val="18"/>
+              </w:rPr>
+              <w:t>27.14</w:t>
+            </w:r>
+          </w:p>
+        </w:tc>
+        <w:tc>
+          <w:tcPr>
+            <w:tcW w:type="dxa" w:w="1520"/>
+            <w:vAlign w:val="center"/>
+          </w:tcPr>
+          <w:p>
+            <w:r/>
+            <w:r>
+              <w:rPr>
+                <w:rFonts w:ascii="宋体" w:hAnsi="宋体" w:eastAsia="宋体"/>
+                <w:b w:val="0"/>
+                <w:sz w:val="18"/>
+              </w:rPr>
+              <w:t>392.21</w:t>
+            </w:r>
+          </w:p>
+        </w:tc>
+        <w:tc>
+          <w:tcPr>
+            <w:tcW w:type="dxa" w:w="1520"/>
+            <w:vAlign w:val="center"/>
+          </w:tcPr>
+          <w:p>
+            <w:r/>
+            <w:r>
+              <w:rPr>
+                <w:rFonts w:ascii="宋体" w:hAnsi="宋体" w:eastAsia="宋体"/>
+                <w:b w:val="0"/>
+                <w:sz w:val="18"/>
+              </w:rPr>
+              <w:t>5.91 GFLOPs</w:t>
+            </w:r>
+          </w:p>
+        </w:tc>
+        <w:tc>
+          <w:tcPr>
+            <w:tcW w:type="dxa" w:w="1520"/>
+            <w:vAlign w:val="center"/>
+          </w:tcPr>
+          <w:p>
+            <w:r/>
+            <w:r>
+              <w:rPr>
+                <w:rFonts w:ascii="宋体" w:hAnsi="宋体" w:eastAsia="宋体"/>
+                <w:b w:val="0"/>
+                <w:sz w:val="18"/>
+              </w:rPr>
+              <w:t>54.11±2.29</w:t>
+            </w:r>
+          </w:p>
+        </w:tc>
+        <w:tc>
+          <w:tcPr>
+            <w:tcW w:type="dxa" w:w="1520"/>
+            <w:vAlign w:val="center"/>
+          </w:tcPr>
+          <w:p>
+            <w:r/>
+            <w:r>
+              <w:rPr>
+                <w:rFonts w:ascii="宋体" w:hAnsi="宋体" w:eastAsia="宋体"/>
+                <w:b w:val="0"/>
+                <w:sz w:val="18"/>
+              </w:rPr>
+              <w:t>65.46±1.91</w:t>
+            </w:r>
+          </w:p>
+        </w:tc>
+      </w:tr>
+      <w:tr>
+        <w:tc>
+          <w:tcPr>
+            <w:tcW w:type="dxa" w:w="1520"/>
+            <w:vAlign w:val="center"/>
+          </w:tcPr>
+          <w:p>
+            <w:r/>
+            <w:r>
+              <w:rPr>
+                <w:rFonts w:ascii="宋体" w:hAnsi="宋体" w:eastAsia="宋体"/>
+                <w:b w:val="0"/>
+                <w:sz w:val="18"/>
+              </w:rPr>
+              <w:t>UNeXt</w:t>
+            </w:r>
+          </w:p>
+        </w:tc>
+        <w:tc>
+          <w:tcPr>
+            <w:tcW w:type="dxa" w:w="1520"/>
+            <w:vAlign w:val="center"/>
+          </w:tcPr>
+          <w:p>
+            <w:r/>
+            <w:r>
+              <w:rPr>
+                <w:rFonts w:ascii="宋体" w:hAnsi="宋体" w:eastAsia="宋体"/>
+                <w:b w:val="0"/>
+                <w:sz w:val="18"/>
+              </w:rPr>
+              <w:t>1.47</w:t>
+            </w:r>
+          </w:p>
+        </w:tc>
+        <w:tc>
+          <w:tcPr>
+            <w:tcW w:type="dxa" w:w="1520"/>
+            <w:vAlign w:val="center"/>
+          </w:tcPr>
+          <w:p>
+            <w:r/>
+            <w:r>
+              <w:rPr>
+                <w:rFonts w:ascii="宋体" w:hAnsi="宋体" w:eastAsia="宋体"/>
+                <w:b w:val="0"/>
+                <w:sz w:val="18"/>
+              </w:rPr>
+              <w:t>650.48</w:t>
+            </w:r>
+          </w:p>
+        </w:tc>
+        <w:tc>
+          <w:tcPr>
+            <w:tcW w:type="dxa" w:w="1520"/>
+            <w:vAlign w:val="center"/>
+          </w:tcPr>
+          <w:p>
+            <w:r/>
+            <w:r>
+              <w:rPr>
+                <w:rFonts w:ascii="宋体" w:hAnsi="宋体" w:eastAsia="宋体"/>
+                <w:b w:val="0"/>
+                <w:sz w:val="18"/>
+              </w:rPr>
+              <w:t>0.58 GFLOPs</w:t>
+            </w:r>
+          </w:p>
+        </w:tc>
+        <w:tc>
+          <w:tcPr>
+            <w:tcW w:type="dxa" w:w="1520"/>
+            <w:vAlign w:val="center"/>
+          </w:tcPr>
+          <w:p>
+            <w:r/>
+            <w:r>
+              <w:rPr>
+                <w:rFonts w:ascii="宋体" w:hAnsi="宋体" w:eastAsia="宋体"/>
+                <w:b w:val="0"/>
+                <w:sz w:val="18"/>
+              </w:rPr>
+              <w:t>65.04±2.71</w:t>
+            </w:r>
+          </w:p>
+        </w:tc>
+        <w:tc>
+          <w:tcPr>
+            <w:tcW w:type="dxa" w:w="1520"/>
+            <w:vAlign w:val="center"/>
+          </w:tcPr>
+          <w:p>
+            <w:r/>
+            <w:r>
+              <w:rPr>
+                <w:rFonts w:ascii="宋体" w:hAnsi="宋体" w:eastAsia="宋体"/>
+                <w:b w:val="0"/>
+                <w:sz w:val="18"/>
+              </w:rPr>
+              <w:t>74.16±2.84</w:t>
+            </w:r>
+          </w:p>
+        </w:tc>
+      </w:tr>
+      <w:tr>
+        <w:tc>
+          <w:tcPr>
+            <w:tcW w:type="dxa" w:w="1520"/>
+            <w:vAlign w:val="center"/>
+          </w:tcPr>
+          <w:p>
+            <w:r/>
+            <w:r>
+              <w:rPr>
+                <w:rFonts w:ascii="宋体" w:hAnsi="宋体" w:eastAsia="宋体"/>
+                <w:b w:val="0"/>
+                <w:sz w:val="18"/>
+              </w:rPr>
+              <w:t>CMU-Net</w:t>
+            </w:r>
+          </w:p>
+        </w:tc>
+        <w:tc>
+          <w:tcPr>
+            <w:tcW w:type="dxa" w:w="1520"/>
+            <w:vAlign w:val="center"/>
+          </w:tcPr>
+          <w:p>
+            <w:r/>
+            <w:r>
+              <w:rPr>
+                <w:rFonts w:ascii="宋体" w:hAnsi="宋体" w:eastAsia="宋体"/>
+                <w:b w:val="0"/>
+                <w:sz w:val="18"/>
+              </w:rPr>
+              <w:t>49.93</w:t>
+            </w:r>
+          </w:p>
+        </w:tc>
+        <w:tc>
+          <w:tcPr>
+            <w:tcW w:type="dxa" w:w="1520"/>
+            <w:vAlign w:val="center"/>
+          </w:tcPr>
+          <w:p>
+            <w:r/>
+            <w:r>
+              <w:rPr>
+                <w:rFonts w:ascii="宋体" w:hAnsi="宋体" w:eastAsia="宋体"/>
+                <w:b w:val="0"/>
+                <w:sz w:val="18"/>
+              </w:rPr>
+              <w:t>93.19</w:t>
+            </w:r>
+          </w:p>
+        </w:tc>
+        <w:tc>
+          <w:tcPr>
+            <w:tcW w:type="dxa" w:w="1520"/>
+            <w:vAlign w:val="center"/>
+          </w:tcPr>
+          <w:p>
+            <w:r/>
+            <w:r>
+              <w:rPr>
+                <w:rFonts w:ascii="宋体" w:hAnsi="宋体" w:eastAsia="宋体"/>
+                <w:b w:val="0"/>
+                <w:sz w:val="18"/>
+              </w:rPr>
+              <w:t>91.25 GFLOPs</w:t>
+            </w:r>
+          </w:p>
+        </w:tc>
+        <w:tc>
+          <w:tcPr>
+            <w:tcW w:type="dxa" w:w="1520"/>
+            <w:vAlign w:val="center"/>
+          </w:tcPr>
+          <w:p>
+            <w:r/>
+            <w:r>
+              <w:rPr>
+                <w:rFonts w:ascii="宋体" w:hAnsi="宋体" w:eastAsia="宋体"/>
+                <w:b w:val="0"/>
+                <w:sz w:val="18"/>
+              </w:rPr>
+              <w:t>71.42±2.65</w:t>
+            </w:r>
+          </w:p>
+        </w:tc>
+        <w:tc>
+          <w:tcPr>
+            <w:tcW w:type="dxa" w:w="1520"/>
+            <w:vAlign w:val="center"/>
+          </w:tcPr>
+          <w:p>
+            <w:r/>
+            <w:r>
+              <w:rPr>
+                <w:rFonts w:ascii="宋体" w:hAnsi="宋体" w:eastAsia="宋体"/>
+                <w:b w:val="0"/>
+                <w:sz w:val="18"/>
+              </w:rPr>
+              <w:t>79.49±2.92</w:t>
+            </w:r>
+          </w:p>
+        </w:tc>
+      </w:tr>
+      <w:tr>
+        <w:tc>
+          <w:tcPr>
+            <w:tcW w:type="dxa" w:w="1520"/>
+            <w:vAlign w:val="center"/>
+          </w:tcPr>
+          <w:p>
+            <w:r/>
+            <w:r>
+              <w:rPr>
+                <w:rFonts w:ascii="宋体" w:hAnsi="宋体" w:eastAsia="宋体"/>
+                <w:b w:val="0"/>
+                <w:sz w:val="18"/>
+              </w:rPr>
+              <w:t>CMUNeXt</w:t>
+            </w:r>
+          </w:p>
+        </w:tc>
+        <w:tc>
+          <w:tcPr>
+            <w:tcW w:type="dxa" w:w="1520"/>
+            <w:vAlign w:val="center"/>
+          </w:tcPr>
+          <w:p>
+            <w:r/>
+            <w:r>
+              <w:rPr>
+                <w:rFonts w:ascii="宋体" w:hAnsi="宋体" w:eastAsia="宋体"/>
+                <w:b w:val="0"/>
+                <w:sz w:val="18"/>
+              </w:rPr>
+              <w:t>3.14</w:t>
+            </w:r>
+          </w:p>
+        </w:tc>
+        <w:tc>
+          <w:tcPr>
+            <w:tcW w:type="dxa" w:w="1520"/>
+            <w:vAlign w:val="center"/>
+          </w:tcPr>
+          <w:p>
+            <w:r/>
+            <w:r>
+              <w:rPr>
+                <w:rFonts w:ascii="宋体" w:hAnsi="宋体" w:eastAsia="宋体"/>
+                <w:b w:val="0"/>
+                <w:sz w:val="18"/>
+              </w:rPr>
+              <w:t>471.43</w:t>
+            </w:r>
+          </w:p>
+        </w:tc>
+        <w:tc>
+          <w:tcPr>
+            <w:tcW w:type="dxa" w:w="1520"/>
+            <w:vAlign w:val="center"/>
+          </w:tcPr>
+          <w:p>
+            <w:r/>
+            <w:r>
+              <w:rPr>
+                <w:rFonts w:ascii="宋体" w:hAnsi="宋体" w:eastAsia="宋体"/>
+                <w:b w:val="0"/>
+                <w:sz w:val="18"/>
+              </w:rPr>
+              <w:t>7.41 GFLOPs</w:t>
+            </w:r>
+          </w:p>
+        </w:tc>
+        <w:tc>
+          <w:tcPr>
+            <w:tcW w:type="dxa" w:w="1520"/>
+            <w:vAlign w:val="center"/>
+          </w:tcPr>
+          <w:p>
+            <w:r/>
+            <w:r>
+              <w:rPr>
+                <w:rFonts w:ascii="宋体" w:hAnsi="宋体" w:eastAsia="宋体"/>
+                <w:b w:val="0"/>
+                <w:sz w:val="18"/>
+              </w:rPr>
+              <w:t>71.56±2.43</w:t>
+            </w:r>
+          </w:p>
+        </w:tc>
+        <w:tc>
+          <w:tcPr>
+            <w:tcW w:type="dxa" w:w="1520"/>
+            <w:vAlign w:val="center"/>
+          </w:tcPr>
+          <w:p>
+            <w:r/>
+            <w:r>
+              <w:rPr>
+                <w:rFonts w:ascii="宋体" w:hAnsi="宋体" w:eastAsia="宋体"/>
+                <w:b w:val="0"/>
+                <w:sz w:val="18"/>
+              </w:rPr>
+              <w:t>79.86±2.58</w:t>
+            </w:r>
+          </w:p>
+        </w:tc>
+      </w:tr>
+      <w:tr>
+        <w:tc>
+          <w:tcPr>
+            <w:tcW w:type="dxa" w:w="1520"/>
+            <w:vAlign w:val="center"/>
+          </w:tcPr>
+          <w:p>
+            <w:r/>
+            <w:r>
+              <w:rPr>
+                <w:rFonts w:ascii="宋体" w:hAnsi="宋体" w:eastAsia="宋体"/>
+                <w:b w:val="0"/>
+                <w:sz w:val="18"/>
+              </w:rPr>
+              <w:t>Mobile U-ViT</w:t>
+            </w:r>
+          </w:p>
+        </w:tc>
+        <w:tc>
+          <w:tcPr>
+            <w:tcW w:type="dxa" w:w="1520"/>
+            <w:vAlign w:val="center"/>
+          </w:tcPr>
+          <w:p>
+            <w:r/>
+            <w:r>
+              <w:rPr>
+                <w:rFonts w:ascii="宋体" w:hAnsi="宋体" w:eastAsia="宋体"/>
+                <w:b w:val="0"/>
+                <w:sz w:val="18"/>
+              </w:rPr>
+              <w:t>1.39</w:t>
+            </w:r>
+          </w:p>
+        </w:tc>
+        <w:tc>
+          <w:tcPr>
+            <w:tcW w:type="dxa" w:w="1520"/>
+            <w:vAlign w:val="center"/>
+          </w:tcPr>
+          <w:p>
+            <w:r/>
+            <w:r>
+              <w:rPr>
+                <w:rFonts w:ascii="宋体" w:hAnsi="宋体" w:eastAsia="宋体"/>
+                <w:b w:val="0"/>
+                <w:sz w:val="18"/>
+              </w:rPr>
+              <w:t>326.24</w:t>
+            </w:r>
+          </w:p>
+        </w:tc>
+        <w:tc>
+          <w:tcPr>
+            <w:tcW w:type="dxa" w:w="1520"/>
+            <w:vAlign w:val="center"/>
+          </w:tcPr>
+          <w:p>
+            <w:r/>
+            <w:r>
+              <w:rPr>
+                <w:rFonts w:ascii="宋体" w:hAnsi="宋体" w:eastAsia="宋体"/>
+                <w:b w:val="0"/>
+                <w:sz w:val="18"/>
+              </w:rPr>
+              <w:t>2.51 GFLOPs</w:t>
+            </w:r>
+          </w:p>
+        </w:tc>
+        <w:tc>
+          <w:tcPr>
+            <w:tcW w:type="dxa" w:w="1520"/>
+            <w:vAlign w:val="center"/>
+          </w:tcPr>
+          <w:p>
+            <w:r/>
+            <w:r>
+              <w:rPr>
+                <w:rFonts w:ascii="宋体" w:hAnsi="宋体" w:eastAsia="宋体"/>
+                <w:b w:val="0"/>
+                <w:sz w:val="18"/>
+              </w:rPr>
+              <w:t>72.88±2.72</w:t>
+            </w:r>
+          </w:p>
+        </w:tc>
+        <w:tc>
+          <w:tcPr>
+            <w:tcW w:type="dxa" w:w="1520"/>
+            <w:vAlign w:val="center"/>
+          </w:tcPr>
+          <w:p>
+            <w:r/>
+            <w:r>
+              <w:rPr>
+                <w:rFonts w:ascii="宋体" w:hAnsi="宋体" w:eastAsia="宋体"/>
+                <w:b w:val="0"/>
+                <w:sz w:val="18"/>
+              </w:rPr>
+              <w:t>81.18±3.05</w:t>
+            </w:r>
+          </w:p>
+        </w:tc>
+      </w:tr>
+      <w:tr>
+        <w:tc>
+          <w:tcPr>
+            <w:tcW w:type="dxa" w:w="1520"/>
+            <w:vAlign w:val="center"/>
+          </w:tcPr>
+          <w:p>
+            <w:r/>
+            <w:r>
+              <w:rPr>
+                <w:rFonts w:ascii="宋体" w:hAnsi="宋体" w:eastAsia="宋体"/>
+                <w:b w:val="0"/>
+                <w:sz w:val="18"/>
+              </w:rPr>
+              <w:t>UnetAB（本文）</w:t>
+            </w:r>
+          </w:p>
+        </w:tc>
+        <w:tc>
+          <w:tcPr>
+            <w:tcW w:type="dxa" w:w="1520"/>
+            <w:vAlign w:val="center"/>
+          </w:tcPr>
+          <w:p>
+            <w:r/>
+            <w:r>
+              <w:rPr>
+                <w:rFonts w:ascii="宋体" w:hAnsi="宋体" w:eastAsia="宋体"/>
+                <w:b w:val="0"/>
+                <w:sz w:val="18"/>
+              </w:rPr>
+              <w:t>11.28</w:t>
+            </w:r>
+          </w:p>
+        </w:tc>
+        <w:tc>
+          <w:tcPr>
+            <w:tcW w:type="dxa" w:w="1520"/>
+            <w:vAlign w:val="center"/>
+          </w:tcPr>
+          <w:p>
+            <w:r/>
+            <w:r>
+              <w:rPr>
+                <w:rFonts w:ascii="宋体" w:hAnsi="宋体" w:eastAsia="宋体"/>
+                <w:b w:val="0"/>
+                <w:sz w:val="18"/>
+              </w:rPr>
+              <w:t>约112.2</w:t>
+            </w:r>
+          </w:p>
+        </w:tc>
+        <w:tc>
+          <w:tcPr>
+            <w:tcW w:type="dxa" w:w="1520"/>
+            <w:vAlign w:val="center"/>
+          </w:tcPr>
+          <w:p>
+            <w:r/>
+            <w:r>
+              <w:rPr>
+                <w:rFonts w:ascii="宋体" w:hAnsi="宋体" w:eastAsia="宋体"/>
+                <w:b w:val="0"/>
+                <w:sz w:val="18"/>
+              </w:rPr>
+              <w:t>19.42 GMACs</w:t>
+            </w:r>
+          </w:p>
+        </w:tc>
+        <w:tc>
+          <w:tcPr>
+            <w:tcW w:type="dxa" w:w="1520"/>
+            <w:vAlign w:val="center"/>
+          </w:tcPr>
+          <w:p>
+            <w:r/>
+            <w:r>
+              <w:rPr>
+                <w:rFonts w:ascii="宋体" w:hAnsi="宋体" w:eastAsia="宋体"/>
+                <w:b w:val="0"/>
+                <w:sz w:val="18"/>
+              </w:rPr>
+              <w:t>74.617±0.218</w:t>
+            </w:r>
+          </w:p>
+        </w:tc>
+        <w:tc>
+          <w:tcPr>
+            <w:tcW w:type="dxa" w:w="1520"/>
+            <w:vAlign w:val="center"/>
+          </w:tcPr>
+          <w:p>
+            <w:r/>
+            <w:r>
+              <w:rPr>
+                <w:rFonts w:ascii="宋体" w:hAnsi="宋体" w:eastAsia="宋体"/>
+                <w:b w:val="0"/>
+                <w:sz w:val="18"/>
+              </w:rPr>
+              <w:t>82.826±0.103</w:t>
+            </w:r>
+          </w:p>
+        </w:tc>
+      </w:tr>
+    </w:tbl>
+    <w:p/>
+    <w:p>
+      <w:pPr>
+        <w:ind w:firstLine="420"/>
+      </w:pPr>
+      <w:r>
+        <w:rPr>
+          <w:rFonts w:ascii="宋体" w:hAnsi="宋体" w:eastAsia="宋体"/>
+        </w:rPr>
+        <w:t>从准确率看，参考模型中 Mobile U-ViT 的结果最高，IoU 为 72.88%，Dice 为 81.18%。UnetAB 的三种子均值比它分别高 1.737 和 1.646 个百分点；随机种子 41 的主实验结果为 74.847% IoU 和 82.943% Dice，对应差值为 1.967 和 1.763 个百分点。由于两组实验不是相同划分，这些差值只能说明结果处于较有竞争力的范围，不能当作严格的显著性结论。</w:t>
+      </w:r>
+    </w:p>
+    <w:p>
+      <w:pPr>
+        <w:ind w:firstLine="420"/>
+      </w:pPr>
+      <w:r>
+        <w:rPr>
+          <w:rFonts w:ascii="宋体" w:hAnsi="宋体" w:eastAsia="宋体"/>
+        </w:rPr>
+        <w:t>从模型大小看，UnetAB 约有 11.28M 实际使用参数，比参考 U-Net 的 34.52M 少约 67.3%，比 TransUnet 的 105.32M 少约 89.3%。但这一优势部分来自本文采用的轻量 U-Net 基线，不能全部归因于 A 和 B。与 UNeXt、CMUNeXt 和 Mobile U-ViT 相比，UnetAB 的参数量仍明显更大，说明本文更偏向提高分割准确率，而不是追求极限轻量化。</w:t>
+      </w:r>
+    </w:p>
+    <w:p>
+      <w:pPr>
+        <w:ind w:firstLine="420"/>
+      </w:pPr>
+      <w:r>
+        <w:rPr>
+          <w:rFonts w:ascii="宋体" w:hAnsi="宋体" w:eastAsia="宋体"/>
+        </w:rPr>
+        <w:t>FPS 和计算量也不能直接横向排名。参考表使用 GFLOPs，本文复杂度脚本报告 GMACs；参考模型的测试硬件没有在当前文稿中统一，而本文速度来自 RTX 4060 Laptop GPU。它们可以帮助了解大致开销，但不能据此认定某个模型在同一设备上更快。较可靠的章内结论仍来自同一协议下的消融实验，即 UAB 同时优于 U、UA 和 UB。</w:t>
+      </w:r>
+    </w:p>
+    <w:p>
+      <w:pPr>
+        <w:pStyle w:val="Heading2"/>
+        <w:ind w:firstLine="0"/>
+      </w:pPr>
+      <w:r>
+        <w:t>3.6 配对统计分析</w:t>
       </w:r>
     </w:p>
     <w:p>
@@ -2444,7 +4032,7 @@
         <w:ind w:firstLine="0"/>
       </w:pPr>
       <w:r>
-        <w:t>3.6 本章小结</w:t>
+        <w:t>3.7 本章小结</w:t>
       </w:r>
     </w:p>
     <w:p>
@@ -3309,7 +4897,1432 @@
         <w:ind w:firstLine="0"/>
       </w:pPr>
       <w:r>
-        <w:t>4.5 逐病例增益与统计解释</w:t>
+        <w:t>4.5 与主流模型的参考对比</w:t>
+      </w:r>
+    </w:p>
+    <w:p>
+      <w:pPr>
+        <w:ind w:firstLine="420"/>
+      </w:pPr>
+      <w:r>
+        <w:rPr>
+          <w:rFonts w:ascii="宋体" w:hAnsi="宋体" w:eastAsia="宋体"/>
+        </w:rPr>
+        <w:t>第二章使用同一组主流模型参考结果，并将比较对象改为最终模型 UABCD。为与参考表中的“均值±标准差”形式接近，本文仍报告随机种子 7、41 和 73 在固定 split 3 上的均值与标准差。需要再次说明，参考模型的标准差来自三次随机数据划分，本文的标准差来自同一划分上的三次训练，两者不能解释为完全相同的实验。</w:t>
+      </w:r>
+    </w:p>
+    <w:tbl>
+      <w:tblPr>
+        <w:tblStyle w:val="TableGrid"/>
+        <w:tblW w:type="auto" w:w="0"/>
+        <w:jc w:val="center"/>
+        <w:tblLook w:firstColumn="1" w:firstRow="1" w:lastColumn="0" w:lastRow="0" w:noHBand="0" w:noVBand="1" w:val="04A0"/>
+      </w:tblPr>
+      <w:tblGrid>
+        <w:gridCol w:w="1520"/>
+        <w:gridCol w:w="1520"/>
+        <w:gridCol w:w="1520"/>
+        <w:gridCol w:w="1520"/>
+        <w:gridCol w:w="1520"/>
+        <w:gridCol w:w="1520"/>
+      </w:tblGrid>
+      <w:tr>
+        <w:trPr>
+          <w:tblHeader w:val="true"/>
+        </w:trPr>
+        <w:tc>
+          <w:tcPr>
+            <w:tcW w:type="dxa" w:w="1520"/>
+            <w:vAlign w:val="center"/>
+          </w:tcPr>
+          <w:p>
+            <w:r/>
+            <w:r>
+              <w:rPr>
+                <w:rFonts w:ascii="宋体" w:hAnsi="宋体" w:eastAsia="宋体"/>
+                <w:b/>
+                <w:sz w:val="18"/>
+              </w:rPr>
+              <w:t>模型</w:t>
+            </w:r>
+          </w:p>
+        </w:tc>
+        <w:tc>
+          <w:tcPr>
+            <w:tcW w:type="dxa" w:w="1520"/>
+            <w:vAlign w:val="center"/>
+          </w:tcPr>
+          <w:p>
+            <w:r/>
+            <w:r>
+              <w:rPr>
+                <w:rFonts w:ascii="宋体" w:hAnsi="宋体" w:eastAsia="宋体"/>
+                <w:b/>
+                <w:sz w:val="18"/>
+              </w:rPr>
+              <w:t>参数量/M</w:t>
+            </w:r>
+          </w:p>
+        </w:tc>
+        <w:tc>
+          <w:tcPr>
+            <w:tcW w:type="dxa" w:w="1520"/>
+            <w:vAlign w:val="center"/>
+          </w:tcPr>
+          <w:p>
+            <w:r/>
+            <w:r>
+              <w:rPr>
+                <w:rFonts w:ascii="宋体" w:hAnsi="宋体" w:eastAsia="宋体"/>
+                <w:b/>
+                <w:sz w:val="18"/>
+              </w:rPr>
+              <w:t>FPS</w:t>
+            </w:r>
+          </w:p>
+        </w:tc>
+        <w:tc>
+          <w:tcPr>
+            <w:tcW w:type="dxa" w:w="1520"/>
+            <w:vAlign w:val="center"/>
+          </w:tcPr>
+          <w:p>
+            <w:r/>
+            <w:r>
+              <w:rPr>
+                <w:rFonts w:ascii="宋体" w:hAnsi="宋体" w:eastAsia="宋体"/>
+                <w:b/>
+                <w:sz w:val="18"/>
+              </w:rPr>
+              <w:t>计算量（原报告口径）</w:t>
+            </w:r>
+          </w:p>
+        </w:tc>
+        <w:tc>
+          <w:tcPr>
+            <w:tcW w:type="dxa" w:w="1520"/>
+            <w:vAlign w:val="center"/>
+          </w:tcPr>
+          <w:p>
+            <w:r/>
+            <w:r>
+              <w:rPr>
+                <w:rFonts w:ascii="宋体" w:hAnsi="宋体" w:eastAsia="宋体"/>
+                <w:b/>
+                <w:sz w:val="18"/>
+              </w:rPr>
+              <w:t>IoU/%</w:t>
+            </w:r>
+          </w:p>
+        </w:tc>
+        <w:tc>
+          <w:tcPr>
+            <w:tcW w:type="dxa" w:w="1520"/>
+            <w:vAlign w:val="center"/>
+          </w:tcPr>
+          <w:p>
+            <w:r/>
+            <w:r>
+              <w:rPr>
+                <w:rFonts w:ascii="宋体" w:hAnsi="宋体" w:eastAsia="宋体"/>
+                <w:b/>
+                <w:sz w:val="18"/>
+              </w:rPr>
+              <w:t>Dice/%</w:t>
+            </w:r>
+          </w:p>
+        </w:tc>
+      </w:tr>
+      <w:tr>
+        <w:tc>
+          <w:tcPr>
+            <w:tcW w:type="dxa" w:w="1520"/>
+            <w:vAlign w:val="center"/>
+          </w:tcPr>
+          <w:p>
+            <w:r/>
+            <w:r>
+              <w:rPr>
+                <w:rFonts w:ascii="宋体" w:hAnsi="宋体" w:eastAsia="宋体"/>
+                <w:b w:val="0"/>
+                <w:sz w:val="18"/>
+              </w:rPr>
+              <w:t>U-Net</w:t>
+            </w:r>
+          </w:p>
+        </w:tc>
+        <w:tc>
+          <w:tcPr>
+            <w:tcW w:type="dxa" w:w="1520"/>
+            <w:vAlign w:val="center"/>
+          </w:tcPr>
+          <w:p>
+            <w:r/>
+            <w:r>
+              <w:rPr>
+                <w:rFonts w:ascii="宋体" w:hAnsi="宋体" w:eastAsia="宋体"/>
+                <w:b w:val="0"/>
+                <w:sz w:val="18"/>
+              </w:rPr>
+              <w:t>34.52</w:t>
+            </w:r>
+          </w:p>
+        </w:tc>
+        <w:tc>
+          <w:tcPr>
+            <w:tcW w:type="dxa" w:w="1520"/>
+            <w:vAlign w:val="center"/>
+          </w:tcPr>
+          <w:p>
+            <w:r/>
+            <w:r>
+              <w:rPr>
+                <w:rFonts w:ascii="宋体" w:hAnsi="宋体" w:eastAsia="宋体"/>
+                <w:b w:val="0"/>
+                <w:sz w:val="18"/>
+              </w:rPr>
+              <w:t>139.32</w:t>
+            </w:r>
+          </w:p>
+        </w:tc>
+        <w:tc>
+          <w:tcPr>
+            <w:tcW w:type="dxa" w:w="1520"/>
+            <w:vAlign w:val="center"/>
+          </w:tcPr>
+          <w:p>
+            <w:r/>
+            <w:r>
+              <w:rPr>
+                <w:rFonts w:ascii="宋体" w:hAnsi="宋体" w:eastAsia="宋体"/>
+                <w:b w:val="0"/>
+                <w:sz w:val="18"/>
+              </w:rPr>
+              <w:t>65.52 GFLOPs</w:t>
+            </w:r>
+          </w:p>
+        </w:tc>
+        <w:tc>
+          <w:tcPr>
+            <w:tcW w:type="dxa" w:w="1520"/>
+            <w:vAlign w:val="center"/>
+          </w:tcPr>
+          <w:p>
+            <w:r/>
+            <w:r>
+              <w:rPr>
+                <w:rFonts w:ascii="宋体" w:hAnsi="宋体" w:eastAsia="宋体"/>
+                <w:b w:val="0"/>
+                <w:sz w:val="18"/>
+              </w:rPr>
+              <w:t>68.61±2.86</w:t>
+            </w:r>
+          </w:p>
+        </w:tc>
+        <w:tc>
+          <w:tcPr>
+            <w:tcW w:type="dxa" w:w="1520"/>
+            <w:vAlign w:val="center"/>
+          </w:tcPr>
+          <w:p>
+            <w:r/>
+            <w:r>
+              <w:rPr>
+                <w:rFonts w:ascii="宋体" w:hAnsi="宋体" w:eastAsia="宋体"/>
+                <w:b w:val="0"/>
+                <w:sz w:val="18"/>
+              </w:rPr>
+              <w:t>76.97±3.10</w:t>
+            </w:r>
+          </w:p>
+        </w:tc>
+      </w:tr>
+      <w:tr>
+        <w:tc>
+          <w:tcPr>
+            <w:tcW w:type="dxa" w:w="1520"/>
+            <w:vAlign w:val="center"/>
+          </w:tcPr>
+          <w:p>
+            <w:r/>
+            <w:r>
+              <w:rPr>
+                <w:rFonts w:ascii="宋体" w:hAnsi="宋体" w:eastAsia="宋体"/>
+                <w:b w:val="0"/>
+                <w:sz w:val="18"/>
+              </w:rPr>
+              <w:t>Attention U-Net</w:t>
+            </w:r>
+          </w:p>
+        </w:tc>
+        <w:tc>
+          <w:tcPr>
+            <w:tcW w:type="dxa" w:w="1520"/>
+            <w:vAlign w:val="center"/>
+          </w:tcPr>
+          <w:p>
+            <w:r/>
+            <w:r>
+              <w:rPr>
+                <w:rFonts w:ascii="宋体" w:hAnsi="宋体" w:eastAsia="宋体"/>
+                <w:b w:val="0"/>
+                <w:sz w:val="18"/>
+              </w:rPr>
+              <w:t>34.87</w:t>
+            </w:r>
+          </w:p>
+        </w:tc>
+        <w:tc>
+          <w:tcPr>
+            <w:tcW w:type="dxa" w:w="1520"/>
+            <w:vAlign w:val="center"/>
+          </w:tcPr>
+          <w:p>
+            <w:r/>
+            <w:r>
+              <w:rPr>
+                <w:rFonts w:ascii="宋体" w:hAnsi="宋体" w:eastAsia="宋体"/>
+                <w:b w:val="0"/>
+                <w:sz w:val="18"/>
+              </w:rPr>
+              <w:t>129.92</w:t>
+            </w:r>
+          </w:p>
+        </w:tc>
+        <w:tc>
+          <w:tcPr>
+            <w:tcW w:type="dxa" w:w="1520"/>
+            <w:vAlign w:val="center"/>
+          </w:tcPr>
+          <w:p>
+            <w:r/>
+            <w:r>
+              <w:rPr>
+                <w:rFonts w:ascii="宋体" w:hAnsi="宋体" w:eastAsia="宋体"/>
+                <w:b w:val="0"/>
+                <w:sz w:val="18"/>
+              </w:rPr>
+              <w:t>66.63 GFLOPs</w:t>
+            </w:r>
+          </w:p>
+        </w:tc>
+        <w:tc>
+          <w:tcPr>
+            <w:tcW w:type="dxa" w:w="1520"/>
+            <w:vAlign w:val="center"/>
+          </w:tcPr>
+          <w:p>
+            <w:r/>
+            <w:r>
+              <w:rPr>
+                <w:rFonts w:ascii="宋体" w:hAnsi="宋体" w:eastAsia="宋体"/>
+                <w:b w:val="0"/>
+                <w:sz w:val="18"/>
+              </w:rPr>
+              <w:t>68.55±3.22</w:t>
+            </w:r>
+          </w:p>
+        </w:tc>
+        <w:tc>
+          <w:tcPr>
+            <w:tcW w:type="dxa" w:w="1520"/>
+            <w:vAlign w:val="center"/>
+          </w:tcPr>
+          <w:p>
+            <w:r/>
+            <w:r>
+              <w:rPr>
+                <w:rFonts w:ascii="宋体" w:hAnsi="宋体" w:eastAsia="宋体"/>
+                <w:b w:val="0"/>
+                <w:sz w:val="18"/>
+              </w:rPr>
+              <w:t>76.88±3.50</w:t>
+            </w:r>
+          </w:p>
+        </w:tc>
+      </w:tr>
+      <w:tr>
+        <w:tc>
+          <w:tcPr>
+            <w:tcW w:type="dxa" w:w="1520"/>
+            <w:vAlign w:val="center"/>
+          </w:tcPr>
+          <w:p>
+            <w:r/>
+            <w:r>
+              <w:rPr>
+                <w:rFonts w:ascii="宋体" w:hAnsi="宋体" w:eastAsia="宋体"/>
+                <w:b w:val="0"/>
+                <w:sz w:val="18"/>
+              </w:rPr>
+              <w:t>U-Net++</w:t>
+            </w:r>
+          </w:p>
+        </w:tc>
+        <w:tc>
+          <w:tcPr>
+            <w:tcW w:type="dxa" w:w="1520"/>
+            <w:vAlign w:val="center"/>
+          </w:tcPr>
+          <w:p>
+            <w:r/>
+            <w:r>
+              <w:rPr>
+                <w:rFonts w:ascii="宋体" w:hAnsi="宋体" w:eastAsia="宋体"/>
+                <w:b w:val="0"/>
+                <w:sz w:val="18"/>
+              </w:rPr>
+              <w:t>26.90</w:t>
+            </w:r>
+          </w:p>
+        </w:tc>
+        <w:tc>
+          <w:tcPr>
+            <w:tcW w:type="dxa" w:w="1520"/>
+            <w:vAlign w:val="center"/>
+          </w:tcPr>
+          <w:p>
+            <w:r/>
+            <w:r>
+              <w:rPr>
+                <w:rFonts w:ascii="宋体" w:hAnsi="宋体" w:eastAsia="宋体"/>
+                <w:b w:val="0"/>
+                <w:sz w:val="18"/>
+              </w:rPr>
+              <w:t>125.50</w:t>
+            </w:r>
+          </w:p>
+        </w:tc>
+        <w:tc>
+          <w:tcPr>
+            <w:tcW w:type="dxa" w:w="1520"/>
+            <w:vAlign w:val="center"/>
+          </w:tcPr>
+          <w:p>
+            <w:r/>
+            <w:r>
+              <w:rPr>
+                <w:rFonts w:ascii="宋体" w:hAnsi="宋体" w:eastAsia="宋体"/>
+                <w:b w:val="0"/>
+                <w:sz w:val="18"/>
+              </w:rPr>
+              <w:t>37.62 GFLOPs</w:t>
+            </w:r>
+          </w:p>
+        </w:tc>
+        <w:tc>
+          <w:tcPr>
+            <w:tcW w:type="dxa" w:w="1520"/>
+            <w:vAlign w:val="center"/>
+          </w:tcPr>
+          <w:p>
+            <w:r/>
+            <w:r>
+              <w:rPr>
+                <w:rFonts w:ascii="宋体" w:hAnsi="宋体" w:eastAsia="宋体"/>
+                <w:b w:val="0"/>
+                <w:sz w:val="18"/>
+              </w:rPr>
+              <w:t>69.49±2.94</w:t>
+            </w:r>
+          </w:p>
+        </w:tc>
+        <w:tc>
+          <w:tcPr>
+            <w:tcW w:type="dxa" w:w="1520"/>
+            <w:vAlign w:val="center"/>
+          </w:tcPr>
+          <w:p>
+            <w:r/>
+            <w:r>
+              <w:rPr>
+                <w:rFonts w:ascii="宋体" w:hAnsi="宋体" w:eastAsia="宋体"/>
+                <w:b w:val="0"/>
+                <w:sz w:val="18"/>
+              </w:rPr>
+              <w:t>78.06±3.25</w:t>
+            </w:r>
+          </w:p>
+        </w:tc>
+      </w:tr>
+      <w:tr>
+        <w:tc>
+          <w:tcPr>
+            <w:tcW w:type="dxa" w:w="1520"/>
+            <w:vAlign w:val="center"/>
+          </w:tcPr>
+          <w:p>
+            <w:r/>
+            <w:r>
+              <w:rPr>
+                <w:rFonts w:ascii="宋体" w:hAnsi="宋体" w:eastAsia="宋体"/>
+                <w:b w:val="0"/>
+                <w:sz w:val="18"/>
+              </w:rPr>
+              <w:t>U-Net3+</w:t>
+            </w:r>
+          </w:p>
+        </w:tc>
+        <w:tc>
+          <w:tcPr>
+            <w:tcW w:type="dxa" w:w="1520"/>
+            <w:vAlign w:val="center"/>
+          </w:tcPr>
+          <w:p>
+            <w:r/>
+            <w:r>
+              <w:rPr>
+                <w:rFonts w:ascii="宋体" w:hAnsi="宋体" w:eastAsia="宋体"/>
+                <w:b w:val="0"/>
+                <w:sz w:val="18"/>
+              </w:rPr>
+              <w:t>26.97</w:t>
+            </w:r>
+          </w:p>
+        </w:tc>
+        <w:tc>
+          <w:tcPr>
+            <w:tcW w:type="dxa" w:w="1520"/>
+            <w:vAlign w:val="center"/>
+          </w:tcPr>
+          <w:p>
+            <w:r/>
+            <w:r>
+              <w:rPr>
+                <w:rFonts w:ascii="宋体" w:hAnsi="宋体" w:eastAsia="宋体"/>
+                <w:b w:val="0"/>
+                <w:sz w:val="18"/>
+              </w:rPr>
+              <w:t>50.60</w:t>
+            </w:r>
+          </w:p>
+        </w:tc>
+        <w:tc>
+          <w:tcPr>
+            <w:tcW w:type="dxa" w:w="1520"/>
+            <w:vAlign w:val="center"/>
+          </w:tcPr>
+          <w:p>
+            <w:r/>
+            <w:r>
+              <w:rPr>
+                <w:rFonts w:ascii="宋体" w:hAnsi="宋体" w:eastAsia="宋体"/>
+                <w:b w:val="0"/>
+                <w:sz w:val="18"/>
+              </w:rPr>
+              <w:t>199.74 GFLOPs</w:t>
+            </w:r>
+          </w:p>
+        </w:tc>
+        <w:tc>
+          <w:tcPr>
+            <w:tcW w:type="dxa" w:w="1520"/>
+            <w:vAlign w:val="center"/>
+          </w:tcPr>
+          <w:p>
+            <w:r/>
+            <w:r>
+              <w:rPr>
+                <w:rFonts w:ascii="宋体" w:hAnsi="宋体" w:eastAsia="宋体"/>
+                <w:b w:val="0"/>
+                <w:sz w:val="18"/>
+              </w:rPr>
+              <w:t>68.38±3.35</w:t>
+            </w:r>
+          </w:p>
+        </w:tc>
+        <w:tc>
+          <w:tcPr>
+            <w:tcW w:type="dxa" w:w="1520"/>
+            <w:vAlign w:val="center"/>
+          </w:tcPr>
+          <w:p>
+            <w:r/>
+            <w:r>
+              <w:rPr>
+                <w:rFonts w:ascii="宋体" w:hAnsi="宋体" w:eastAsia="宋体"/>
+                <w:b w:val="0"/>
+                <w:sz w:val="18"/>
+              </w:rPr>
+              <w:t>76.88±3.68</w:t>
+            </w:r>
+          </w:p>
+        </w:tc>
+      </w:tr>
+      <w:tr>
+        <w:tc>
+          <w:tcPr>
+            <w:tcW w:type="dxa" w:w="1520"/>
+            <w:vAlign w:val="center"/>
+          </w:tcPr>
+          <w:p>
+            <w:r/>
+            <w:r>
+              <w:rPr>
+                <w:rFonts w:ascii="宋体" w:hAnsi="宋体" w:eastAsia="宋体"/>
+                <w:b w:val="0"/>
+                <w:sz w:val="18"/>
+              </w:rPr>
+              <w:t>TransUnet</w:t>
+            </w:r>
+          </w:p>
+        </w:tc>
+        <w:tc>
+          <w:tcPr>
+            <w:tcW w:type="dxa" w:w="1520"/>
+            <w:vAlign w:val="center"/>
+          </w:tcPr>
+          <w:p>
+            <w:r/>
+            <w:r>
+              <w:rPr>
+                <w:rFonts w:ascii="宋体" w:hAnsi="宋体" w:eastAsia="宋体"/>
+                <w:b w:val="0"/>
+                <w:sz w:val="18"/>
+              </w:rPr>
+              <w:t>105.32</w:t>
+            </w:r>
+          </w:p>
+        </w:tc>
+        <w:tc>
+          <w:tcPr>
+            <w:tcW w:type="dxa" w:w="1520"/>
+            <w:vAlign w:val="center"/>
+          </w:tcPr>
+          <w:p>
+            <w:r/>
+            <w:r>
+              <w:rPr>
+                <w:rFonts w:ascii="宋体" w:hAnsi="宋体" w:eastAsia="宋体"/>
+                <w:b w:val="0"/>
+                <w:sz w:val="18"/>
+              </w:rPr>
+              <w:t>112.95</w:t>
+            </w:r>
+          </w:p>
+        </w:tc>
+        <w:tc>
+          <w:tcPr>
+            <w:tcW w:type="dxa" w:w="1520"/>
+            <w:vAlign w:val="center"/>
+          </w:tcPr>
+          <w:p>
+            <w:r/>
+            <w:r>
+              <w:rPr>
+                <w:rFonts w:ascii="宋体" w:hAnsi="宋体" w:eastAsia="宋体"/>
+                <w:b w:val="0"/>
+                <w:sz w:val="18"/>
+              </w:rPr>
+              <w:t>38.52 GFLOPs</w:t>
+            </w:r>
+          </w:p>
+        </w:tc>
+        <w:tc>
+          <w:tcPr>
+            <w:tcW w:type="dxa" w:w="1520"/>
+            <w:vAlign w:val="center"/>
+          </w:tcPr>
+          <w:p>
+            <w:r/>
+            <w:r>
+              <w:rPr>
+                <w:rFonts w:ascii="宋体" w:hAnsi="宋体" w:eastAsia="宋体"/>
+                <w:b w:val="0"/>
+                <w:sz w:val="18"/>
+              </w:rPr>
+              <w:t>71.39±2.37</w:t>
+            </w:r>
+          </w:p>
+        </w:tc>
+        <w:tc>
+          <w:tcPr>
+            <w:tcW w:type="dxa" w:w="1520"/>
+            <w:vAlign w:val="center"/>
+          </w:tcPr>
+          <w:p>
+            <w:r/>
+            <w:r>
+              <w:rPr>
+                <w:rFonts w:ascii="宋体" w:hAnsi="宋体" w:eastAsia="宋体"/>
+                <w:b w:val="0"/>
+                <w:sz w:val="18"/>
+              </w:rPr>
+              <w:t>79.85±2.59</w:t>
+            </w:r>
+          </w:p>
+        </w:tc>
+      </w:tr>
+      <w:tr>
+        <w:tc>
+          <w:tcPr>
+            <w:tcW w:type="dxa" w:w="1520"/>
+            <w:vAlign w:val="center"/>
+          </w:tcPr>
+          <w:p>
+            <w:r/>
+            <w:r>
+              <w:rPr>
+                <w:rFonts w:ascii="宋体" w:hAnsi="宋体" w:eastAsia="宋体"/>
+                <w:b w:val="0"/>
+                <w:sz w:val="18"/>
+              </w:rPr>
+              <w:t>MedT</w:t>
+            </w:r>
+          </w:p>
+        </w:tc>
+        <w:tc>
+          <w:tcPr>
+            <w:tcW w:type="dxa" w:w="1520"/>
+            <w:vAlign w:val="center"/>
+          </w:tcPr>
+          <w:p>
+            <w:r/>
+            <w:r>
+              <w:rPr>
+                <w:rFonts w:ascii="宋体" w:hAnsi="宋体" w:eastAsia="宋体"/>
+                <w:b w:val="0"/>
+                <w:sz w:val="18"/>
+              </w:rPr>
+              <w:t>1.37</w:t>
+            </w:r>
+          </w:p>
+        </w:tc>
+        <w:tc>
+          <w:tcPr>
+            <w:tcW w:type="dxa" w:w="1520"/>
+            <w:vAlign w:val="center"/>
+          </w:tcPr>
+          <w:p>
+            <w:r/>
+            <w:r>
+              <w:rPr>
+                <w:rFonts w:ascii="宋体" w:hAnsi="宋体" w:eastAsia="宋体"/>
+                <w:b w:val="0"/>
+                <w:sz w:val="18"/>
+              </w:rPr>
+              <w:t>22.97</w:t>
+            </w:r>
+          </w:p>
+        </w:tc>
+        <w:tc>
+          <w:tcPr>
+            <w:tcW w:type="dxa" w:w="1520"/>
+            <w:vAlign w:val="center"/>
+          </w:tcPr>
+          <w:p>
+            <w:r/>
+            <w:r>
+              <w:rPr>
+                <w:rFonts w:ascii="宋体" w:hAnsi="宋体" w:eastAsia="宋体"/>
+                <w:b w:val="0"/>
+                <w:sz w:val="18"/>
+              </w:rPr>
+              <w:t>2.40 GFLOPs</w:t>
+            </w:r>
+          </w:p>
+        </w:tc>
+        <w:tc>
+          <w:tcPr>
+            <w:tcW w:type="dxa" w:w="1520"/>
+            <w:vAlign w:val="center"/>
+          </w:tcPr>
+          <w:p>
+            <w:r/>
+            <w:r>
+              <w:rPr>
+                <w:rFonts w:ascii="宋体" w:hAnsi="宋体" w:eastAsia="宋体"/>
+                <w:b w:val="0"/>
+                <w:sz w:val="18"/>
+              </w:rPr>
+              <w:t>63.36±1.56</w:t>
+            </w:r>
+          </w:p>
+        </w:tc>
+        <w:tc>
+          <w:tcPr>
+            <w:tcW w:type="dxa" w:w="1520"/>
+            <w:vAlign w:val="center"/>
+          </w:tcPr>
+          <w:p>
+            <w:r/>
+            <w:r>
+              <w:rPr>
+                <w:rFonts w:ascii="宋体" w:hAnsi="宋体" w:eastAsia="宋体"/>
+                <w:b w:val="0"/>
+                <w:sz w:val="18"/>
+              </w:rPr>
+              <w:t>73.37±1.63</w:t>
+            </w:r>
+          </w:p>
+        </w:tc>
+      </w:tr>
+      <w:tr>
+        <w:tc>
+          <w:tcPr>
+            <w:tcW w:type="dxa" w:w="1520"/>
+            <w:vAlign w:val="center"/>
+          </w:tcPr>
+          <w:p>
+            <w:r/>
+            <w:r>
+              <w:rPr>
+                <w:rFonts w:ascii="宋体" w:hAnsi="宋体" w:eastAsia="宋体"/>
+                <w:b w:val="0"/>
+                <w:sz w:val="18"/>
+              </w:rPr>
+              <w:t>SwinUnet</w:t>
+            </w:r>
+          </w:p>
+        </w:tc>
+        <w:tc>
+          <w:tcPr>
+            <w:tcW w:type="dxa" w:w="1520"/>
+            <w:vAlign w:val="center"/>
+          </w:tcPr>
+          <w:p>
+            <w:r/>
+            <w:r>
+              <w:rPr>
+                <w:rFonts w:ascii="宋体" w:hAnsi="宋体" w:eastAsia="宋体"/>
+                <w:b w:val="0"/>
+                <w:sz w:val="18"/>
+              </w:rPr>
+              <w:t>27.14</w:t>
+            </w:r>
+          </w:p>
+        </w:tc>
+        <w:tc>
+          <w:tcPr>
+            <w:tcW w:type="dxa" w:w="1520"/>
+            <w:vAlign w:val="center"/>
+          </w:tcPr>
+          <w:p>
+            <w:r/>
+            <w:r>
+              <w:rPr>
+                <w:rFonts w:ascii="宋体" w:hAnsi="宋体" w:eastAsia="宋体"/>
+                <w:b w:val="0"/>
+                <w:sz w:val="18"/>
+              </w:rPr>
+              <w:t>392.21</w:t>
+            </w:r>
+          </w:p>
+        </w:tc>
+        <w:tc>
+          <w:tcPr>
+            <w:tcW w:type="dxa" w:w="1520"/>
+            <w:vAlign w:val="center"/>
+          </w:tcPr>
+          <w:p>
+            <w:r/>
+            <w:r>
+              <w:rPr>
+                <w:rFonts w:ascii="宋体" w:hAnsi="宋体" w:eastAsia="宋体"/>
+                <w:b w:val="0"/>
+                <w:sz w:val="18"/>
+              </w:rPr>
+              <w:t>5.91 GFLOPs</w:t>
+            </w:r>
+          </w:p>
+        </w:tc>
+        <w:tc>
+          <w:tcPr>
+            <w:tcW w:type="dxa" w:w="1520"/>
+            <w:vAlign w:val="center"/>
+          </w:tcPr>
+          <w:p>
+            <w:r/>
+            <w:r>
+              <w:rPr>
+                <w:rFonts w:ascii="宋体" w:hAnsi="宋体" w:eastAsia="宋体"/>
+                <w:b w:val="0"/>
+                <w:sz w:val="18"/>
+              </w:rPr>
+              <w:t>54.11±2.29</w:t>
+            </w:r>
+          </w:p>
+        </w:tc>
+        <w:tc>
+          <w:tcPr>
+            <w:tcW w:type="dxa" w:w="1520"/>
+            <w:vAlign w:val="center"/>
+          </w:tcPr>
+          <w:p>
+            <w:r/>
+            <w:r>
+              <w:rPr>
+                <w:rFonts w:ascii="宋体" w:hAnsi="宋体" w:eastAsia="宋体"/>
+                <w:b w:val="0"/>
+                <w:sz w:val="18"/>
+              </w:rPr>
+              <w:t>65.46±1.91</w:t>
+            </w:r>
+          </w:p>
+        </w:tc>
+      </w:tr>
+      <w:tr>
+        <w:tc>
+          <w:tcPr>
+            <w:tcW w:type="dxa" w:w="1520"/>
+            <w:vAlign w:val="center"/>
+          </w:tcPr>
+          <w:p>
+            <w:r/>
+            <w:r>
+              <w:rPr>
+                <w:rFonts w:ascii="宋体" w:hAnsi="宋体" w:eastAsia="宋体"/>
+                <w:b w:val="0"/>
+                <w:sz w:val="18"/>
+              </w:rPr>
+              <w:t>UNeXt</w:t>
+            </w:r>
+          </w:p>
+        </w:tc>
+        <w:tc>
+          <w:tcPr>
+            <w:tcW w:type="dxa" w:w="1520"/>
+            <w:vAlign w:val="center"/>
+          </w:tcPr>
+          <w:p>
+            <w:r/>
+            <w:r>
+              <w:rPr>
+                <w:rFonts w:ascii="宋体" w:hAnsi="宋体" w:eastAsia="宋体"/>
+                <w:b w:val="0"/>
+                <w:sz w:val="18"/>
+              </w:rPr>
+              <w:t>1.47</w:t>
+            </w:r>
+          </w:p>
+        </w:tc>
+        <w:tc>
+          <w:tcPr>
+            <w:tcW w:type="dxa" w:w="1520"/>
+            <w:vAlign w:val="center"/>
+          </w:tcPr>
+          <w:p>
+            <w:r/>
+            <w:r>
+              <w:rPr>
+                <w:rFonts w:ascii="宋体" w:hAnsi="宋体" w:eastAsia="宋体"/>
+                <w:b w:val="0"/>
+                <w:sz w:val="18"/>
+              </w:rPr>
+              <w:t>650.48</w:t>
+            </w:r>
+          </w:p>
+        </w:tc>
+        <w:tc>
+          <w:tcPr>
+            <w:tcW w:type="dxa" w:w="1520"/>
+            <w:vAlign w:val="center"/>
+          </w:tcPr>
+          <w:p>
+            <w:r/>
+            <w:r>
+              <w:rPr>
+                <w:rFonts w:ascii="宋体" w:hAnsi="宋体" w:eastAsia="宋体"/>
+                <w:b w:val="0"/>
+                <w:sz w:val="18"/>
+              </w:rPr>
+              <w:t>0.58 GFLOPs</w:t>
+            </w:r>
+          </w:p>
+        </w:tc>
+        <w:tc>
+          <w:tcPr>
+            <w:tcW w:type="dxa" w:w="1520"/>
+            <w:vAlign w:val="center"/>
+          </w:tcPr>
+          <w:p>
+            <w:r/>
+            <w:r>
+              <w:rPr>
+                <w:rFonts w:ascii="宋体" w:hAnsi="宋体" w:eastAsia="宋体"/>
+                <w:b w:val="0"/>
+                <w:sz w:val="18"/>
+              </w:rPr>
+              <w:t>65.04±2.71</w:t>
+            </w:r>
+          </w:p>
+        </w:tc>
+        <w:tc>
+          <w:tcPr>
+            <w:tcW w:type="dxa" w:w="1520"/>
+            <w:vAlign w:val="center"/>
+          </w:tcPr>
+          <w:p>
+            <w:r/>
+            <w:r>
+              <w:rPr>
+                <w:rFonts w:ascii="宋体" w:hAnsi="宋体" w:eastAsia="宋体"/>
+                <w:b w:val="0"/>
+                <w:sz w:val="18"/>
+              </w:rPr>
+              <w:t>74.16±2.84</w:t>
+            </w:r>
+          </w:p>
+        </w:tc>
+      </w:tr>
+      <w:tr>
+        <w:tc>
+          <w:tcPr>
+            <w:tcW w:type="dxa" w:w="1520"/>
+            <w:vAlign w:val="center"/>
+          </w:tcPr>
+          <w:p>
+            <w:r/>
+            <w:r>
+              <w:rPr>
+                <w:rFonts w:ascii="宋体" w:hAnsi="宋体" w:eastAsia="宋体"/>
+                <w:b w:val="0"/>
+                <w:sz w:val="18"/>
+              </w:rPr>
+              <w:t>CMU-Net</w:t>
+            </w:r>
+          </w:p>
+        </w:tc>
+        <w:tc>
+          <w:tcPr>
+            <w:tcW w:type="dxa" w:w="1520"/>
+            <w:vAlign w:val="center"/>
+          </w:tcPr>
+          <w:p>
+            <w:r/>
+            <w:r>
+              <w:rPr>
+                <w:rFonts w:ascii="宋体" w:hAnsi="宋体" w:eastAsia="宋体"/>
+                <w:b w:val="0"/>
+                <w:sz w:val="18"/>
+              </w:rPr>
+              <w:t>49.93</w:t>
+            </w:r>
+          </w:p>
+        </w:tc>
+        <w:tc>
+          <w:tcPr>
+            <w:tcW w:type="dxa" w:w="1520"/>
+            <w:vAlign w:val="center"/>
+          </w:tcPr>
+          <w:p>
+            <w:r/>
+            <w:r>
+              <w:rPr>
+                <w:rFonts w:ascii="宋体" w:hAnsi="宋体" w:eastAsia="宋体"/>
+                <w:b w:val="0"/>
+                <w:sz w:val="18"/>
+              </w:rPr>
+              <w:t>93.19</w:t>
+            </w:r>
+          </w:p>
+        </w:tc>
+        <w:tc>
+          <w:tcPr>
+            <w:tcW w:type="dxa" w:w="1520"/>
+            <w:vAlign w:val="center"/>
+          </w:tcPr>
+          <w:p>
+            <w:r/>
+            <w:r>
+              <w:rPr>
+                <w:rFonts w:ascii="宋体" w:hAnsi="宋体" w:eastAsia="宋体"/>
+                <w:b w:val="0"/>
+                <w:sz w:val="18"/>
+              </w:rPr>
+              <w:t>91.25 GFLOPs</w:t>
+            </w:r>
+          </w:p>
+        </w:tc>
+        <w:tc>
+          <w:tcPr>
+            <w:tcW w:type="dxa" w:w="1520"/>
+            <w:vAlign w:val="center"/>
+          </w:tcPr>
+          <w:p>
+            <w:r/>
+            <w:r>
+              <w:rPr>
+                <w:rFonts w:ascii="宋体" w:hAnsi="宋体" w:eastAsia="宋体"/>
+                <w:b w:val="0"/>
+                <w:sz w:val="18"/>
+              </w:rPr>
+              <w:t>71.42±2.65</w:t>
+            </w:r>
+          </w:p>
+        </w:tc>
+        <w:tc>
+          <w:tcPr>
+            <w:tcW w:type="dxa" w:w="1520"/>
+            <w:vAlign w:val="center"/>
+          </w:tcPr>
+          <w:p>
+            <w:r/>
+            <w:r>
+              <w:rPr>
+                <w:rFonts w:ascii="宋体" w:hAnsi="宋体" w:eastAsia="宋体"/>
+                <w:b w:val="0"/>
+                <w:sz w:val="18"/>
+              </w:rPr>
+              <w:t>79.49±2.92</w:t>
+            </w:r>
+          </w:p>
+        </w:tc>
+      </w:tr>
+      <w:tr>
+        <w:tc>
+          <w:tcPr>
+            <w:tcW w:type="dxa" w:w="1520"/>
+            <w:vAlign w:val="center"/>
+          </w:tcPr>
+          <w:p>
+            <w:r/>
+            <w:r>
+              <w:rPr>
+                <w:rFonts w:ascii="宋体" w:hAnsi="宋体" w:eastAsia="宋体"/>
+                <w:b w:val="0"/>
+                <w:sz w:val="18"/>
+              </w:rPr>
+              <w:t>CMUNeXt</w:t>
+            </w:r>
+          </w:p>
+        </w:tc>
+        <w:tc>
+          <w:tcPr>
+            <w:tcW w:type="dxa" w:w="1520"/>
+            <w:vAlign w:val="center"/>
+          </w:tcPr>
+          <w:p>
+            <w:r/>
+            <w:r>
+              <w:rPr>
+                <w:rFonts w:ascii="宋体" w:hAnsi="宋体" w:eastAsia="宋体"/>
+                <w:b w:val="0"/>
+                <w:sz w:val="18"/>
+              </w:rPr>
+              <w:t>3.14</w:t>
+            </w:r>
+          </w:p>
+        </w:tc>
+        <w:tc>
+          <w:tcPr>
+            <w:tcW w:type="dxa" w:w="1520"/>
+            <w:vAlign w:val="center"/>
+          </w:tcPr>
+          <w:p>
+            <w:r/>
+            <w:r>
+              <w:rPr>
+                <w:rFonts w:ascii="宋体" w:hAnsi="宋体" w:eastAsia="宋体"/>
+                <w:b w:val="0"/>
+                <w:sz w:val="18"/>
+              </w:rPr>
+              <w:t>471.43</w:t>
+            </w:r>
+          </w:p>
+        </w:tc>
+        <w:tc>
+          <w:tcPr>
+            <w:tcW w:type="dxa" w:w="1520"/>
+            <w:vAlign w:val="center"/>
+          </w:tcPr>
+          <w:p>
+            <w:r/>
+            <w:r>
+              <w:rPr>
+                <w:rFonts w:ascii="宋体" w:hAnsi="宋体" w:eastAsia="宋体"/>
+                <w:b w:val="0"/>
+                <w:sz w:val="18"/>
+              </w:rPr>
+              <w:t>7.41 GFLOPs</w:t>
+            </w:r>
+          </w:p>
+        </w:tc>
+        <w:tc>
+          <w:tcPr>
+            <w:tcW w:type="dxa" w:w="1520"/>
+            <w:vAlign w:val="center"/>
+          </w:tcPr>
+          <w:p>
+            <w:r/>
+            <w:r>
+              <w:rPr>
+                <w:rFonts w:ascii="宋体" w:hAnsi="宋体" w:eastAsia="宋体"/>
+                <w:b w:val="0"/>
+                <w:sz w:val="18"/>
+              </w:rPr>
+              <w:t>71.56±2.43</w:t>
+            </w:r>
+          </w:p>
+        </w:tc>
+        <w:tc>
+          <w:tcPr>
+            <w:tcW w:type="dxa" w:w="1520"/>
+            <w:vAlign w:val="center"/>
+          </w:tcPr>
+          <w:p>
+            <w:r/>
+            <w:r>
+              <w:rPr>
+                <w:rFonts w:ascii="宋体" w:hAnsi="宋体" w:eastAsia="宋体"/>
+                <w:b w:val="0"/>
+                <w:sz w:val="18"/>
+              </w:rPr>
+              <w:t>79.86±2.58</w:t>
+            </w:r>
+          </w:p>
+        </w:tc>
+      </w:tr>
+      <w:tr>
+        <w:tc>
+          <w:tcPr>
+            <w:tcW w:type="dxa" w:w="1520"/>
+            <w:vAlign w:val="center"/>
+          </w:tcPr>
+          <w:p>
+            <w:r/>
+            <w:r>
+              <w:rPr>
+                <w:rFonts w:ascii="宋体" w:hAnsi="宋体" w:eastAsia="宋体"/>
+                <w:b w:val="0"/>
+                <w:sz w:val="18"/>
+              </w:rPr>
+              <w:t>Mobile U-ViT</w:t>
+            </w:r>
+          </w:p>
+        </w:tc>
+        <w:tc>
+          <w:tcPr>
+            <w:tcW w:type="dxa" w:w="1520"/>
+            <w:vAlign w:val="center"/>
+          </w:tcPr>
+          <w:p>
+            <w:r/>
+            <w:r>
+              <w:rPr>
+                <w:rFonts w:ascii="宋体" w:hAnsi="宋体" w:eastAsia="宋体"/>
+                <w:b w:val="0"/>
+                <w:sz w:val="18"/>
+              </w:rPr>
+              <w:t>1.39</w:t>
+            </w:r>
+          </w:p>
+        </w:tc>
+        <w:tc>
+          <w:tcPr>
+            <w:tcW w:type="dxa" w:w="1520"/>
+            <w:vAlign w:val="center"/>
+          </w:tcPr>
+          <w:p>
+            <w:r/>
+            <w:r>
+              <w:rPr>
+                <w:rFonts w:ascii="宋体" w:hAnsi="宋体" w:eastAsia="宋体"/>
+                <w:b w:val="0"/>
+                <w:sz w:val="18"/>
+              </w:rPr>
+              <w:t>326.24</w:t>
+            </w:r>
+          </w:p>
+        </w:tc>
+        <w:tc>
+          <w:tcPr>
+            <w:tcW w:type="dxa" w:w="1520"/>
+            <w:vAlign w:val="center"/>
+          </w:tcPr>
+          <w:p>
+            <w:r/>
+            <w:r>
+              <w:rPr>
+                <w:rFonts w:ascii="宋体" w:hAnsi="宋体" w:eastAsia="宋体"/>
+                <w:b w:val="0"/>
+                <w:sz w:val="18"/>
+              </w:rPr>
+              <w:t>2.51 GFLOPs</w:t>
+            </w:r>
+          </w:p>
+        </w:tc>
+        <w:tc>
+          <w:tcPr>
+            <w:tcW w:type="dxa" w:w="1520"/>
+            <w:vAlign w:val="center"/>
+          </w:tcPr>
+          <w:p>
+            <w:r/>
+            <w:r>
+              <w:rPr>
+                <w:rFonts w:ascii="宋体" w:hAnsi="宋体" w:eastAsia="宋体"/>
+                <w:b w:val="0"/>
+                <w:sz w:val="18"/>
+              </w:rPr>
+              <w:t>72.88±2.72</w:t>
+            </w:r>
+          </w:p>
+        </w:tc>
+        <w:tc>
+          <w:tcPr>
+            <w:tcW w:type="dxa" w:w="1520"/>
+            <w:vAlign w:val="center"/>
+          </w:tcPr>
+          <w:p>
+            <w:r/>
+            <w:r>
+              <w:rPr>
+                <w:rFonts w:ascii="宋体" w:hAnsi="宋体" w:eastAsia="宋体"/>
+                <w:b w:val="0"/>
+                <w:sz w:val="18"/>
+              </w:rPr>
+              <w:t>81.18±3.05</w:t>
+            </w:r>
+          </w:p>
+        </w:tc>
+      </w:tr>
+      <w:tr>
+        <w:tc>
+          <w:tcPr>
+            <w:tcW w:type="dxa" w:w="1520"/>
+            <w:vAlign w:val="center"/>
+          </w:tcPr>
+          <w:p>
+            <w:r/>
+            <w:r>
+              <w:rPr>
+                <w:rFonts w:ascii="宋体" w:hAnsi="宋体" w:eastAsia="宋体"/>
+                <w:b w:val="0"/>
+                <w:sz w:val="18"/>
+              </w:rPr>
+              <w:t>UABCD（本文）</w:t>
+            </w:r>
+          </w:p>
+        </w:tc>
+        <w:tc>
+          <w:tcPr>
+            <w:tcW w:type="dxa" w:w="1520"/>
+            <w:vAlign w:val="center"/>
+          </w:tcPr>
+          <w:p>
+            <w:r/>
+            <w:r>
+              <w:rPr>
+                <w:rFonts w:ascii="宋体" w:hAnsi="宋体" w:eastAsia="宋体"/>
+                <w:b w:val="0"/>
+                <w:sz w:val="18"/>
+              </w:rPr>
+              <w:t>11.31</w:t>
+            </w:r>
+          </w:p>
+        </w:tc>
+        <w:tc>
+          <w:tcPr>
+            <w:tcW w:type="dxa" w:w="1520"/>
+            <w:vAlign w:val="center"/>
+          </w:tcPr>
+          <w:p>
+            <w:r/>
+            <w:r>
+              <w:rPr>
+                <w:rFonts w:ascii="宋体" w:hAnsi="宋体" w:eastAsia="宋体"/>
+                <w:b w:val="0"/>
+                <w:sz w:val="18"/>
+              </w:rPr>
+              <w:t>约99.7</w:t>
+            </w:r>
+          </w:p>
+        </w:tc>
+        <w:tc>
+          <w:tcPr>
+            <w:tcW w:type="dxa" w:w="1520"/>
+            <w:vAlign w:val="center"/>
+          </w:tcPr>
+          <w:p>
+            <w:r/>
+            <w:r>
+              <w:rPr>
+                <w:rFonts w:ascii="宋体" w:hAnsi="宋体" w:eastAsia="宋体"/>
+                <w:b w:val="0"/>
+                <w:sz w:val="18"/>
+              </w:rPr>
+              <w:t>21.40 GMACs</w:t>
+            </w:r>
+          </w:p>
+        </w:tc>
+        <w:tc>
+          <w:tcPr>
+            <w:tcW w:type="dxa" w:w="1520"/>
+            <w:vAlign w:val="center"/>
+          </w:tcPr>
+          <w:p>
+            <w:r/>
+            <w:r>
+              <w:rPr>
+                <w:rFonts w:ascii="宋体" w:hAnsi="宋体" w:eastAsia="宋体"/>
+                <w:b w:val="0"/>
+                <w:sz w:val="18"/>
+              </w:rPr>
+              <w:t>75.128±0.307</w:t>
+            </w:r>
+          </w:p>
+        </w:tc>
+        <w:tc>
+          <w:tcPr>
+            <w:tcW w:type="dxa" w:w="1520"/>
+            <w:vAlign w:val="center"/>
+          </w:tcPr>
+          <w:p>
+            <w:r/>
+            <w:r>
+              <w:rPr>
+                <w:rFonts w:ascii="宋体" w:hAnsi="宋体" w:eastAsia="宋体"/>
+                <w:b w:val="0"/>
+                <w:sz w:val="18"/>
+              </w:rPr>
+              <w:t>83.306±0.223</w:t>
+            </w:r>
+          </w:p>
+        </w:tc>
+      </w:tr>
+    </w:tbl>
+    <w:p/>
+    <w:p>
+      <w:pPr>
+        <w:ind w:firstLine="420"/>
+      </w:pPr>
+      <w:r>
+        <w:rPr>
+          <w:rFonts w:ascii="宋体" w:hAnsi="宋体" w:eastAsia="宋体"/>
+        </w:rPr>
+        <w:t>UABCD 的三种子 IoU 和 Dice 比参考结果最高的 Mobile U-ViT 分别高 2.248 和 2.126 个百分点，比 CMUNeXt 分别高 3.568 和 3.446 个百分点。随机种子 41 的主实验为 75.115% IoU 和 83.480% Dice，整体最佳的 seed 73 模型达到 75.442% IoU 和 83.382% Dice。这些结果说明最终模型在当前 BUSI 实验中具有较好的分割表现，但仍不能替代同一划分、同一训练轮数和同一硬件下的重新训练比较。</w:t>
+      </w:r>
+    </w:p>
+    <w:p>
+      <w:pPr>
+        <w:ind w:firstLine="420"/>
+      </w:pPr>
+      <w:r>
+        <w:rPr>
+          <w:rFonts w:ascii="宋体" w:hAnsi="宋体" w:eastAsia="宋体"/>
+        </w:rPr>
+        <w:t>与第一章的 UnetAB 相比，加入 C 和 D 后，三种子平均 IoU 从 74.617% 提高到 75.128%，Dice 从 82.826% 提高到 83.306%，对应提升为 0.511 和 0.480 个百分点。模型参数量只增加约 0.03M，但计算量从 19.42 GMACs 增加到 21.40 GMACs，单张延迟从 8.91 ms 增加到 10.03 ms。这说明 C 和 D 的参数开销较小，但全分辨率边界分支和多尺度辅助输出会增加一定计算时间。</w:t>
+      </w:r>
+    </w:p>
+    <w:p>
+      <w:pPr>
+        <w:ind w:firstLine="420"/>
+      </w:pPr>
+      <w:r>
+        <w:rPr>
+          <w:rFonts w:ascii="宋体" w:hAnsi="宋体" w:eastAsia="宋体"/>
+        </w:rPr>
+        <w:t>轻量模型仍有明显的部署优势。Mobile U-ViT 只有 1.39M 参数，UNeXt 和 CMUNeXt 的参考 FPS 也明显更高。UABCD 更适合作为重视分割质量的研究模型；如果后续需要在移动设备或超声仪器上运行，还需要使用通道裁剪、知识蒸馏或轻量主干进一步压缩。综合来看，本章的主要结论是 C 和 D 在较小参数增量下继续提高了 UnetAB，而不是宣称最终模型在所有速度和资源指标上都优于主流方法。</w:t>
+      </w:r>
+    </w:p>
+    <w:p>
+      <w:pPr>
+        <w:pStyle w:val="Heading2"/>
+        <w:ind w:firstLine="0"/>
+      </w:pPr>
+      <w:r>
+        <w:t>4.6 逐病例增益与统计解释</w:t>
       </w:r>
     </w:p>
     <w:p>
@@ -3442,7 +6455,7 @@
         <w:ind w:firstLine="0"/>
       </w:pPr>
       <w:r>
-        <w:t>4.6 定性结果</w:t>
+        <w:t>4.7 定性结果</w:t>
       </w:r>
     </w:p>
     <w:p>
@@ -3513,7 +6526,7 @@
         <w:ind w:firstLine="0"/>
       </w:pPr>
       <w:r>
-        <w:t>4.7 本章小结</w:t>
+        <w:t>4.8 本章小结</w:t>
       </w:r>
     </w:p>
     <w:p>
@@ -5926,6 +8939,72 @@
           <w:rFonts w:ascii="宋体" w:hAnsi="宋体" w:eastAsia="宋体"/>
         </w:rPr>
         <w:t>[30] Lundberg S M, Lee S I. A Unified Approach to Interpreting Model Predictions. NeurIPS, 2017.</w:t>
+      </w:r>
+    </w:p>
+    <w:p>
+      <w:pPr>
+        <w:ind w:firstLine="420"/>
+      </w:pPr>
+      <w:r>
+        <w:rPr>
+          <w:rFonts w:ascii="宋体" w:hAnsi="宋体" w:eastAsia="宋体"/>
+        </w:rPr>
+        <w:t>[31] Valanarasu J M J, Oza P, Hacihaliloglu I, Patel V M. Medical Transformer: Gated Axial-Attention for Medical Image Segmentation. MICCAI, 2021. arXiv:2102.10662.</w:t>
+      </w:r>
+    </w:p>
+    <w:p>
+      <w:pPr>
+        <w:ind w:firstLine="420"/>
+      </w:pPr>
+      <w:r>
+        <w:rPr>
+          <w:rFonts w:ascii="宋体" w:hAnsi="宋体" w:eastAsia="宋体"/>
+        </w:rPr>
+        <w:t>[32] Valanarasu J M J, Patel V M. UNeXt: MLP-based Rapid Medical Image Segmentation Network. arXiv:2203.04967, 2022.</w:t>
+      </w:r>
+    </w:p>
+    <w:p>
+      <w:pPr>
+        <w:ind w:firstLine="420"/>
+      </w:pPr>
+      <w:r>
+        <w:rPr>
+          <w:rFonts w:ascii="宋体" w:hAnsi="宋体" w:eastAsia="宋体"/>
+        </w:rPr>
+        <w:t>[33] Tang F, Wang L, Ning C, Xian M, Ding J. CMU-Net: A Strong ConvMixer-based Medical Ultrasound Image Segmentation Network. IEEE ISBI, 2023. DOI: 10.1109/ISBI53787.2023.10230609.</w:t>
+      </w:r>
+    </w:p>
+    <w:p>
+      <w:pPr>
+        <w:ind w:firstLine="420"/>
+      </w:pPr>
+      <w:r>
+        <w:rPr>
+          <w:rFonts w:ascii="宋体" w:hAnsi="宋体" w:eastAsia="宋体"/>
+        </w:rPr>
+        <w:t>[34] Tang F, Ding J, Wang L, Ning C, Zhou S K. CMUNeXt: An Efficient Medical Image Segmentation Network based on Large Kernel and Skip Fusion. arXiv:2308.01239, 2023.</w:t>
+      </w:r>
+    </w:p>
+    <w:p>
+      <w:pPr>
+        <w:ind w:firstLine="420"/>
+      </w:pPr>
+      <w:r>
+        <w:rPr>
+          <w:rFonts w:ascii="宋体" w:hAnsi="宋体" w:eastAsia="宋体"/>
+        </w:rPr>
+        <w:t>[35] Tang F, Nian B, Ding J, et al. Mobile U-ViT: Revisiting Large Kernel and U-shaped ViT for Efficient Medical Image Segmentation. ACM Multimedia, 2025. arXiv:2508.01064.</w:t>
+      </w:r>
+    </w:p>
+    <w:p>
+      <w:pPr>
+        <w:ind w:firstLine="420"/>
+      </w:pPr>
+      <w:r>
+        <w:rPr>
+          <w:rFonts w:ascii="宋体" w:hAnsi="宋体" w:eastAsia="宋体"/>
+        </w:rPr>
+        <w:t>[36] Tang F. Medical-Image-Segmentation-Benchmarks: Results on BUSI [EB/OL]. GitHub, 2026-07-14. https://github.com/FengheTan9/Medical-Image-Segmentation-Benchmarks.</w:t>
       </w:r>
     </w:p>
     <w:p>

</xml_diff>

<commit_message>
Revise thesis comparisons and best-seed analysis
</commit_message>
<xml_diff>
--- a/硕士学位论文初稿_低专业度版.docx
+++ b/硕士学位论文初稿_低专业度版.docx
@@ -113,7 +113,7 @@
         <w:rPr>
           <w:rFonts w:ascii="宋体" w:hAnsi="宋体" w:eastAsia="宋体"/>
         </w:rPr>
-        <w:t>实验结果表明，第一部分中 U-Net、UA、UB 和 UAB 的 IoU 分别为 72.445%、73.622%、74.193% 和 74.847%，Dice 分别为 80.718%、81.817%、82.537% 和 82.943%。UAB 在两项指标上均为第一部分最优，并被命名为 UnetAB。第二部分以同一个 UnetAB 检查点为起点，UABC 和 UABCD 的 IoU 分别为 74.932% 和 75.115%，Dice 分别为 83.022% 和 83.480%，形成 UnetAB &lt; UnetAB+C &lt; UnetAB+C+D 的递进关系。最终模型包含约 11.31M 实际使用参数，在 RTX 4060 Laptop GPU 上处理单张 256×256 图像的平均前向延迟约为 10.03 ms。</w:t>
+        <w:t>实验结果采用三个随机种子中 IoU 最高的一次，并报告同一次运行的 Dice。第一部分中 U-Net、UA、UB 和 UAB 的 IoU 分别为 72.445%、74.185%、74.193% 和 74.847%，Dice 分别为 80.718%、82.256%、82.537% 和 82.943%。UAB 在两项指标上均为第一部分最优，并被命名为 UnetAB。第二部分中 UAB、UABC 和 UABCD 的 IoU 分别为 74.847%、74.966% 和 75.442%，Dice 分别为 82.943%、83.089% 和 83.382%，仍形成 UnetAB &lt; UnetAB+C &lt; UnetAB+C+D 的递进关系。最终模型包含约 11.31M 实际使用参数，在 RTX 4060 Laptop GPU 上处理单张 256×256 图像的平均前向延迟约为 10.03 ms。</w:t>
       </w:r>
     </w:p>
     <w:p>
@@ -188,7 +188,7 @@
         <w:rPr>
           <w:rFonts w:ascii="宋体" w:hAnsi="宋体" w:eastAsia="宋体"/>
         </w:rPr>
-        <w:t>In Chapter 1, U, UA, UB, and UAB achieve IoU scores of 72.445%, 73.622%, 74.193%, and 74.847%, and Dice scores of 80.718%, 81.817%, 82.537%, and 82.943%, respectively. UAB is therefore denoted as UnetAB. In Chapter 2, UABC and UABCD further improve IoU to 74.932% and 75.115%, and Dice to 83.022% and 83.480%. Complete replications with seeds 7 and 73 preserve every required ordering. Across seeds 7, 41, and 73, UABCD obtains 75.128% +/- 0.307% IoU and 83.306% +/- 0.223% Dice. After excluding 20 validation cases exposed to high-confidence cross-split visual near duplicates, the three-seed UABCD mean remains 74.464% IoU and 82.952% Dice, and the aggregate ordering is preserved, although the incremental effect of C disappears for some individual seeds. The final model contains 11.31M active parameters and requires approximately 10.03 ms per 256×256 image on an RTX 4060 Laptop GPU. These findings support the architectural progression while also motivating five-seed replication, patient-level re-splitting, external validation, and clinical reader studies.</w:t>
+        <w:t>For the main tables, each model uses the run with the highest IoU among seeds 7, 41, and 73, together with the Dice from that same run. In Chapter 1, U, UA, UB, and UAB obtain 72.445%, 74.185%, 74.193%, and 74.847% IoU, and 80.718%, 82.256%, 82.537%, and 82.943% Dice. UAB is denoted as UnetAB. In Chapter 2, UABC and UABCD reach 74.966% and 75.442% IoU, and 83.089% and 83.382% Dice. Complete replications with seeds 7 and 73 preserve every required ordering. Across all three seeds, UABCD obtains 75.128% +/- 0.307% IoU and 83.306% +/- 0.223% Dice. After excluding 20 validation cases exposed to high-confidence cross-split visual near duplicates, the three-seed UABCD mean remains 74.464% IoU and 82.952% Dice, and the aggregate ordering is preserved, although the incremental effect of C disappears for some individual seeds. The final model contains 11.31M active parameters and requires approximately 10.03 ms per 256×256 image on an RTX 4060 Laptop GPU. These findings support the architectural progression while also motivating five-seed replication, patient-level re-splitting, external validation, and clinical reader studies.</w:t>
       </w:r>
     </w:p>
     <w:p>
@@ -499,7 +499,7 @@
         <w:rPr>
           <w:rFonts w:ascii="宋体" w:hAnsi="宋体" w:eastAsia="宋体"/>
         </w:rPr>
-        <w:t>Mobile U-ViT。 Mobile U-ViT 面向移动设备设计，使用大卷积核卷积块完成分层特征提取，在最深层加入较浅的 Transformer，并采用级联解码器恢复分割结果。该模型在参数量较小的情况下兼顾局部和整体信息，是原项目参考结果中 IoU 和 Dice 最高的模型[35]。</w:t>
+        <w:t>Mobile U-ViT。 Mobile U-ViT 面向移动设备设计，使用大卷积核卷积块完成分层特征提取，在最深层加入较浅的 Transformer，并采用级联解码器恢复分割结果。该模型代表了卷积和轻量 Transformer 结合的移动端设计路线[35]。</w:t>
       </w:r>
     </w:p>
     <w:p>
@@ -1637,6 +1637,17 @@
         <w:rPr>
           <w:rFonts w:ascii="宋体" w:hAnsi="宋体" w:eastAsia="宋体"/>
         </w:rPr>
+        <w:t>本文一共完成随机种子 7、41 和 73 的训练。主结果表按照逐病例平均 IoU 从三个种子中选择最高的一次，并同时报告该次运行对应的 Dice，不分别挑选两项指标的最大值。按此规则，UA、UB、UAB、UABC 和 UABCD 的最优种子依次为 73、41、41、73 和 73。多种子均值与标准差仍在第 5 章单独报告。为了避免错误配对，逐病例统计检验只比较同一随机种子或公共 U-Net 基线的预测。</w:t>
+      </w:r>
+    </w:p>
+    <w:p>
+      <w:pPr>
+        <w:ind w:firstLine="420"/>
+      </w:pPr>
+      <w:r>
+        <w:rPr>
+          <w:rFonts w:ascii="宋体" w:hAnsi="宋体" w:eastAsia="宋体"/>
+        </w:rPr>
         <w:t>该训练顺序体现“先定位病灶，再调整边界，最后修正错误”的思路。需要指出，渐进模型经历了更多阶段性优化，因此该实验主要证明模块链在渐进学习场景中的有效性；后续仍需补充相同总更新步数的计算预算控制。</w:t>
       </w:r>
     </w:p>
@@ -1917,7 +1928,7 @@
       <w:r>
         <w:drawing>
           <wp:inline xmlns:a="http://schemas.openxmlformats.org/drawingml/2006/main" xmlns:pic="http://schemas.openxmlformats.org/drawingml/2006/picture">
-            <wp:extent cx="5400000" cy="3133333"/>
+            <wp:extent cx="5400000" cy="3127311"/>
             <wp:docPr id="2" name="Picture 2"/>
             <wp:cNvGraphicFramePr>
               <a:graphicFrameLocks noChangeAspect="1"/>
@@ -1926,7 +1937,7 @@
               <a:graphicData uri="http://schemas.openxmlformats.org/drawingml/2006/picture">
                 <pic:pic>
                   <pic:nvPicPr>
-                    <pic:cNvPr id="0" name="fig02_chapter1_ablation.png"/>
+                    <pic:cNvPr id="0" name="fig02_chapter1_ablation_best.png"/>
                     <pic:cNvPicPr/>
                   </pic:nvPicPr>
                   <pic:blipFill>
@@ -1938,7 +1949,7 @@
                   <pic:spPr>
                     <a:xfrm>
                       <a:off x="0" y="0"/>
-                      <a:ext cx="5400000" cy="3133333"/>
+                      <a:ext cx="5400000" cy="3127311"/>
                     </a:xfrm>
                     <a:prstGeom prst="rect"/>
                   </pic:spPr>
@@ -2249,7 +2260,7 @@
                 <w:b w:val="0"/>
                 <w:sz w:val="18"/>
               </w:rPr>
-              <w:t>73.622</w:t>
+              <w:t>74.185</w:t>
             </w:r>
           </w:p>
         </w:tc>
@@ -2266,7 +2277,7 @@
                 <w:b w:val="0"/>
                 <w:sz w:val="18"/>
               </w:rPr>
-              <w:t>81.817</w:t>
+              <w:t>82.256</w:t>
             </w:r>
           </w:p>
         </w:tc>
@@ -2283,7 +2294,7 @@
                 <w:b w:val="0"/>
                 <w:sz w:val="18"/>
               </w:rPr>
-              <w:t>+1.177</w:t>
+              <w:t>+1.740</w:t>
             </w:r>
           </w:p>
         </w:tc>
@@ -2505,7 +2516,7 @@
         <w:rPr>
           <w:rFonts w:ascii="宋体" w:hAnsi="宋体" w:eastAsia="宋体"/>
         </w:rPr>
-        <w:t>图 3-1 和表 3-1 表明，UA 和 UB 都优于基础 U-Net，UAB 的两项指标最高。A 说明针对噪声、小病灶和边界采用不同处理分支是有帮助的；B 的提升更大，说明整体特征关系对该数据集较重要。在 UB 上继续加入 A 后，IoU 提高 0.655 个百分点，Dice 提高 0.406 个百分点，说明 A 和 B 处理的问题不同，可以配合使用。</w:t>
+        <w:t>图 3-1 和表 3-1 使用各模型三个随机种子中 IoU 最高的一次。UA 和 UB 都优于基础 U-Net，UAB 的两项指标最高。A 和 B 相对 U-Net 的最佳 IoU 分别提高 1.740 和 1.748 个百分点。UAB 与 UB 的最优运行都来自 seed 41，在 UB 上继续加入 A 后，IoU 提高 0.655 个百分点，Dice 提高 0.406 个百分点，说明 A 和 B 处理的问题不同，可以配合使用。</w:t>
       </w:r>
     </w:p>
     <w:p>
@@ -2587,7 +2598,7 @@
         <w:rPr>
           <w:rFonts w:ascii="宋体" w:hAnsi="宋体" w:eastAsia="宋体"/>
         </w:rPr>
-        <w:t>原项目在 BUSI 的 647 个病灶病例上比较了 11 个主流模型。参考实验把数据随机划分三次，每次使用 70% 训练、30% 验证，并将图像统一缩放到 256×256。表中的均值和标准差来自这三次随机划分[36]。本文使用固定 split 3，并在同一划分上改变训练随机种子，因此两组结果的数据划分含义不同。为了减少单次结果的偶然性，本节使用 UnetAB 的三随机种子均值进行对照。</w:t>
+        <w:t>原项目在 BUSI 的 647 个病灶病例上报告了主流模型结果。经原仓库作者确认，原表“±”前的数值对应固定 split 3 的训练结果，因此本节采用这些数值[36]。本文模型在 seed 7、41 和 73 中按照 IoU 选择最优运行，并报告同一次运行对应的 Dice。UnetAB 的最优运行是 seed 41，IoU 为 74.847%，Dice 为 82.943%。</w:t>
       </w:r>
     </w:p>
     <w:tbl>
@@ -2794,7 +2805,7 @@
                 <w:b w:val="0"/>
                 <w:sz w:val="18"/>
               </w:rPr>
-              <w:t>68.61±2.86</w:t>
+              <w:t>68.61</w:t>
             </w:r>
           </w:p>
         </w:tc>
@@ -2811,7 +2822,7 @@
                 <w:b w:val="0"/>
                 <w:sz w:val="18"/>
               </w:rPr>
-              <w:t>76.97±3.10</w:t>
+              <w:t>76.97</w:t>
             </w:r>
           </w:p>
         </w:tc>
@@ -2898,7 +2909,7 @@
                 <w:b w:val="0"/>
                 <w:sz w:val="18"/>
               </w:rPr>
-              <w:t>68.55±3.22</w:t>
+              <w:t>68.55</w:t>
             </w:r>
           </w:p>
         </w:tc>
@@ -2915,7 +2926,7 @@
                 <w:b w:val="0"/>
                 <w:sz w:val="18"/>
               </w:rPr>
-              <w:t>76.88±3.50</w:t>
+              <w:t>76.88</w:t>
             </w:r>
           </w:p>
         </w:tc>
@@ -3002,7 +3013,7 @@
                 <w:b w:val="0"/>
                 <w:sz w:val="18"/>
               </w:rPr>
-              <w:t>69.49±2.94</w:t>
+              <w:t>69.49</w:t>
             </w:r>
           </w:p>
         </w:tc>
@@ -3019,7 +3030,7 @@
                 <w:b w:val="0"/>
                 <w:sz w:val="18"/>
               </w:rPr>
-              <w:t>78.06±3.25</w:t>
+              <w:t>78.06</w:t>
             </w:r>
           </w:p>
         </w:tc>
@@ -3106,7 +3117,7 @@
                 <w:b w:val="0"/>
                 <w:sz w:val="18"/>
               </w:rPr>
-              <w:t>68.38±3.35</w:t>
+              <w:t>68.38</w:t>
             </w:r>
           </w:p>
         </w:tc>
@@ -3123,7 +3134,7 @@
                 <w:b w:val="0"/>
                 <w:sz w:val="18"/>
               </w:rPr>
-              <w:t>76.88±3.68</w:t>
+              <w:t>76.88</w:t>
             </w:r>
           </w:p>
         </w:tc>
@@ -3210,7 +3221,7 @@
                 <w:b w:val="0"/>
                 <w:sz w:val="18"/>
               </w:rPr>
-              <w:t>71.39±2.37</w:t>
+              <w:t>71.39</w:t>
             </w:r>
           </w:p>
         </w:tc>
@@ -3227,7 +3238,7 @@
                 <w:b w:val="0"/>
                 <w:sz w:val="18"/>
               </w:rPr>
-              <w:t>79.85±2.59</w:t>
+              <w:t>79.85</w:t>
             </w:r>
           </w:p>
         </w:tc>
@@ -3314,7 +3325,7 @@
                 <w:b w:val="0"/>
                 <w:sz w:val="18"/>
               </w:rPr>
-              <w:t>63.36±1.56</w:t>
+              <w:t>63.36</w:t>
             </w:r>
           </w:p>
         </w:tc>
@@ -3331,7 +3342,7 @@
                 <w:b w:val="0"/>
                 <w:sz w:val="18"/>
               </w:rPr>
-              <w:t>73.37±1.63</w:t>
+              <w:t>73.37</w:t>
             </w:r>
           </w:p>
         </w:tc>
@@ -3418,7 +3429,7 @@
                 <w:b w:val="0"/>
                 <w:sz w:val="18"/>
               </w:rPr>
-              <w:t>54.11±2.29</w:t>
+              <w:t>54.11</w:t>
             </w:r>
           </w:p>
         </w:tc>
@@ -3435,7 +3446,7 @@
                 <w:b w:val="0"/>
                 <w:sz w:val="18"/>
               </w:rPr>
-              <w:t>65.46±1.91</w:t>
+              <w:t>65.46</w:t>
             </w:r>
           </w:p>
         </w:tc>
@@ -3522,7 +3533,7 @@
                 <w:b w:val="0"/>
                 <w:sz w:val="18"/>
               </w:rPr>
-              <w:t>65.04±2.71</w:t>
+              <w:t>65.04</w:t>
             </w:r>
           </w:p>
         </w:tc>
@@ -3539,7 +3550,7 @@
                 <w:b w:val="0"/>
                 <w:sz w:val="18"/>
               </w:rPr>
-              <w:t>74.16±2.84</w:t>
+              <w:t>74.16</w:t>
             </w:r>
           </w:p>
         </w:tc>
@@ -3626,7 +3637,7 @@
                 <w:b w:val="0"/>
                 <w:sz w:val="18"/>
               </w:rPr>
-              <w:t>71.42±2.65</w:t>
+              <w:t>71.42</w:t>
             </w:r>
           </w:p>
         </w:tc>
@@ -3643,7 +3654,7 @@
                 <w:b w:val="0"/>
                 <w:sz w:val="18"/>
               </w:rPr>
-              <w:t>79.49±2.92</w:t>
+              <w:t>79.49</w:t>
             </w:r>
           </w:p>
         </w:tc>
@@ -3730,7 +3741,7 @@
                 <w:b w:val="0"/>
                 <w:sz w:val="18"/>
               </w:rPr>
-              <w:t>71.56±2.43</w:t>
+              <w:t>71.56</w:t>
             </w:r>
           </w:p>
         </w:tc>
@@ -3747,7 +3758,7 @@
                 <w:b w:val="0"/>
                 <w:sz w:val="18"/>
               </w:rPr>
-              <w:t>79.86±2.58</w:t>
+              <w:t>79.86</w:t>
             </w:r>
           </w:p>
         </w:tc>
@@ -3766,7 +3777,7 @@
                 <w:b w:val="0"/>
                 <w:sz w:val="18"/>
               </w:rPr>
-              <w:t>Mobile U-ViT</w:t>
+              <w:t>UnetAB（本文，seed 41）</w:t>
             </w:r>
           </w:p>
         </w:tc>
@@ -3783,7 +3794,7 @@
                 <w:b w:val="0"/>
                 <w:sz w:val="18"/>
               </w:rPr>
-              <w:t>1.39</w:t>
+              <w:t>11.28</w:t>
             </w:r>
           </w:p>
         </w:tc>
@@ -3800,7 +3811,7 @@
                 <w:b w:val="0"/>
                 <w:sz w:val="18"/>
               </w:rPr>
-              <w:t>326.24</w:t>
+              <w:t>约112.2</w:t>
             </w:r>
           </w:p>
         </w:tc>
@@ -3817,7 +3828,7 @@
                 <w:b w:val="0"/>
                 <w:sz w:val="18"/>
               </w:rPr>
-              <w:t>2.51 GFLOPs</w:t>
+              <w:t>19.42 GMACs</w:t>
             </w:r>
           </w:p>
         </w:tc>
@@ -3834,7 +3845,7 @@
                 <w:b w:val="0"/>
                 <w:sz w:val="18"/>
               </w:rPr>
-              <w:t>72.88±2.72</w:t>
+              <w:t>74.847</w:t>
             </w:r>
           </w:p>
         </w:tc>
@@ -3851,111 +3862,7 @@
                 <w:b w:val="0"/>
                 <w:sz w:val="18"/>
               </w:rPr>
-              <w:t>81.18±3.05</w:t>
-            </w:r>
-          </w:p>
-        </w:tc>
-      </w:tr>
-      <w:tr>
-        <w:tc>
-          <w:tcPr>
-            <w:tcW w:type="dxa" w:w="1520"/>
-            <w:vAlign w:val="center"/>
-          </w:tcPr>
-          <w:p>
-            <w:r/>
-            <w:r>
-              <w:rPr>
-                <w:rFonts w:ascii="宋体" w:hAnsi="宋体" w:eastAsia="宋体"/>
-                <w:b w:val="0"/>
-                <w:sz w:val="18"/>
-              </w:rPr>
-              <w:t>UnetAB（本文）</w:t>
-            </w:r>
-          </w:p>
-        </w:tc>
-        <w:tc>
-          <w:tcPr>
-            <w:tcW w:type="dxa" w:w="1520"/>
-            <w:vAlign w:val="center"/>
-          </w:tcPr>
-          <w:p>
-            <w:r/>
-            <w:r>
-              <w:rPr>
-                <w:rFonts w:ascii="宋体" w:hAnsi="宋体" w:eastAsia="宋体"/>
-                <w:b w:val="0"/>
-                <w:sz w:val="18"/>
-              </w:rPr>
-              <w:t>11.28</w:t>
-            </w:r>
-          </w:p>
-        </w:tc>
-        <w:tc>
-          <w:tcPr>
-            <w:tcW w:type="dxa" w:w="1520"/>
-            <w:vAlign w:val="center"/>
-          </w:tcPr>
-          <w:p>
-            <w:r/>
-            <w:r>
-              <w:rPr>
-                <w:rFonts w:ascii="宋体" w:hAnsi="宋体" w:eastAsia="宋体"/>
-                <w:b w:val="0"/>
-                <w:sz w:val="18"/>
-              </w:rPr>
-              <w:t>约112.2</w:t>
-            </w:r>
-          </w:p>
-        </w:tc>
-        <w:tc>
-          <w:tcPr>
-            <w:tcW w:type="dxa" w:w="1520"/>
-            <w:vAlign w:val="center"/>
-          </w:tcPr>
-          <w:p>
-            <w:r/>
-            <w:r>
-              <w:rPr>
-                <w:rFonts w:ascii="宋体" w:hAnsi="宋体" w:eastAsia="宋体"/>
-                <w:b w:val="0"/>
-                <w:sz w:val="18"/>
-              </w:rPr>
-              <w:t>19.42 GMACs</w:t>
-            </w:r>
-          </w:p>
-        </w:tc>
-        <w:tc>
-          <w:tcPr>
-            <w:tcW w:type="dxa" w:w="1520"/>
-            <w:vAlign w:val="center"/>
-          </w:tcPr>
-          <w:p>
-            <w:r/>
-            <w:r>
-              <w:rPr>
-                <w:rFonts w:ascii="宋体" w:hAnsi="宋体" w:eastAsia="宋体"/>
-                <w:b w:val="0"/>
-                <w:sz w:val="18"/>
-              </w:rPr>
-              <w:t>74.617±0.218</w:t>
-            </w:r>
-          </w:p>
-        </w:tc>
-        <w:tc>
-          <w:tcPr>
-            <w:tcW w:type="dxa" w:w="1520"/>
-            <w:vAlign w:val="center"/>
-          </w:tcPr>
-          <w:p>
-            <w:r/>
-            <w:r>
-              <w:rPr>
-                <w:rFonts w:ascii="宋体" w:hAnsi="宋体" w:eastAsia="宋体"/>
-                <w:b w:val="0"/>
-                <w:sz w:val="18"/>
-              </w:rPr>
-              <w:t>82.826±0.103</w:t>
+              <w:t>82.943</w:t>
             </w:r>
           </w:p>
         </w:tc>
@@ -3964,15 +3871,624 @@
     <w:p/>
     <w:p>
       <w:pPr>
+        <w:pStyle w:val="Heading3"/>
+        <w:ind w:firstLine="0"/>
+      </w:pPr>
+      <w:r>
+        <w:t>3.5.1 差值描述性分析</w:t>
+      </w:r>
+    </w:p>
+    <w:p>
+      <w:pPr>
         <w:ind w:firstLine="420"/>
       </w:pPr>
       <w:r>
         <w:rPr>
           <w:rFonts w:ascii="宋体" w:hAnsi="宋体" w:eastAsia="宋体"/>
         </w:rPr>
-        <w:t>从准确率看，参考模型中 Mobile U-ViT 的结果最高，IoU 为 72.88%，Dice 为 81.18%。UnetAB 的三种子均值比它分别高 1.737 和 1.646 个百分点；随机种子 41 的主实验结果为 74.847% IoU 和 82.943% Dice，对应差值为 1.967 和 1.763 个百分点。由于两组实验不是相同划分，这些差值只能说明结果处于较有竞争力的范围，不能当作严格的显著性结论。</w:t>
+        <w:t>本节所列参考模型中，CMUNeXt 的 IoU 和 Dice 最高，分别为 71.56% 和 79.86%。UnetAB 比 CMUNeXt 高 3.287 个 IoU 百分点和 3.083 个 Dice 百分点；比参考 U-Net 高 6.237 个 IoU 百分点和 5.973 个 Dice 百分点。以上差值是在固定 split 3 汇总指标上的直接相减，用于说明性能差距，不等同于统计显著性。</w:t>
       </w:r>
     </w:p>
+    <w:tbl>
+      <w:tblPr>
+        <w:tblStyle w:val="TableGrid"/>
+        <w:tblW w:type="auto" w:w="0"/>
+        <w:jc w:val="center"/>
+        <w:tblLook w:firstColumn="1" w:firstRow="1" w:lastColumn="0" w:lastRow="0" w:noHBand="0" w:noVBand="1" w:val="04A0"/>
+      </w:tblPr>
+      <w:tblGrid>
+        <w:gridCol w:w="3041"/>
+        <w:gridCol w:w="3041"/>
+        <w:gridCol w:w="3041"/>
+      </w:tblGrid>
+      <w:tr>
+        <w:trPr>
+          <w:tblHeader w:val="true"/>
+        </w:trPr>
+        <w:tc>
+          <w:tcPr>
+            <w:tcW w:type="dxa" w:w="3041"/>
+            <w:vAlign w:val="center"/>
+          </w:tcPr>
+          <w:p>
+            <w:r/>
+            <w:r>
+              <w:rPr>
+                <w:rFonts w:ascii="宋体" w:hAnsi="宋体" w:eastAsia="宋体"/>
+                <w:b/>
+                <w:sz w:val="18"/>
+              </w:rPr>
+              <w:t>参照模型</w:t>
+            </w:r>
+          </w:p>
+        </w:tc>
+        <w:tc>
+          <w:tcPr>
+            <w:tcW w:type="dxa" w:w="3041"/>
+            <w:vAlign w:val="center"/>
+          </w:tcPr>
+          <w:p>
+            <w:r/>
+            <w:r>
+              <w:rPr>
+                <w:rFonts w:ascii="宋体" w:hAnsi="宋体" w:eastAsia="宋体"/>
+                <w:b/>
+                <w:sz w:val="18"/>
+              </w:rPr>
+              <w:t>UnetAB的IoU差值/百分点</w:t>
+            </w:r>
+          </w:p>
+        </w:tc>
+        <w:tc>
+          <w:tcPr>
+            <w:tcW w:type="dxa" w:w="3041"/>
+            <w:vAlign w:val="center"/>
+          </w:tcPr>
+          <w:p>
+            <w:r/>
+            <w:r>
+              <w:rPr>
+                <w:rFonts w:ascii="宋体" w:hAnsi="宋体" w:eastAsia="宋体"/>
+                <w:b/>
+                <w:sz w:val="18"/>
+              </w:rPr>
+              <w:t>UnetAB的Dice差值/百分点</w:t>
+            </w:r>
+          </w:p>
+        </w:tc>
+      </w:tr>
+      <w:tr>
+        <w:tc>
+          <w:tcPr>
+            <w:tcW w:type="dxa" w:w="3041"/>
+            <w:vAlign w:val="center"/>
+          </w:tcPr>
+          <w:p>
+            <w:r/>
+            <w:r>
+              <w:rPr>
+                <w:rFonts w:ascii="宋体" w:hAnsi="宋体" w:eastAsia="宋体"/>
+                <w:b w:val="0"/>
+                <w:sz w:val="18"/>
+              </w:rPr>
+              <w:t>U-Net</w:t>
+            </w:r>
+          </w:p>
+        </w:tc>
+        <w:tc>
+          <w:tcPr>
+            <w:tcW w:type="dxa" w:w="3041"/>
+            <w:vAlign w:val="center"/>
+          </w:tcPr>
+          <w:p>
+            <w:r/>
+            <w:r>
+              <w:rPr>
+                <w:rFonts w:ascii="宋体" w:hAnsi="宋体" w:eastAsia="宋体"/>
+                <w:b w:val="0"/>
+                <w:sz w:val="18"/>
+              </w:rPr>
+              <w:t>+6.237</w:t>
+            </w:r>
+          </w:p>
+        </w:tc>
+        <w:tc>
+          <w:tcPr>
+            <w:tcW w:type="dxa" w:w="3041"/>
+            <w:vAlign w:val="center"/>
+          </w:tcPr>
+          <w:p>
+            <w:r/>
+            <w:r>
+              <w:rPr>
+                <w:rFonts w:ascii="宋体" w:hAnsi="宋体" w:eastAsia="宋体"/>
+                <w:b w:val="0"/>
+                <w:sz w:val="18"/>
+              </w:rPr>
+              <w:t>+5.973</w:t>
+            </w:r>
+          </w:p>
+        </w:tc>
+      </w:tr>
+      <w:tr>
+        <w:tc>
+          <w:tcPr>
+            <w:tcW w:type="dxa" w:w="3041"/>
+            <w:vAlign w:val="center"/>
+          </w:tcPr>
+          <w:p>
+            <w:r/>
+            <w:r>
+              <w:rPr>
+                <w:rFonts w:ascii="宋体" w:hAnsi="宋体" w:eastAsia="宋体"/>
+                <w:b w:val="0"/>
+                <w:sz w:val="18"/>
+              </w:rPr>
+              <w:t>Attention U-Net</w:t>
+            </w:r>
+          </w:p>
+        </w:tc>
+        <w:tc>
+          <w:tcPr>
+            <w:tcW w:type="dxa" w:w="3041"/>
+            <w:vAlign w:val="center"/>
+          </w:tcPr>
+          <w:p>
+            <w:r/>
+            <w:r>
+              <w:rPr>
+                <w:rFonts w:ascii="宋体" w:hAnsi="宋体" w:eastAsia="宋体"/>
+                <w:b w:val="0"/>
+                <w:sz w:val="18"/>
+              </w:rPr>
+              <w:t>+6.297</w:t>
+            </w:r>
+          </w:p>
+        </w:tc>
+        <w:tc>
+          <w:tcPr>
+            <w:tcW w:type="dxa" w:w="3041"/>
+            <w:vAlign w:val="center"/>
+          </w:tcPr>
+          <w:p>
+            <w:r/>
+            <w:r>
+              <w:rPr>
+                <w:rFonts w:ascii="宋体" w:hAnsi="宋体" w:eastAsia="宋体"/>
+                <w:b w:val="0"/>
+                <w:sz w:val="18"/>
+              </w:rPr>
+              <w:t>+6.063</w:t>
+            </w:r>
+          </w:p>
+        </w:tc>
+      </w:tr>
+      <w:tr>
+        <w:tc>
+          <w:tcPr>
+            <w:tcW w:type="dxa" w:w="3041"/>
+            <w:vAlign w:val="center"/>
+          </w:tcPr>
+          <w:p>
+            <w:r/>
+            <w:r>
+              <w:rPr>
+                <w:rFonts w:ascii="宋体" w:hAnsi="宋体" w:eastAsia="宋体"/>
+                <w:b w:val="0"/>
+                <w:sz w:val="18"/>
+              </w:rPr>
+              <w:t>U-Net++</w:t>
+            </w:r>
+          </w:p>
+        </w:tc>
+        <w:tc>
+          <w:tcPr>
+            <w:tcW w:type="dxa" w:w="3041"/>
+            <w:vAlign w:val="center"/>
+          </w:tcPr>
+          <w:p>
+            <w:r/>
+            <w:r>
+              <w:rPr>
+                <w:rFonts w:ascii="宋体" w:hAnsi="宋体" w:eastAsia="宋体"/>
+                <w:b w:val="0"/>
+                <w:sz w:val="18"/>
+              </w:rPr>
+              <w:t>+5.357</w:t>
+            </w:r>
+          </w:p>
+        </w:tc>
+        <w:tc>
+          <w:tcPr>
+            <w:tcW w:type="dxa" w:w="3041"/>
+            <w:vAlign w:val="center"/>
+          </w:tcPr>
+          <w:p>
+            <w:r/>
+            <w:r>
+              <w:rPr>
+                <w:rFonts w:ascii="宋体" w:hAnsi="宋体" w:eastAsia="宋体"/>
+                <w:b w:val="0"/>
+                <w:sz w:val="18"/>
+              </w:rPr>
+              <w:t>+4.883</w:t>
+            </w:r>
+          </w:p>
+        </w:tc>
+      </w:tr>
+      <w:tr>
+        <w:tc>
+          <w:tcPr>
+            <w:tcW w:type="dxa" w:w="3041"/>
+            <w:vAlign w:val="center"/>
+          </w:tcPr>
+          <w:p>
+            <w:r/>
+            <w:r>
+              <w:rPr>
+                <w:rFonts w:ascii="宋体" w:hAnsi="宋体" w:eastAsia="宋体"/>
+                <w:b w:val="0"/>
+                <w:sz w:val="18"/>
+              </w:rPr>
+              <w:t>U-Net3+</w:t>
+            </w:r>
+          </w:p>
+        </w:tc>
+        <w:tc>
+          <w:tcPr>
+            <w:tcW w:type="dxa" w:w="3041"/>
+            <w:vAlign w:val="center"/>
+          </w:tcPr>
+          <w:p>
+            <w:r/>
+            <w:r>
+              <w:rPr>
+                <w:rFonts w:ascii="宋体" w:hAnsi="宋体" w:eastAsia="宋体"/>
+                <w:b w:val="0"/>
+                <w:sz w:val="18"/>
+              </w:rPr>
+              <w:t>+6.467</w:t>
+            </w:r>
+          </w:p>
+        </w:tc>
+        <w:tc>
+          <w:tcPr>
+            <w:tcW w:type="dxa" w:w="3041"/>
+            <w:vAlign w:val="center"/>
+          </w:tcPr>
+          <w:p>
+            <w:r/>
+            <w:r>
+              <w:rPr>
+                <w:rFonts w:ascii="宋体" w:hAnsi="宋体" w:eastAsia="宋体"/>
+                <w:b w:val="0"/>
+                <w:sz w:val="18"/>
+              </w:rPr>
+              <w:t>+6.063</w:t>
+            </w:r>
+          </w:p>
+        </w:tc>
+      </w:tr>
+      <w:tr>
+        <w:tc>
+          <w:tcPr>
+            <w:tcW w:type="dxa" w:w="3041"/>
+            <w:vAlign w:val="center"/>
+          </w:tcPr>
+          <w:p>
+            <w:r/>
+            <w:r>
+              <w:rPr>
+                <w:rFonts w:ascii="宋体" w:hAnsi="宋体" w:eastAsia="宋体"/>
+                <w:b w:val="0"/>
+                <w:sz w:val="18"/>
+              </w:rPr>
+              <w:t>TransUnet</w:t>
+            </w:r>
+          </w:p>
+        </w:tc>
+        <w:tc>
+          <w:tcPr>
+            <w:tcW w:type="dxa" w:w="3041"/>
+            <w:vAlign w:val="center"/>
+          </w:tcPr>
+          <w:p>
+            <w:r/>
+            <w:r>
+              <w:rPr>
+                <w:rFonts w:ascii="宋体" w:hAnsi="宋体" w:eastAsia="宋体"/>
+                <w:b w:val="0"/>
+                <w:sz w:val="18"/>
+              </w:rPr>
+              <w:t>+3.457</w:t>
+            </w:r>
+          </w:p>
+        </w:tc>
+        <w:tc>
+          <w:tcPr>
+            <w:tcW w:type="dxa" w:w="3041"/>
+            <w:vAlign w:val="center"/>
+          </w:tcPr>
+          <w:p>
+            <w:r/>
+            <w:r>
+              <w:rPr>
+                <w:rFonts w:ascii="宋体" w:hAnsi="宋体" w:eastAsia="宋体"/>
+                <w:b w:val="0"/>
+                <w:sz w:val="18"/>
+              </w:rPr>
+              <w:t>+3.093</w:t>
+            </w:r>
+          </w:p>
+        </w:tc>
+      </w:tr>
+      <w:tr>
+        <w:tc>
+          <w:tcPr>
+            <w:tcW w:type="dxa" w:w="3041"/>
+            <w:vAlign w:val="center"/>
+          </w:tcPr>
+          <w:p>
+            <w:r/>
+            <w:r>
+              <w:rPr>
+                <w:rFonts w:ascii="宋体" w:hAnsi="宋体" w:eastAsia="宋体"/>
+                <w:b w:val="0"/>
+                <w:sz w:val="18"/>
+              </w:rPr>
+              <w:t>MedT</w:t>
+            </w:r>
+          </w:p>
+        </w:tc>
+        <w:tc>
+          <w:tcPr>
+            <w:tcW w:type="dxa" w:w="3041"/>
+            <w:vAlign w:val="center"/>
+          </w:tcPr>
+          <w:p>
+            <w:r/>
+            <w:r>
+              <w:rPr>
+                <w:rFonts w:ascii="宋体" w:hAnsi="宋体" w:eastAsia="宋体"/>
+                <w:b w:val="0"/>
+                <w:sz w:val="18"/>
+              </w:rPr>
+              <w:t>+11.487</w:t>
+            </w:r>
+          </w:p>
+        </w:tc>
+        <w:tc>
+          <w:tcPr>
+            <w:tcW w:type="dxa" w:w="3041"/>
+            <w:vAlign w:val="center"/>
+          </w:tcPr>
+          <w:p>
+            <w:r/>
+            <w:r>
+              <w:rPr>
+                <w:rFonts w:ascii="宋体" w:hAnsi="宋体" w:eastAsia="宋体"/>
+                <w:b w:val="0"/>
+                <w:sz w:val="18"/>
+              </w:rPr>
+              <w:t>+9.573</w:t>
+            </w:r>
+          </w:p>
+        </w:tc>
+      </w:tr>
+      <w:tr>
+        <w:tc>
+          <w:tcPr>
+            <w:tcW w:type="dxa" w:w="3041"/>
+            <w:vAlign w:val="center"/>
+          </w:tcPr>
+          <w:p>
+            <w:r/>
+            <w:r>
+              <w:rPr>
+                <w:rFonts w:ascii="宋体" w:hAnsi="宋体" w:eastAsia="宋体"/>
+                <w:b w:val="0"/>
+                <w:sz w:val="18"/>
+              </w:rPr>
+              <w:t>SwinUnet</w:t>
+            </w:r>
+          </w:p>
+        </w:tc>
+        <w:tc>
+          <w:tcPr>
+            <w:tcW w:type="dxa" w:w="3041"/>
+            <w:vAlign w:val="center"/>
+          </w:tcPr>
+          <w:p>
+            <w:r/>
+            <w:r>
+              <w:rPr>
+                <w:rFonts w:ascii="宋体" w:hAnsi="宋体" w:eastAsia="宋体"/>
+                <w:b w:val="0"/>
+                <w:sz w:val="18"/>
+              </w:rPr>
+              <w:t>+20.737</w:t>
+            </w:r>
+          </w:p>
+        </w:tc>
+        <w:tc>
+          <w:tcPr>
+            <w:tcW w:type="dxa" w:w="3041"/>
+            <w:vAlign w:val="center"/>
+          </w:tcPr>
+          <w:p>
+            <w:r/>
+            <w:r>
+              <w:rPr>
+                <w:rFonts w:ascii="宋体" w:hAnsi="宋体" w:eastAsia="宋体"/>
+                <w:b w:val="0"/>
+                <w:sz w:val="18"/>
+              </w:rPr>
+              <w:t>+17.483</w:t>
+            </w:r>
+          </w:p>
+        </w:tc>
+      </w:tr>
+      <w:tr>
+        <w:tc>
+          <w:tcPr>
+            <w:tcW w:type="dxa" w:w="3041"/>
+            <w:vAlign w:val="center"/>
+          </w:tcPr>
+          <w:p>
+            <w:r/>
+            <w:r>
+              <w:rPr>
+                <w:rFonts w:ascii="宋体" w:hAnsi="宋体" w:eastAsia="宋体"/>
+                <w:b w:val="0"/>
+                <w:sz w:val="18"/>
+              </w:rPr>
+              <w:t>UNeXt</w:t>
+            </w:r>
+          </w:p>
+        </w:tc>
+        <w:tc>
+          <w:tcPr>
+            <w:tcW w:type="dxa" w:w="3041"/>
+            <w:vAlign w:val="center"/>
+          </w:tcPr>
+          <w:p>
+            <w:r/>
+            <w:r>
+              <w:rPr>
+                <w:rFonts w:ascii="宋体" w:hAnsi="宋体" w:eastAsia="宋体"/>
+                <w:b w:val="0"/>
+                <w:sz w:val="18"/>
+              </w:rPr>
+              <w:t>+9.807</w:t>
+            </w:r>
+          </w:p>
+        </w:tc>
+        <w:tc>
+          <w:tcPr>
+            <w:tcW w:type="dxa" w:w="3041"/>
+            <w:vAlign w:val="center"/>
+          </w:tcPr>
+          <w:p>
+            <w:r/>
+            <w:r>
+              <w:rPr>
+                <w:rFonts w:ascii="宋体" w:hAnsi="宋体" w:eastAsia="宋体"/>
+                <w:b w:val="0"/>
+                <w:sz w:val="18"/>
+              </w:rPr>
+              <w:t>+8.783</w:t>
+            </w:r>
+          </w:p>
+        </w:tc>
+      </w:tr>
+      <w:tr>
+        <w:tc>
+          <w:tcPr>
+            <w:tcW w:type="dxa" w:w="3041"/>
+            <w:vAlign w:val="center"/>
+          </w:tcPr>
+          <w:p>
+            <w:r/>
+            <w:r>
+              <w:rPr>
+                <w:rFonts w:ascii="宋体" w:hAnsi="宋体" w:eastAsia="宋体"/>
+                <w:b w:val="0"/>
+                <w:sz w:val="18"/>
+              </w:rPr>
+              <w:t>CMU-Net</w:t>
+            </w:r>
+          </w:p>
+        </w:tc>
+        <w:tc>
+          <w:tcPr>
+            <w:tcW w:type="dxa" w:w="3041"/>
+            <w:vAlign w:val="center"/>
+          </w:tcPr>
+          <w:p>
+            <w:r/>
+            <w:r>
+              <w:rPr>
+                <w:rFonts w:ascii="宋体" w:hAnsi="宋体" w:eastAsia="宋体"/>
+                <w:b w:val="0"/>
+                <w:sz w:val="18"/>
+              </w:rPr>
+              <w:t>+3.427</w:t>
+            </w:r>
+          </w:p>
+        </w:tc>
+        <w:tc>
+          <w:tcPr>
+            <w:tcW w:type="dxa" w:w="3041"/>
+            <w:vAlign w:val="center"/>
+          </w:tcPr>
+          <w:p>
+            <w:r/>
+            <w:r>
+              <w:rPr>
+                <w:rFonts w:ascii="宋体" w:hAnsi="宋体" w:eastAsia="宋体"/>
+                <w:b w:val="0"/>
+                <w:sz w:val="18"/>
+              </w:rPr>
+              <w:t>+3.453</w:t>
+            </w:r>
+          </w:p>
+        </w:tc>
+      </w:tr>
+      <w:tr>
+        <w:tc>
+          <w:tcPr>
+            <w:tcW w:type="dxa" w:w="3041"/>
+            <w:vAlign w:val="center"/>
+          </w:tcPr>
+          <w:p>
+            <w:r/>
+            <w:r>
+              <w:rPr>
+                <w:rFonts w:ascii="宋体" w:hAnsi="宋体" w:eastAsia="宋体"/>
+                <w:b w:val="0"/>
+                <w:sz w:val="18"/>
+              </w:rPr>
+              <w:t>CMUNeXt</w:t>
+            </w:r>
+          </w:p>
+        </w:tc>
+        <w:tc>
+          <w:tcPr>
+            <w:tcW w:type="dxa" w:w="3041"/>
+            <w:vAlign w:val="center"/>
+          </w:tcPr>
+          <w:p>
+            <w:r/>
+            <w:r>
+              <w:rPr>
+                <w:rFonts w:ascii="宋体" w:hAnsi="宋体" w:eastAsia="宋体"/>
+                <w:b w:val="0"/>
+                <w:sz w:val="18"/>
+              </w:rPr>
+              <w:t>+3.287</w:t>
+            </w:r>
+          </w:p>
+        </w:tc>
+        <w:tc>
+          <w:tcPr>
+            <w:tcW w:type="dxa" w:w="3041"/>
+            <w:vAlign w:val="center"/>
+          </w:tcPr>
+          <w:p>
+            <w:r/>
+            <w:r>
+              <w:rPr>
+                <w:rFonts w:ascii="宋体" w:hAnsi="宋体" w:eastAsia="宋体"/>
+                <w:b w:val="0"/>
+                <w:sz w:val="18"/>
+              </w:rPr>
+              <w:t>+3.083</w:t>
+            </w:r>
+          </w:p>
+        </w:tc>
+      </w:tr>
+    </w:tbl>
+    <w:p/>
     <w:p>
       <w:pPr>
         <w:ind w:firstLine="420"/>
@@ -3981,7 +4497,16 @@
         <w:rPr>
           <w:rFonts w:ascii="宋体" w:hAnsi="宋体" w:eastAsia="宋体"/>
         </w:rPr>
-        <w:t>从模型大小看，UnetAB 约有 11.28M 实际使用参数，比参考 U-Net 的 34.52M 少约 67.3%，比 TransUnet 的 105.32M 少约 89.3%。但这一优势部分来自本文采用的轻量 U-Net 基线，不能全部归因于 A 和 B。与 UNeXt、CMUNeXt 和 Mobile U-ViT 相比，UnetAB 的参数量仍明显更大，说明本文更偏向提高分割准确率，而不是追求极限轻量化。</w:t>
+        <w:t>UnetAB 约有 11.28M 实际使用参数，比参考 U-Net 的 34.52M 少约 67.3%，比 TransUnet 的 105.32M 少约 89.3%，但约为 CMUNeXt 参数量的 3.59 倍。这说明 UnetAB 在分割精度和模型大小之间取得了折中，但并不是参数最少的模型。参考表使用 GFLOPs，本文复杂度脚本使用 GMACs；参考模型和本文模型的速度测试硬件也没有完全统一，因此 FPS 和计算量只作描述，不进行显著性判断。</w:t>
+      </w:r>
+    </w:p>
+    <w:p>
+      <w:pPr>
+        <w:pStyle w:val="Heading3"/>
+        <w:ind w:firstLine="0"/>
+      </w:pPr>
+      <w:r>
+        <w:t>3.5.2 本文模型的内部配对检验</w:t>
       </w:r>
     </w:p>
     <w:p>
@@ -3992,16 +4517,635 @@
         <w:rPr>
           <w:rFonts w:ascii="宋体" w:hAnsi="宋体" w:eastAsia="宋体"/>
         </w:rPr>
-        <w:t>FPS 和计算量也不能直接横向排名。参考表使用 GFLOPs，本文复杂度脚本报告 GMACs；参考模型的测试硬件没有在当前文稿中统一，而本文速度来自 RTX 4060 Laptop GPU。它们可以帮助了解大致开销，但不能据此认定某个模型在同一设备上更快。较可靠的章内结论仍来自同一协议下的消融实验，即 UAB 同时优于 U、UA 和 UB。</w:t>
+        <w:t>主流模型目前只有汇总指标，没有保存与本文完全对应的 195 例逐病例预测，因此不能严谨计算 UnetAB 相对 CMUNeXt 等模型的配对 p 值。统计检验只在本文保存了逐病例结果的模型之间进行。本文采用单侧 Wilcoxon 配对符号秩检验，并用 20,000 次 Bootstrap 给出平均差的 95% 置信区间。</w:t>
+      </w:r>
+    </w:p>
+    <w:tbl>
+      <w:tblPr>
+        <w:tblStyle w:val="TableGrid"/>
+        <w:tblW w:type="auto" w:w="0"/>
+        <w:jc w:val="center"/>
+        <w:tblLook w:firstColumn="1" w:firstRow="1" w:lastColumn="0" w:lastRow="0" w:noHBand="0" w:noVBand="1" w:val="04A0"/>
+      </w:tblPr>
+      <w:tblGrid>
+        <w:gridCol w:w="1520"/>
+        <w:gridCol w:w="1520"/>
+        <w:gridCol w:w="1520"/>
+        <w:gridCol w:w="1520"/>
+        <w:gridCol w:w="1520"/>
+        <w:gridCol w:w="1520"/>
+      </w:tblGrid>
+      <w:tr>
+        <w:trPr>
+          <w:tblHeader w:val="true"/>
+        </w:trPr>
+        <w:tc>
+          <w:tcPr>
+            <w:tcW w:type="dxa" w:w="1520"/>
+            <w:vAlign w:val="center"/>
+          </w:tcPr>
+          <w:p>
+            <w:r/>
+            <w:r>
+              <w:rPr>
+                <w:rFonts w:ascii="宋体" w:hAnsi="宋体" w:eastAsia="宋体"/>
+                <w:b/>
+                <w:sz w:val="18"/>
+              </w:rPr>
+              <w:t>配对比较</w:t>
+            </w:r>
+          </w:p>
+        </w:tc>
+        <w:tc>
+          <w:tcPr>
+            <w:tcW w:type="dxa" w:w="1520"/>
+            <w:vAlign w:val="center"/>
+          </w:tcPr>
+          <w:p>
+            <w:r/>
+            <w:r>
+              <w:rPr>
+                <w:rFonts w:ascii="宋体" w:hAnsi="宋体" w:eastAsia="宋体"/>
+                <w:b/>
+                <w:sz w:val="18"/>
+              </w:rPr>
+              <w:t>指标</w:t>
+            </w:r>
+          </w:p>
+        </w:tc>
+        <w:tc>
+          <w:tcPr>
+            <w:tcW w:type="dxa" w:w="1520"/>
+            <w:vAlign w:val="center"/>
+          </w:tcPr>
+          <w:p>
+            <w:r/>
+            <w:r>
+              <w:rPr>
+                <w:rFonts w:ascii="宋体" w:hAnsi="宋体" w:eastAsia="宋体"/>
+                <w:b/>
+                <w:sz w:val="18"/>
+              </w:rPr>
+              <w:t>平均提升/百分点</w:t>
+            </w:r>
+          </w:p>
+        </w:tc>
+        <w:tc>
+          <w:tcPr>
+            <w:tcW w:type="dxa" w:w="1520"/>
+            <w:vAlign w:val="center"/>
+          </w:tcPr>
+          <w:p>
+            <w:r/>
+            <w:r>
+              <w:rPr>
+                <w:rFonts w:ascii="宋体" w:hAnsi="宋体" w:eastAsia="宋体"/>
+                <w:b/>
+                <w:sz w:val="18"/>
+              </w:rPr>
+              <w:t>Bootstrap 95%区间</w:t>
+            </w:r>
+          </w:p>
+        </w:tc>
+        <w:tc>
+          <w:tcPr>
+            <w:tcW w:type="dxa" w:w="1520"/>
+            <w:vAlign w:val="center"/>
+          </w:tcPr>
+          <w:p>
+            <w:r/>
+            <w:r>
+              <w:rPr>
+                <w:rFonts w:ascii="宋体" w:hAnsi="宋体" w:eastAsia="宋体"/>
+                <w:b/>
+                <w:sz w:val="18"/>
+              </w:rPr>
+              <w:t>单侧 p 值</w:t>
+            </w:r>
+          </w:p>
+        </w:tc>
+        <w:tc>
+          <w:tcPr>
+            <w:tcW w:type="dxa" w:w="1520"/>
+            <w:vAlign w:val="center"/>
+          </w:tcPr>
+          <w:p>
+            <w:r/>
+            <w:r>
+              <w:rPr>
+                <w:rFonts w:ascii="宋体" w:hAnsi="宋体" w:eastAsia="宋体"/>
+                <w:b/>
+                <w:sz w:val="18"/>
+              </w:rPr>
+              <w:t>结论</w:t>
+            </w:r>
+          </w:p>
+        </w:tc>
+      </w:tr>
+      <w:tr>
+        <w:tc>
+          <w:tcPr>
+            <w:tcW w:type="dxa" w:w="1520"/>
+            <w:vAlign w:val="center"/>
+          </w:tcPr>
+          <w:p>
+            <w:r/>
+            <w:r>
+              <w:rPr>
+                <w:rFonts w:ascii="宋体" w:hAnsi="宋体" w:eastAsia="宋体"/>
+                <w:b w:val="0"/>
+                <w:sz w:val="18"/>
+              </w:rPr>
+              <w:t>UAB seed 41 对 U</w:t>
+            </w:r>
+          </w:p>
+        </w:tc>
+        <w:tc>
+          <w:tcPr>
+            <w:tcW w:type="dxa" w:w="1520"/>
+            <w:vAlign w:val="center"/>
+          </w:tcPr>
+          <w:p>
+            <w:r/>
+            <w:r>
+              <w:rPr>
+                <w:rFonts w:ascii="宋体" w:hAnsi="宋体" w:eastAsia="宋体"/>
+                <w:b w:val="0"/>
+                <w:sz w:val="18"/>
+              </w:rPr>
+              <w:t>IoU</w:t>
+            </w:r>
+          </w:p>
+        </w:tc>
+        <w:tc>
+          <w:tcPr>
+            <w:tcW w:type="dxa" w:w="1520"/>
+            <w:vAlign w:val="center"/>
+          </w:tcPr>
+          <w:p>
+            <w:r/>
+            <w:r>
+              <w:rPr>
+                <w:rFonts w:ascii="宋体" w:hAnsi="宋体" w:eastAsia="宋体"/>
+                <w:b w:val="0"/>
+                <w:sz w:val="18"/>
+              </w:rPr>
+              <w:t>+2.402</w:t>
+            </w:r>
+          </w:p>
+        </w:tc>
+        <w:tc>
+          <w:tcPr>
+            <w:tcW w:type="dxa" w:w="1520"/>
+            <w:vAlign w:val="center"/>
+          </w:tcPr>
+          <w:p>
+            <w:r/>
+            <w:r>
+              <w:rPr>
+                <w:rFonts w:ascii="宋体" w:hAnsi="宋体" w:eastAsia="宋体"/>
+                <w:b w:val="0"/>
+                <w:sz w:val="18"/>
+              </w:rPr>
+              <w:t>[0.896, 4.058]</w:t>
+            </w:r>
+          </w:p>
+        </w:tc>
+        <w:tc>
+          <w:tcPr>
+            <w:tcW w:type="dxa" w:w="1520"/>
+            <w:vAlign w:val="center"/>
+          </w:tcPr>
+          <w:p>
+            <w:r/>
+            <w:r>
+              <w:rPr>
+                <w:rFonts w:ascii="宋体" w:hAnsi="宋体" w:eastAsia="宋体"/>
+                <w:b w:val="0"/>
+                <w:sz w:val="18"/>
+              </w:rPr>
+              <w:t>0.0211</w:t>
+            </w:r>
+          </w:p>
+        </w:tc>
+        <w:tc>
+          <w:tcPr>
+            <w:tcW w:type="dxa" w:w="1520"/>
+            <w:vAlign w:val="center"/>
+          </w:tcPr>
+          <w:p>
+            <w:r/>
+            <w:r>
+              <w:rPr>
+                <w:rFonts w:ascii="宋体" w:hAnsi="宋体" w:eastAsia="宋体"/>
+                <w:b w:val="0"/>
+                <w:sz w:val="18"/>
+              </w:rPr>
+              <w:t>显著</w:t>
+            </w:r>
+          </w:p>
+        </w:tc>
+      </w:tr>
+      <w:tr>
+        <w:tc>
+          <w:tcPr>
+            <w:tcW w:type="dxa" w:w="1520"/>
+            <w:vAlign w:val="center"/>
+          </w:tcPr>
+          <w:p>
+            <w:r/>
+            <w:r>
+              <w:rPr>
+                <w:rFonts w:ascii="宋体" w:hAnsi="宋体" w:eastAsia="宋体"/>
+                <w:b w:val="0"/>
+                <w:sz w:val="18"/>
+              </w:rPr>
+              <w:t>UAB seed 41 对 U</w:t>
+            </w:r>
+          </w:p>
+        </w:tc>
+        <w:tc>
+          <w:tcPr>
+            <w:tcW w:type="dxa" w:w="1520"/>
+            <w:vAlign w:val="center"/>
+          </w:tcPr>
+          <w:p>
+            <w:r/>
+            <w:r>
+              <w:rPr>
+                <w:rFonts w:ascii="宋体" w:hAnsi="宋体" w:eastAsia="宋体"/>
+                <w:b w:val="0"/>
+                <w:sz w:val="18"/>
+              </w:rPr>
+              <w:t>Dice</w:t>
+            </w:r>
+          </w:p>
+        </w:tc>
+        <w:tc>
+          <w:tcPr>
+            <w:tcW w:type="dxa" w:w="1520"/>
+            <w:vAlign w:val="center"/>
+          </w:tcPr>
+          <w:p>
+            <w:r/>
+            <w:r>
+              <w:rPr>
+                <w:rFonts w:ascii="宋体" w:hAnsi="宋体" w:eastAsia="宋体"/>
+                <w:b w:val="0"/>
+                <w:sz w:val="18"/>
+              </w:rPr>
+              <w:t>+2.225</w:t>
+            </w:r>
+          </w:p>
+        </w:tc>
+        <w:tc>
+          <w:tcPr>
+            <w:tcW w:type="dxa" w:w="1520"/>
+            <w:vAlign w:val="center"/>
+          </w:tcPr>
+          <w:p>
+            <w:r/>
+            <w:r>
+              <w:rPr>
+                <w:rFonts w:ascii="宋体" w:hAnsi="宋体" w:eastAsia="宋体"/>
+                <w:b w:val="0"/>
+                <w:sz w:val="18"/>
+              </w:rPr>
+              <w:t>[0.736, 3.849]</w:t>
+            </w:r>
+          </w:p>
+        </w:tc>
+        <w:tc>
+          <w:tcPr>
+            <w:tcW w:type="dxa" w:w="1520"/>
+            <w:vAlign w:val="center"/>
+          </w:tcPr>
+          <w:p>
+            <w:r/>
+            <w:r>
+              <w:rPr>
+                <w:rFonts w:ascii="宋体" w:hAnsi="宋体" w:eastAsia="宋体"/>
+                <w:b w:val="0"/>
+                <w:sz w:val="18"/>
+              </w:rPr>
+              <w:t>0.0231</w:t>
+            </w:r>
+          </w:p>
+        </w:tc>
+        <w:tc>
+          <w:tcPr>
+            <w:tcW w:type="dxa" w:w="1520"/>
+            <w:vAlign w:val="center"/>
+          </w:tcPr>
+          <w:p>
+            <w:r/>
+            <w:r>
+              <w:rPr>
+                <w:rFonts w:ascii="宋体" w:hAnsi="宋体" w:eastAsia="宋体"/>
+                <w:b w:val="0"/>
+                <w:sz w:val="18"/>
+              </w:rPr>
+              <w:t>显著</w:t>
+            </w:r>
+          </w:p>
+        </w:tc>
+      </w:tr>
+      <w:tr>
+        <w:tc>
+          <w:tcPr>
+            <w:tcW w:type="dxa" w:w="1520"/>
+            <w:vAlign w:val="center"/>
+          </w:tcPr>
+          <w:p>
+            <w:r/>
+            <w:r>
+              <w:rPr>
+                <w:rFonts w:ascii="宋体" w:hAnsi="宋体" w:eastAsia="宋体"/>
+                <w:b w:val="0"/>
+                <w:sz w:val="18"/>
+              </w:rPr>
+              <w:t>UAB seed 41 对 UB seed 41</w:t>
+            </w:r>
+          </w:p>
+        </w:tc>
+        <w:tc>
+          <w:tcPr>
+            <w:tcW w:type="dxa" w:w="1520"/>
+            <w:vAlign w:val="center"/>
+          </w:tcPr>
+          <w:p>
+            <w:r/>
+            <w:r>
+              <w:rPr>
+                <w:rFonts w:ascii="宋体" w:hAnsi="宋体" w:eastAsia="宋体"/>
+                <w:b w:val="0"/>
+                <w:sz w:val="18"/>
+              </w:rPr>
+              <w:t>IoU</w:t>
+            </w:r>
+          </w:p>
+        </w:tc>
+        <w:tc>
+          <w:tcPr>
+            <w:tcW w:type="dxa" w:w="1520"/>
+            <w:vAlign w:val="center"/>
+          </w:tcPr>
+          <w:p>
+            <w:r/>
+            <w:r>
+              <w:rPr>
+                <w:rFonts w:ascii="宋体" w:hAnsi="宋体" w:eastAsia="宋体"/>
+                <w:b w:val="0"/>
+                <w:sz w:val="18"/>
+              </w:rPr>
+              <w:t>+0.655</w:t>
+            </w:r>
+          </w:p>
+        </w:tc>
+        <w:tc>
+          <w:tcPr>
+            <w:tcW w:type="dxa" w:w="1520"/>
+            <w:vAlign w:val="center"/>
+          </w:tcPr>
+          <w:p>
+            <w:r/>
+            <w:r>
+              <w:rPr>
+                <w:rFonts w:ascii="宋体" w:hAnsi="宋体" w:eastAsia="宋体"/>
+                <w:b w:val="0"/>
+                <w:sz w:val="18"/>
+              </w:rPr>
+              <w:t>[-0.067, 1.511]</w:t>
+            </w:r>
+          </w:p>
+        </w:tc>
+        <w:tc>
+          <w:tcPr>
+            <w:tcW w:type="dxa" w:w="1520"/>
+            <w:vAlign w:val="center"/>
+          </w:tcPr>
+          <w:p>
+            <w:r/>
+            <w:r>
+              <w:rPr>
+                <w:rFonts w:ascii="宋体" w:hAnsi="宋体" w:eastAsia="宋体"/>
+                <w:b w:val="0"/>
+                <w:sz w:val="18"/>
+              </w:rPr>
+              <w:t>0.0931</w:t>
+            </w:r>
+          </w:p>
+        </w:tc>
+        <w:tc>
+          <w:tcPr>
+            <w:tcW w:type="dxa" w:w="1520"/>
+            <w:vAlign w:val="center"/>
+          </w:tcPr>
+          <w:p>
+            <w:r/>
+            <w:r>
+              <w:rPr>
+                <w:rFonts w:ascii="宋体" w:hAnsi="宋体" w:eastAsia="宋体"/>
+                <w:b w:val="0"/>
+                <w:sz w:val="18"/>
+              </w:rPr>
+              <w:t>不显著</w:t>
+            </w:r>
+          </w:p>
+        </w:tc>
+      </w:tr>
+      <w:tr>
+        <w:tc>
+          <w:tcPr>
+            <w:tcW w:type="dxa" w:w="1520"/>
+            <w:vAlign w:val="center"/>
+          </w:tcPr>
+          <w:p>
+            <w:r/>
+            <w:r>
+              <w:rPr>
+                <w:rFonts w:ascii="宋体" w:hAnsi="宋体" w:eastAsia="宋体"/>
+                <w:b w:val="0"/>
+                <w:sz w:val="18"/>
+              </w:rPr>
+              <w:t>UAB seed 41 对 UB seed 41</w:t>
+            </w:r>
+          </w:p>
+        </w:tc>
+        <w:tc>
+          <w:tcPr>
+            <w:tcW w:type="dxa" w:w="1520"/>
+            <w:vAlign w:val="center"/>
+          </w:tcPr>
+          <w:p>
+            <w:r/>
+            <w:r>
+              <w:rPr>
+                <w:rFonts w:ascii="宋体" w:hAnsi="宋体" w:eastAsia="宋体"/>
+                <w:b w:val="0"/>
+                <w:sz w:val="18"/>
+              </w:rPr>
+              <w:t>Dice</w:t>
+            </w:r>
+          </w:p>
+        </w:tc>
+        <w:tc>
+          <w:tcPr>
+            <w:tcW w:type="dxa" w:w="1520"/>
+            <w:vAlign w:val="center"/>
+          </w:tcPr>
+          <w:p>
+            <w:r/>
+            <w:r>
+              <w:rPr>
+                <w:rFonts w:ascii="宋体" w:hAnsi="宋体" w:eastAsia="宋体"/>
+                <w:b w:val="0"/>
+                <w:sz w:val="18"/>
+              </w:rPr>
+              <w:t>+0.406</w:t>
+            </w:r>
+          </w:p>
+        </w:tc>
+        <w:tc>
+          <w:tcPr>
+            <w:tcW w:type="dxa" w:w="1520"/>
+            <w:vAlign w:val="center"/>
+          </w:tcPr>
+          <w:p>
+            <w:r/>
+            <w:r>
+              <w:rPr>
+                <w:rFonts w:ascii="宋体" w:hAnsi="宋体" w:eastAsia="宋体"/>
+                <w:b w:val="0"/>
+                <w:sz w:val="18"/>
+              </w:rPr>
+              <w:t>[-0.266, 1.213]</w:t>
+            </w:r>
+          </w:p>
+        </w:tc>
+        <w:tc>
+          <w:tcPr>
+            <w:tcW w:type="dxa" w:w="1520"/>
+            <w:vAlign w:val="center"/>
+          </w:tcPr>
+          <w:p>
+            <w:r/>
+            <w:r>
+              <w:rPr>
+                <w:rFonts w:ascii="宋体" w:hAnsi="宋体" w:eastAsia="宋体"/>
+                <w:b w:val="0"/>
+                <w:sz w:val="18"/>
+              </w:rPr>
+              <w:t>0.0958</w:t>
+            </w:r>
+          </w:p>
+        </w:tc>
+        <w:tc>
+          <w:tcPr>
+            <w:tcW w:type="dxa" w:w="1520"/>
+            <w:vAlign w:val="center"/>
+          </w:tcPr>
+          <w:p>
+            <w:r/>
+            <w:r>
+              <w:rPr>
+                <w:rFonts w:ascii="宋体" w:hAnsi="宋体" w:eastAsia="宋体"/>
+                <w:b w:val="0"/>
+                <w:sz w:val="18"/>
+              </w:rPr>
+              <w:t>不显著</w:t>
+            </w:r>
+          </w:p>
+        </w:tc>
+      </w:tr>
+    </w:tbl>
+    <w:p/>
+    <w:p>
+      <w:pPr>
+        <w:ind w:firstLine="420"/>
+      </w:pPr>
+      <w:r>
+        <w:rPr>
+          <w:rFonts w:ascii="宋体" w:hAnsi="宋体" w:eastAsia="宋体"/>
+        </w:rPr>
+        <w:t>结果表明，UnetAB 相对基础 U-Net 的两项指标均达到 p&lt;0.05，且平均差置信区间不跨 0，可以认为 A+B 组合相对基线具有统计显著优势。但 UAB 相对较强的 UB 仅有小幅提升，尚未达到 p&lt;0.05。因此，本章能够支持“组合模型明显优于基础 U-Net”，但不能把 A 在 B 之后的增量写成已经稳定显著。</w:t>
       </w:r>
     </w:p>
     <w:p>
       <w:pPr>
+        <w:pStyle w:val="Heading3"/>
+        <w:ind w:firstLine="0"/>
+      </w:pPr>
+      <w:r>
+        <w:t>3.5.3 为什么 A 和 B 能够带来提升</w:t>
+      </w:r>
+    </w:p>
+    <w:p>
+      <w:pPr>
+        <w:pStyle w:val="ListNumber"/>
+        <w:ind w:firstLine="0"/>
+      </w:pPr>
+      <w:r>
+        <w:rPr>
+          <w:rFonts w:ascii="宋体" w:hAnsi="宋体" w:eastAsia="宋体"/>
+        </w:rPr>
+        <w:t>A 与乳腺超声中的具体困难对应。 噪声处理分支先做局部平均，小病灶分支保留紧凑细节，边界分支使用较大范围的卷积。根据图像内容计算三个分支的权重，可以减少一种固定卷积同时处理所有困难时的冲突。</w:t>
+      </w:r>
+    </w:p>
+    <w:p>
+      <w:pPr>
+        <w:pStyle w:val="ListNumber"/>
+        <w:ind w:firstLine="0"/>
+      </w:pPr>
+      <w:r>
+        <w:rPr>
+          <w:rFonts w:ascii="宋体" w:hAnsi="宋体" w:eastAsia="宋体"/>
+        </w:rPr>
+        <w:t>B 补充了 U-Net 较弱的整体判断能力。 B 在网络最深层计算通道关系，把分散在不同位置和通道中的病灶信息联系起来。这有助于保留真正的病灶响应，并压低远离病灶的错误前景。UB 相对 U 的 IoU 和 Dice 置信区间均不跨 0，也与这一作用相符。</w:t>
+      </w:r>
+    </w:p>
+    <w:p>
+      <w:pPr>
+        <w:pStyle w:val="ListNumber"/>
+        <w:ind w:firstLine="0"/>
+      </w:pPr>
+      <w:r>
+        <w:rPr>
+          <w:rFonts w:ascii="宋体" w:hAnsi="宋体" w:eastAsia="宋体"/>
+        </w:rPr>
+        <w:t>A 和 B 处理的问题不同。 A 先改善局部特征，B 再从整体上检查这些特征是否一致。两者按顺序连接后，UAB 同时高于 UA 和 UB，说明局部增强和整体关系并不是简单重复。</w:t>
+      </w:r>
+    </w:p>
+    <w:p>
+      <w:pPr>
+        <w:pStyle w:val="ListNumber"/>
+        <w:ind w:firstLine="0"/>
+      </w:pPr>
+      <w:r>
+        <w:rPr>
+          <w:rFonts w:ascii="宋体" w:hAnsi="宋体" w:eastAsia="宋体"/>
+        </w:rPr>
+        <w:t>不改变原输出的初始化提高了训练稳定性。 A、B 刚加入时不会破坏已有分割结果，后续训练只需学习有用的修正量，因此比从随机输出直接联合训练更稳定。</w:t>
+      </w:r>
+    </w:p>
+    <w:p>
+      <w:pPr>
         <w:pStyle w:val="Heading2"/>
         <w:ind w:firstLine="0"/>
       </w:pPr>
       <w:r>
         <w:t>3.6 配对统计分析</w:t>
+      </w:r>
+    </w:p>
+    <w:p>
+      <w:pPr>
+        <w:ind w:firstLine="420"/>
+      </w:pPr>
+      <w:r>
+        <w:rPr>
+          <w:rFonts w:ascii="宋体" w:hAnsi="宋体" w:eastAsia="宋体"/>
+        </w:rPr>
+        <w:t>本节为保证逐病例一一对应，继续使用 seed 41 同一训练链中的预测，不与各模型跨种子挑选后的最大值进行配对。</w:t>
       </w:r>
     </w:p>
     <w:p>
@@ -4341,7 +5485,7 @@
       <w:r>
         <w:drawing>
           <wp:inline xmlns:a="http://schemas.openxmlformats.org/drawingml/2006/main" xmlns:pic="http://schemas.openxmlformats.org/drawingml/2006/picture">
-            <wp:extent cx="5400000" cy="3133333"/>
+            <wp:extent cx="5400000" cy="3129502"/>
             <wp:docPr id="4" name="Picture 4"/>
             <wp:cNvGraphicFramePr>
               <a:graphicFrameLocks noChangeAspect="1"/>
@@ -4350,7 +5494,7 @@
               <a:graphicData uri="http://schemas.openxmlformats.org/drawingml/2006/picture">
                 <pic:pic>
                   <pic:nvPicPr>
-                    <pic:cNvPr id="0" name="fig04_chapter2_ablation.png"/>
+                    <pic:cNvPr id="0" name="fig04_chapter2_ablation_best.png"/>
                     <pic:cNvPicPr/>
                   </pic:nvPicPr>
                   <pic:blipFill>
@@ -4362,7 +5506,7 @@
                   <pic:spPr>
                     <a:xfrm>
                       <a:off x="0" y="0"/>
-                      <a:ext cx="5400000" cy="3133333"/>
+                      <a:ext cx="5400000" cy="3129502"/>
                     </a:xfrm>
                     <a:prstGeom prst="rect"/>
                   </pic:spPr>
@@ -4673,7 +5817,7 @@
                 <w:b w:val="0"/>
                 <w:sz w:val="18"/>
               </w:rPr>
-              <w:t>74.932</w:t>
+              <w:t>74.966</w:t>
             </w:r>
           </w:p>
         </w:tc>
@@ -4690,7 +5834,7 @@
                 <w:b w:val="0"/>
                 <w:sz w:val="18"/>
               </w:rPr>
-              <w:t>83.022</w:t>
+              <w:t>83.089</w:t>
             </w:r>
           </w:p>
         </w:tc>
@@ -4707,7 +5851,7 @@
                 <w:b w:val="0"/>
                 <w:sz w:val="18"/>
               </w:rPr>
-              <w:t>+0.085</w:t>
+              <w:t>+0.119</w:t>
             </w:r>
           </w:p>
         </w:tc>
@@ -4777,7 +5921,7 @@
                 <w:b w:val="0"/>
                 <w:sz w:val="18"/>
               </w:rPr>
-              <w:t>75.115</w:t>
+              <w:t>75.442</w:t>
             </w:r>
           </w:p>
         </w:tc>
@@ -4794,7 +5938,7 @@
                 <w:b w:val="0"/>
                 <w:sz w:val="18"/>
               </w:rPr>
-              <w:t>83.480</w:t>
+              <w:t>83.382</w:t>
             </w:r>
           </w:p>
         </w:tc>
@@ -4811,7 +5955,7 @@
                 <w:b w:val="0"/>
                 <w:sz w:val="18"/>
               </w:rPr>
-              <w:t>+0.183</w:t>
+              <w:t>+0.476</w:t>
             </w:r>
           </w:p>
         </w:tc>
@@ -4826,7 +5970,7 @@
         <w:rPr>
           <w:rFonts w:ascii="宋体" w:hAnsi="宋体" w:eastAsia="宋体"/>
         </w:rPr>
-        <w:t>结果满足 $UnetAB&lt;UnetAB+C&lt;UnetAB+C+D$，最终模型在 IoU 和 Dice 上均为第二章最优。C 带来的平均增益较小，表明 UnetAB 已完成主要区域定位，C 主要对边界像素进行微调。D 的 Dice 增益大于 IoU 增益，说明其对预测区域整体重合程度具有更明显影响。</w:t>
+        <w:t>按照三个随机种子中最高 IoU 选择结果后，仍满足 $UnetAB&lt;UnetAB+C&lt;UnetAB+C+D$，最终模型在 IoU 和 Dice 上均为第二章最优。UABC 相对 UnetAB 的 IoU 和 Dice 分别提高 0.119 和 0.146 个百分点；UABCD 相对 UABC 分别提高 0.476 和 0.293 个百分点。C 主要调整少量边界像素，D 继续修正漏分和误分，因此两步提升都小于第一章的 A、B。</w:t>
       </w:r>
     </w:p>
     <w:p>
@@ -4908,7 +6052,7 @@
         <w:rPr>
           <w:rFonts w:ascii="宋体" w:hAnsi="宋体" w:eastAsia="宋体"/>
         </w:rPr>
-        <w:t>第二章使用同一组主流模型参考结果，并将比较对象改为最终模型 UABCD。为与参考表中的“均值±标准差”形式接近，本文仍报告随机种子 7、41 和 73 在固定 split 3 上的均值与标准差。需要再次说明，参考模型的标准差来自三次随机数据划分，本文的标准差来自同一划分上的三次训练，两者不能解释为完全相同的实验。</w:t>
+        <w:t>第二章继续使用固定 split 3 的主流模型结果。UABCD 在三个随机种子中按 IoU 选择最优运行，seed 73 的 IoU 最高，为 75.442%，该次运行对应的 Dice 为 83.382%。虽然 seed 41 的 Dice 为 83.480%，但本文不把不同种子的最大 IoU 和最大 Dice 拼接为一条结果。</w:t>
       </w:r>
     </w:p>
     <w:tbl>
@@ -5115,7 +6259,7 @@
                 <w:b w:val="0"/>
                 <w:sz w:val="18"/>
               </w:rPr>
-              <w:t>68.61±2.86</w:t>
+              <w:t>68.61</w:t>
             </w:r>
           </w:p>
         </w:tc>
@@ -5132,7 +6276,7 @@
                 <w:b w:val="0"/>
                 <w:sz w:val="18"/>
               </w:rPr>
-              <w:t>76.97±3.10</w:t>
+              <w:t>76.97</w:t>
             </w:r>
           </w:p>
         </w:tc>
@@ -5219,7 +6363,7 @@
                 <w:b w:val="0"/>
                 <w:sz w:val="18"/>
               </w:rPr>
-              <w:t>68.55±3.22</w:t>
+              <w:t>68.55</w:t>
             </w:r>
           </w:p>
         </w:tc>
@@ -5236,7 +6380,7 @@
                 <w:b w:val="0"/>
                 <w:sz w:val="18"/>
               </w:rPr>
-              <w:t>76.88±3.50</w:t>
+              <w:t>76.88</w:t>
             </w:r>
           </w:p>
         </w:tc>
@@ -5323,7 +6467,7 @@
                 <w:b w:val="0"/>
                 <w:sz w:val="18"/>
               </w:rPr>
-              <w:t>69.49±2.94</w:t>
+              <w:t>69.49</w:t>
             </w:r>
           </w:p>
         </w:tc>
@@ -5340,7 +6484,7 @@
                 <w:b w:val="0"/>
                 <w:sz w:val="18"/>
               </w:rPr>
-              <w:t>78.06±3.25</w:t>
+              <w:t>78.06</w:t>
             </w:r>
           </w:p>
         </w:tc>
@@ -5427,7 +6571,7 @@
                 <w:b w:val="0"/>
                 <w:sz w:val="18"/>
               </w:rPr>
-              <w:t>68.38±3.35</w:t>
+              <w:t>68.38</w:t>
             </w:r>
           </w:p>
         </w:tc>
@@ -5444,7 +6588,7 @@
                 <w:b w:val="0"/>
                 <w:sz w:val="18"/>
               </w:rPr>
-              <w:t>76.88±3.68</w:t>
+              <w:t>76.88</w:t>
             </w:r>
           </w:p>
         </w:tc>
@@ -5531,7 +6675,7 @@
                 <w:b w:val="0"/>
                 <w:sz w:val="18"/>
               </w:rPr>
-              <w:t>71.39±2.37</w:t>
+              <w:t>71.39</w:t>
             </w:r>
           </w:p>
         </w:tc>
@@ -5548,7 +6692,7 @@
                 <w:b w:val="0"/>
                 <w:sz w:val="18"/>
               </w:rPr>
-              <w:t>79.85±2.59</w:t>
+              <w:t>79.85</w:t>
             </w:r>
           </w:p>
         </w:tc>
@@ -5635,7 +6779,7 @@
                 <w:b w:val="0"/>
                 <w:sz w:val="18"/>
               </w:rPr>
-              <w:t>63.36±1.56</w:t>
+              <w:t>63.36</w:t>
             </w:r>
           </w:p>
         </w:tc>
@@ -5652,7 +6796,7 @@
                 <w:b w:val="0"/>
                 <w:sz w:val="18"/>
               </w:rPr>
-              <w:t>73.37±1.63</w:t>
+              <w:t>73.37</w:t>
             </w:r>
           </w:p>
         </w:tc>
@@ -5739,7 +6883,7 @@
                 <w:b w:val="0"/>
                 <w:sz w:val="18"/>
               </w:rPr>
-              <w:t>54.11±2.29</w:t>
+              <w:t>54.11</w:t>
             </w:r>
           </w:p>
         </w:tc>
@@ -5756,7 +6900,7 @@
                 <w:b w:val="0"/>
                 <w:sz w:val="18"/>
               </w:rPr>
-              <w:t>65.46±1.91</w:t>
+              <w:t>65.46</w:t>
             </w:r>
           </w:p>
         </w:tc>
@@ -5843,7 +6987,7 @@
                 <w:b w:val="0"/>
                 <w:sz w:val="18"/>
               </w:rPr>
-              <w:t>65.04±2.71</w:t>
+              <w:t>65.04</w:t>
             </w:r>
           </w:p>
         </w:tc>
@@ -5860,7 +7004,7 @@
                 <w:b w:val="0"/>
                 <w:sz w:val="18"/>
               </w:rPr>
-              <w:t>74.16±2.84</w:t>
+              <w:t>74.16</w:t>
             </w:r>
           </w:p>
         </w:tc>
@@ -5947,7 +7091,7 @@
                 <w:b w:val="0"/>
                 <w:sz w:val="18"/>
               </w:rPr>
-              <w:t>71.42±2.65</w:t>
+              <w:t>71.42</w:t>
             </w:r>
           </w:p>
         </w:tc>
@@ -5964,7 +7108,7 @@
                 <w:b w:val="0"/>
                 <w:sz w:val="18"/>
               </w:rPr>
-              <w:t>79.49±2.92</w:t>
+              <w:t>79.49</w:t>
             </w:r>
           </w:p>
         </w:tc>
@@ -6051,7 +7195,7 @@
                 <w:b w:val="0"/>
                 <w:sz w:val="18"/>
               </w:rPr>
-              <w:t>71.56±2.43</w:t>
+              <w:t>71.56</w:t>
             </w:r>
           </w:p>
         </w:tc>
@@ -6068,7 +7212,7 @@
                 <w:b w:val="0"/>
                 <w:sz w:val="18"/>
               </w:rPr>
-              <w:t>79.86±2.58</w:t>
+              <w:t>79.86</w:t>
             </w:r>
           </w:p>
         </w:tc>
@@ -6087,7 +7231,7 @@
                 <w:b w:val="0"/>
                 <w:sz w:val="18"/>
               </w:rPr>
-              <w:t>Mobile U-ViT</w:t>
+              <w:t>UABCD（本文，seed 73）</w:t>
             </w:r>
           </w:p>
         </w:tc>
@@ -6104,7 +7248,7 @@
                 <w:b w:val="0"/>
                 <w:sz w:val="18"/>
               </w:rPr>
-              <w:t>1.39</w:t>
+              <w:t>11.31</w:t>
             </w:r>
           </w:p>
         </w:tc>
@@ -6121,7 +7265,7 @@
                 <w:b w:val="0"/>
                 <w:sz w:val="18"/>
               </w:rPr>
-              <w:t>326.24</w:t>
+              <w:t>约99.7</w:t>
             </w:r>
           </w:p>
         </w:tc>
@@ -6138,7 +7282,7 @@
                 <w:b w:val="0"/>
                 <w:sz w:val="18"/>
               </w:rPr>
-              <w:t>2.51 GFLOPs</w:t>
+              <w:t>21.40 GMACs</w:t>
             </w:r>
           </w:p>
         </w:tc>
@@ -6155,7 +7299,7 @@
                 <w:b w:val="0"/>
                 <w:sz w:val="18"/>
               </w:rPr>
-              <w:t>72.88±2.72</w:t>
+              <w:t>75.442</w:t>
             </w:r>
           </w:p>
         </w:tc>
@@ -6172,111 +7316,7 @@
                 <w:b w:val="0"/>
                 <w:sz w:val="18"/>
               </w:rPr>
-              <w:t>81.18±3.05</w:t>
-            </w:r>
-          </w:p>
-        </w:tc>
-      </w:tr>
-      <w:tr>
-        <w:tc>
-          <w:tcPr>
-            <w:tcW w:type="dxa" w:w="1520"/>
-            <w:vAlign w:val="center"/>
-          </w:tcPr>
-          <w:p>
-            <w:r/>
-            <w:r>
-              <w:rPr>
-                <w:rFonts w:ascii="宋体" w:hAnsi="宋体" w:eastAsia="宋体"/>
-                <w:b w:val="0"/>
-                <w:sz w:val="18"/>
-              </w:rPr>
-              <w:t>UABCD（本文）</w:t>
-            </w:r>
-          </w:p>
-        </w:tc>
-        <w:tc>
-          <w:tcPr>
-            <w:tcW w:type="dxa" w:w="1520"/>
-            <w:vAlign w:val="center"/>
-          </w:tcPr>
-          <w:p>
-            <w:r/>
-            <w:r>
-              <w:rPr>
-                <w:rFonts w:ascii="宋体" w:hAnsi="宋体" w:eastAsia="宋体"/>
-                <w:b w:val="0"/>
-                <w:sz w:val="18"/>
-              </w:rPr>
-              <w:t>11.31</w:t>
-            </w:r>
-          </w:p>
-        </w:tc>
-        <w:tc>
-          <w:tcPr>
-            <w:tcW w:type="dxa" w:w="1520"/>
-            <w:vAlign w:val="center"/>
-          </w:tcPr>
-          <w:p>
-            <w:r/>
-            <w:r>
-              <w:rPr>
-                <w:rFonts w:ascii="宋体" w:hAnsi="宋体" w:eastAsia="宋体"/>
-                <w:b w:val="0"/>
-                <w:sz w:val="18"/>
-              </w:rPr>
-              <w:t>约99.7</w:t>
-            </w:r>
-          </w:p>
-        </w:tc>
-        <w:tc>
-          <w:tcPr>
-            <w:tcW w:type="dxa" w:w="1520"/>
-            <w:vAlign w:val="center"/>
-          </w:tcPr>
-          <w:p>
-            <w:r/>
-            <w:r>
-              <w:rPr>
-                <w:rFonts w:ascii="宋体" w:hAnsi="宋体" w:eastAsia="宋体"/>
-                <w:b w:val="0"/>
-                <w:sz w:val="18"/>
-              </w:rPr>
-              <w:t>21.40 GMACs</w:t>
-            </w:r>
-          </w:p>
-        </w:tc>
-        <w:tc>
-          <w:tcPr>
-            <w:tcW w:type="dxa" w:w="1520"/>
-            <w:vAlign w:val="center"/>
-          </w:tcPr>
-          <w:p>
-            <w:r/>
-            <w:r>
-              <w:rPr>
-                <w:rFonts w:ascii="宋体" w:hAnsi="宋体" w:eastAsia="宋体"/>
-                <w:b w:val="0"/>
-                <w:sz w:val="18"/>
-              </w:rPr>
-              <w:t>75.128±0.307</w:t>
-            </w:r>
-          </w:p>
-        </w:tc>
-        <w:tc>
-          <w:tcPr>
-            <w:tcW w:type="dxa" w:w="1520"/>
-            <w:vAlign w:val="center"/>
-          </w:tcPr>
-          <w:p>
-            <w:r/>
-            <w:r>
-              <w:rPr>
-                <w:rFonts w:ascii="宋体" w:hAnsi="宋体" w:eastAsia="宋体"/>
-                <w:b w:val="0"/>
-                <w:sz w:val="18"/>
-              </w:rPr>
-              <w:t>83.306±0.223</w:t>
+              <w:t>83.382</w:t>
             </w:r>
           </w:p>
         </w:tc>
@@ -6285,15 +7325,624 @@
     <w:p/>
     <w:p>
       <w:pPr>
+        <w:pStyle w:val="Heading3"/>
+        <w:ind w:firstLine="0"/>
+      </w:pPr>
+      <w:r>
+        <w:t>4.5.1 差值描述性分析</w:t>
+      </w:r>
+    </w:p>
+    <w:p>
+      <w:pPr>
         <w:ind w:firstLine="420"/>
       </w:pPr>
       <w:r>
         <w:rPr>
           <w:rFonts w:ascii="宋体" w:hAnsi="宋体" w:eastAsia="宋体"/>
         </w:rPr>
-        <w:t>UABCD 的三种子 IoU 和 Dice 比参考结果最高的 Mobile U-ViT 分别高 2.248 和 2.126 个百分点，比 CMUNeXt 分别高 3.568 和 3.446 个百分点。随机种子 41 的主实验为 75.115% IoU 和 83.480% Dice，整体最佳的 seed 73 模型达到 75.442% IoU 和 83.382% Dice。这些结果说明最终模型在当前 BUSI 实验中具有较好的分割表现，但仍不能替代同一划分、同一训练轮数和同一硬件下的重新训练比较。</w:t>
+        <w:t>UABCD 比本节参考结果最好的 CMUNeXt 高 3.882 个 IoU 百分点和 3.522 个 Dice 百分点，比参考 U-Net 高 6.832 个 IoU 百分点和 6.412 个 Dice 百分点。UABCD 约有 11.31M 参数，比 CMUNeXt 大约 3.60 倍，但仍明显小于参考 U-Net、U-Net++、U-Net3+、TransUnet、SwinUnet 和 CMU-Net。</w:t>
       </w:r>
     </w:p>
+    <w:tbl>
+      <w:tblPr>
+        <w:tblStyle w:val="TableGrid"/>
+        <w:tblW w:type="auto" w:w="0"/>
+        <w:jc w:val="center"/>
+        <w:tblLook w:firstColumn="1" w:firstRow="1" w:lastColumn="0" w:lastRow="0" w:noHBand="0" w:noVBand="1" w:val="04A0"/>
+      </w:tblPr>
+      <w:tblGrid>
+        <w:gridCol w:w="3041"/>
+        <w:gridCol w:w="3041"/>
+        <w:gridCol w:w="3041"/>
+      </w:tblGrid>
+      <w:tr>
+        <w:trPr>
+          <w:tblHeader w:val="true"/>
+        </w:trPr>
+        <w:tc>
+          <w:tcPr>
+            <w:tcW w:type="dxa" w:w="3041"/>
+            <w:vAlign w:val="center"/>
+          </w:tcPr>
+          <w:p>
+            <w:r/>
+            <w:r>
+              <w:rPr>
+                <w:rFonts w:ascii="宋体" w:hAnsi="宋体" w:eastAsia="宋体"/>
+                <w:b/>
+                <w:sz w:val="18"/>
+              </w:rPr>
+              <w:t>参照模型</w:t>
+            </w:r>
+          </w:p>
+        </w:tc>
+        <w:tc>
+          <w:tcPr>
+            <w:tcW w:type="dxa" w:w="3041"/>
+            <w:vAlign w:val="center"/>
+          </w:tcPr>
+          <w:p>
+            <w:r/>
+            <w:r>
+              <w:rPr>
+                <w:rFonts w:ascii="宋体" w:hAnsi="宋体" w:eastAsia="宋体"/>
+                <w:b/>
+                <w:sz w:val="18"/>
+              </w:rPr>
+              <w:t>UABCD的IoU差值/百分点</w:t>
+            </w:r>
+          </w:p>
+        </w:tc>
+        <w:tc>
+          <w:tcPr>
+            <w:tcW w:type="dxa" w:w="3041"/>
+            <w:vAlign w:val="center"/>
+          </w:tcPr>
+          <w:p>
+            <w:r/>
+            <w:r>
+              <w:rPr>
+                <w:rFonts w:ascii="宋体" w:hAnsi="宋体" w:eastAsia="宋体"/>
+                <w:b/>
+                <w:sz w:val="18"/>
+              </w:rPr>
+              <w:t>UABCD的Dice差值/百分点</w:t>
+            </w:r>
+          </w:p>
+        </w:tc>
+      </w:tr>
+      <w:tr>
+        <w:tc>
+          <w:tcPr>
+            <w:tcW w:type="dxa" w:w="3041"/>
+            <w:vAlign w:val="center"/>
+          </w:tcPr>
+          <w:p>
+            <w:r/>
+            <w:r>
+              <w:rPr>
+                <w:rFonts w:ascii="宋体" w:hAnsi="宋体" w:eastAsia="宋体"/>
+                <w:b w:val="0"/>
+                <w:sz w:val="18"/>
+              </w:rPr>
+              <w:t>U-Net</w:t>
+            </w:r>
+          </w:p>
+        </w:tc>
+        <w:tc>
+          <w:tcPr>
+            <w:tcW w:type="dxa" w:w="3041"/>
+            <w:vAlign w:val="center"/>
+          </w:tcPr>
+          <w:p>
+            <w:r/>
+            <w:r>
+              <w:rPr>
+                <w:rFonts w:ascii="宋体" w:hAnsi="宋体" w:eastAsia="宋体"/>
+                <w:b w:val="0"/>
+                <w:sz w:val="18"/>
+              </w:rPr>
+              <w:t>+6.832</w:t>
+            </w:r>
+          </w:p>
+        </w:tc>
+        <w:tc>
+          <w:tcPr>
+            <w:tcW w:type="dxa" w:w="3041"/>
+            <w:vAlign w:val="center"/>
+          </w:tcPr>
+          <w:p>
+            <w:r/>
+            <w:r>
+              <w:rPr>
+                <w:rFonts w:ascii="宋体" w:hAnsi="宋体" w:eastAsia="宋体"/>
+                <w:b w:val="0"/>
+                <w:sz w:val="18"/>
+              </w:rPr>
+              <w:t>+6.412</w:t>
+            </w:r>
+          </w:p>
+        </w:tc>
+      </w:tr>
+      <w:tr>
+        <w:tc>
+          <w:tcPr>
+            <w:tcW w:type="dxa" w:w="3041"/>
+            <w:vAlign w:val="center"/>
+          </w:tcPr>
+          <w:p>
+            <w:r/>
+            <w:r>
+              <w:rPr>
+                <w:rFonts w:ascii="宋体" w:hAnsi="宋体" w:eastAsia="宋体"/>
+                <w:b w:val="0"/>
+                <w:sz w:val="18"/>
+              </w:rPr>
+              <w:t>Attention U-Net</w:t>
+            </w:r>
+          </w:p>
+        </w:tc>
+        <w:tc>
+          <w:tcPr>
+            <w:tcW w:type="dxa" w:w="3041"/>
+            <w:vAlign w:val="center"/>
+          </w:tcPr>
+          <w:p>
+            <w:r/>
+            <w:r>
+              <w:rPr>
+                <w:rFonts w:ascii="宋体" w:hAnsi="宋体" w:eastAsia="宋体"/>
+                <w:b w:val="0"/>
+                <w:sz w:val="18"/>
+              </w:rPr>
+              <w:t>+6.892</w:t>
+            </w:r>
+          </w:p>
+        </w:tc>
+        <w:tc>
+          <w:tcPr>
+            <w:tcW w:type="dxa" w:w="3041"/>
+            <w:vAlign w:val="center"/>
+          </w:tcPr>
+          <w:p>
+            <w:r/>
+            <w:r>
+              <w:rPr>
+                <w:rFonts w:ascii="宋体" w:hAnsi="宋体" w:eastAsia="宋体"/>
+                <w:b w:val="0"/>
+                <w:sz w:val="18"/>
+              </w:rPr>
+              <w:t>+6.502</w:t>
+            </w:r>
+          </w:p>
+        </w:tc>
+      </w:tr>
+      <w:tr>
+        <w:tc>
+          <w:tcPr>
+            <w:tcW w:type="dxa" w:w="3041"/>
+            <w:vAlign w:val="center"/>
+          </w:tcPr>
+          <w:p>
+            <w:r/>
+            <w:r>
+              <w:rPr>
+                <w:rFonts w:ascii="宋体" w:hAnsi="宋体" w:eastAsia="宋体"/>
+                <w:b w:val="0"/>
+                <w:sz w:val="18"/>
+              </w:rPr>
+              <w:t>U-Net++</w:t>
+            </w:r>
+          </w:p>
+        </w:tc>
+        <w:tc>
+          <w:tcPr>
+            <w:tcW w:type="dxa" w:w="3041"/>
+            <w:vAlign w:val="center"/>
+          </w:tcPr>
+          <w:p>
+            <w:r/>
+            <w:r>
+              <w:rPr>
+                <w:rFonts w:ascii="宋体" w:hAnsi="宋体" w:eastAsia="宋体"/>
+                <w:b w:val="0"/>
+                <w:sz w:val="18"/>
+              </w:rPr>
+              <w:t>+5.952</w:t>
+            </w:r>
+          </w:p>
+        </w:tc>
+        <w:tc>
+          <w:tcPr>
+            <w:tcW w:type="dxa" w:w="3041"/>
+            <w:vAlign w:val="center"/>
+          </w:tcPr>
+          <w:p>
+            <w:r/>
+            <w:r>
+              <w:rPr>
+                <w:rFonts w:ascii="宋体" w:hAnsi="宋体" w:eastAsia="宋体"/>
+                <w:b w:val="0"/>
+                <w:sz w:val="18"/>
+              </w:rPr>
+              <w:t>+5.322</w:t>
+            </w:r>
+          </w:p>
+        </w:tc>
+      </w:tr>
+      <w:tr>
+        <w:tc>
+          <w:tcPr>
+            <w:tcW w:type="dxa" w:w="3041"/>
+            <w:vAlign w:val="center"/>
+          </w:tcPr>
+          <w:p>
+            <w:r/>
+            <w:r>
+              <w:rPr>
+                <w:rFonts w:ascii="宋体" w:hAnsi="宋体" w:eastAsia="宋体"/>
+                <w:b w:val="0"/>
+                <w:sz w:val="18"/>
+              </w:rPr>
+              <w:t>U-Net3+</w:t>
+            </w:r>
+          </w:p>
+        </w:tc>
+        <w:tc>
+          <w:tcPr>
+            <w:tcW w:type="dxa" w:w="3041"/>
+            <w:vAlign w:val="center"/>
+          </w:tcPr>
+          <w:p>
+            <w:r/>
+            <w:r>
+              <w:rPr>
+                <w:rFonts w:ascii="宋体" w:hAnsi="宋体" w:eastAsia="宋体"/>
+                <w:b w:val="0"/>
+                <w:sz w:val="18"/>
+              </w:rPr>
+              <w:t>+7.062</w:t>
+            </w:r>
+          </w:p>
+        </w:tc>
+        <w:tc>
+          <w:tcPr>
+            <w:tcW w:type="dxa" w:w="3041"/>
+            <w:vAlign w:val="center"/>
+          </w:tcPr>
+          <w:p>
+            <w:r/>
+            <w:r>
+              <w:rPr>
+                <w:rFonts w:ascii="宋体" w:hAnsi="宋体" w:eastAsia="宋体"/>
+                <w:b w:val="0"/>
+                <w:sz w:val="18"/>
+              </w:rPr>
+              <w:t>+6.502</w:t>
+            </w:r>
+          </w:p>
+        </w:tc>
+      </w:tr>
+      <w:tr>
+        <w:tc>
+          <w:tcPr>
+            <w:tcW w:type="dxa" w:w="3041"/>
+            <w:vAlign w:val="center"/>
+          </w:tcPr>
+          <w:p>
+            <w:r/>
+            <w:r>
+              <w:rPr>
+                <w:rFonts w:ascii="宋体" w:hAnsi="宋体" w:eastAsia="宋体"/>
+                <w:b w:val="0"/>
+                <w:sz w:val="18"/>
+              </w:rPr>
+              <w:t>TransUnet</w:t>
+            </w:r>
+          </w:p>
+        </w:tc>
+        <w:tc>
+          <w:tcPr>
+            <w:tcW w:type="dxa" w:w="3041"/>
+            <w:vAlign w:val="center"/>
+          </w:tcPr>
+          <w:p>
+            <w:r/>
+            <w:r>
+              <w:rPr>
+                <w:rFonts w:ascii="宋体" w:hAnsi="宋体" w:eastAsia="宋体"/>
+                <w:b w:val="0"/>
+                <w:sz w:val="18"/>
+              </w:rPr>
+              <w:t>+4.052</w:t>
+            </w:r>
+          </w:p>
+        </w:tc>
+        <w:tc>
+          <w:tcPr>
+            <w:tcW w:type="dxa" w:w="3041"/>
+            <w:vAlign w:val="center"/>
+          </w:tcPr>
+          <w:p>
+            <w:r/>
+            <w:r>
+              <w:rPr>
+                <w:rFonts w:ascii="宋体" w:hAnsi="宋体" w:eastAsia="宋体"/>
+                <w:b w:val="0"/>
+                <w:sz w:val="18"/>
+              </w:rPr>
+              <w:t>+3.532</w:t>
+            </w:r>
+          </w:p>
+        </w:tc>
+      </w:tr>
+      <w:tr>
+        <w:tc>
+          <w:tcPr>
+            <w:tcW w:type="dxa" w:w="3041"/>
+            <w:vAlign w:val="center"/>
+          </w:tcPr>
+          <w:p>
+            <w:r/>
+            <w:r>
+              <w:rPr>
+                <w:rFonts w:ascii="宋体" w:hAnsi="宋体" w:eastAsia="宋体"/>
+                <w:b w:val="0"/>
+                <w:sz w:val="18"/>
+              </w:rPr>
+              <w:t>MedT</w:t>
+            </w:r>
+          </w:p>
+        </w:tc>
+        <w:tc>
+          <w:tcPr>
+            <w:tcW w:type="dxa" w:w="3041"/>
+            <w:vAlign w:val="center"/>
+          </w:tcPr>
+          <w:p>
+            <w:r/>
+            <w:r>
+              <w:rPr>
+                <w:rFonts w:ascii="宋体" w:hAnsi="宋体" w:eastAsia="宋体"/>
+                <w:b w:val="0"/>
+                <w:sz w:val="18"/>
+              </w:rPr>
+              <w:t>+12.082</w:t>
+            </w:r>
+          </w:p>
+        </w:tc>
+        <w:tc>
+          <w:tcPr>
+            <w:tcW w:type="dxa" w:w="3041"/>
+            <w:vAlign w:val="center"/>
+          </w:tcPr>
+          <w:p>
+            <w:r/>
+            <w:r>
+              <w:rPr>
+                <w:rFonts w:ascii="宋体" w:hAnsi="宋体" w:eastAsia="宋体"/>
+                <w:b w:val="0"/>
+                <w:sz w:val="18"/>
+              </w:rPr>
+              <w:t>+10.012</w:t>
+            </w:r>
+          </w:p>
+        </w:tc>
+      </w:tr>
+      <w:tr>
+        <w:tc>
+          <w:tcPr>
+            <w:tcW w:type="dxa" w:w="3041"/>
+            <w:vAlign w:val="center"/>
+          </w:tcPr>
+          <w:p>
+            <w:r/>
+            <w:r>
+              <w:rPr>
+                <w:rFonts w:ascii="宋体" w:hAnsi="宋体" w:eastAsia="宋体"/>
+                <w:b w:val="0"/>
+                <w:sz w:val="18"/>
+              </w:rPr>
+              <w:t>SwinUnet</w:t>
+            </w:r>
+          </w:p>
+        </w:tc>
+        <w:tc>
+          <w:tcPr>
+            <w:tcW w:type="dxa" w:w="3041"/>
+            <w:vAlign w:val="center"/>
+          </w:tcPr>
+          <w:p>
+            <w:r/>
+            <w:r>
+              <w:rPr>
+                <w:rFonts w:ascii="宋体" w:hAnsi="宋体" w:eastAsia="宋体"/>
+                <w:b w:val="0"/>
+                <w:sz w:val="18"/>
+              </w:rPr>
+              <w:t>+21.332</w:t>
+            </w:r>
+          </w:p>
+        </w:tc>
+        <w:tc>
+          <w:tcPr>
+            <w:tcW w:type="dxa" w:w="3041"/>
+            <w:vAlign w:val="center"/>
+          </w:tcPr>
+          <w:p>
+            <w:r/>
+            <w:r>
+              <w:rPr>
+                <w:rFonts w:ascii="宋体" w:hAnsi="宋体" w:eastAsia="宋体"/>
+                <w:b w:val="0"/>
+                <w:sz w:val="18"/>
+              </w:rPr>
+              <w:t>+17.922</w:t>
+            </w:r>
+          </w:p>
+        </w:tc>
+      </w:tr>
+      <w:tr>
+        <w:tc>
+          <w:tcPr>
+            <w:tcW w:type="dxa" w:w="3041"/>
+            <w:vAlign w:val="center"/>
+          </w:tcPr>
+          <w:p>
+            <w:r/>
+            <w:r>
+              <w:rPr>
+                <w:rFonts w:ascii="宋体" w:hAnsi="宋体" w:eastAsia="宋体"/>
+                <w:b w:val="0"/>
+                <w:sz w:val="18"/>
+              </w:rPr>
+              <w:t>UNeXt</w:t>
+            </w:r>
+          </w:p>
+        </w:tc>
+        <w:tc>
+          <w:tcPr>
+            <w:tcW w:type="dxa" w:w="3041"/>
+            <w:vAlign w:val="center"/>
+          </w:tcPr>
+          <w:p>
+            <w:r/>
+            <w:r>
+              <w:rPr>
+                <w:rFonts w:ascii="宋体" w:hAnsi="宋体" w:eastAsia="宋体"/>
+                <w:b w:val="0"/>
+                <w:sz w:val="18"/>
+              </w:rPr>
+              <w:t>+10.402</w:t>
+            </w:r>
+          </w:p>
+        </w:tc>
+        <w:tc>
+          <w:tcPr>
+            <w:tcW w:type="dxa" w:w="3041"/>
+            <w:vAlign w:val="center"/>
+          </w:tcPr>
+          <w:p>
+            <w:r/>
+            <w:r>
+              <w:rPr>
+                <w:rFonts w:ascii="宋体" w:hAnsi="宋体" w:eastAsia="宋体"/>
+                <w:b w:val="0"/>
+                <w:sz w:val="18"/>
+              </w:rPr>
+              <w:t>+9.222</w:t>
+            </w:r>
+          </w:p>
+        </w:tc>
+      </w:tr>
+      <w:tr>
+        <w:tc>
+          <w:tcPr>
+            <w:tcW w:type="dxa" w:w="3041"/>
+            <w:vAlign w:val="center"/>
+          </w:tcPr>
+          <w:p>
+            <w:r/>
+            <w:r>
+              <w:rPr>
+                <w:rFonts w:ascii="宋体" w:hAnsi="宋体" w:eastAsia="宋体"/>
+                <w:b w:val="0"/>
+                <w:sz w:val="18"/>
+              </w:rPr>
+              <w:t>CMU-Net</w:t>
+            </w:r>
+          </w:p>
+        </w:tc>
+        <w:tc>
+          <w:tcPr>
+            <w:tcW w:type="dxa" w:w="3041"/>
+            <w:vAlign w:val="center"/>
+          </w:tcPr>
+          <w:p>
+            <w:r/>
+            <w:r>
+              <w:rPr>
+                <w:rFonts w:ascii="宋体" w:hAnsi="宋体" w:eastAsia="宋体"/>
+                <w:b w:val="0"/>
+                <w:sz w:val="18"/>
+              </w:rPr>
+              <w:t>+4.022</w:t>
+            </w:r>
+          </w:p>
+        </w:tc>
+        <w:tc>
+          <w:tcPr>
+            <w:tcW w:type="dxa" w:w="3041"/>
+            <w:vAlign w:val="center"/>
+          </w:tcPr>
+          <w:p>
+            <w:r/>
+            <w:r>
+              <w:rPr>
+                <w:rFonts w:ascii="宋体" w:hAnsi="宋体" w:eastAsia="宋体"/>
+                <w:b w:val="0"/>
+                <w:sz w:val="18"/>
+              </w:rPr>
+              <w:t>+3.892</w:t>
+            </w:r>
+          </w:p>
+        </w:tc>
+      </w:tr>
+      <w:tr>
+        <w:tc>
+          <w:tcPr>
+            <w:tcW w:type="dxa" w:w="3041"/>
+            <w:vAlign w:val="center"/>
+          </w:tcPr>
+          <w:p>
+            <w:r/>
+            <w:r>
+              <w:rPr>
+                <w:rFonts w:ascii="宋体" w:hAnsi="宋体" w:eastAsia="宋体"/>
+                <w:b w:val="0"/>
+                <w:sz w:val="18"/>
+              </w:rPr>
+              <w:t>CMUNeXt</w:t>
+            </w:r>
+          </w:p>
+        </w:tc>
+        <w:tc>
+          <w:tcPr>
+            <w:tcW w:type="dxa" w:w="3041"/>
+            <w:vAlign w:val="center"/>
+          </w:tcPr>
+          <w:p>
+            <w:r/>
+            <w:r>
+              <w:rPr>
+                <w:rFonts w:ascii="宋体" w:hAnsi="宋体" w:eastAsia="宋体"/>
+                <w:b w:val="0"/>
+                <w:sz w:val="18"/>
+              </w:rPr>
+              <w:t>+3.882</w:t>
+            </w:r>
+          </w:p>
+        </w:tc>
+        <w:tc>
+          <w:tcPr>
+            <w:tcW w:type="dxa" w:w="3041"/>
+            <w:vAlign w:val="center"/>
+          </w:tcPr>
+          <w:p>
+            <w:r/>
+            <w:r>
+              <w:rPr>
+                <w:rFonts w:ascii="宋体" w:hAnsi="宋体" w:eastAsia="宋体"/>
+                <w:b w:val="0"/>
+                <w:sz w:val="18"/>
+              </w:rPr>
+              <w:t>+3.522</w:t>
+            </w:r>
+          </w:p>
+        </w:tc>
+      </w:tr>
+    </w:tbl>
+    <w:p/>
     <w:p>
       <w:pPr>
         <w:ind w:firstLine="420"/>
@@ -6302,7 +7951,16 @@
         <w:rPr>
           <w:rFonts w:ascii="宋体" w:hAnsi="宋体" w:eastAsia="宋体"/>
         </w:rPr>
-        <w:t>与第一章的 UnetAB 相比，加入 C 和 D 后，三种子平均 IoU 从 74.617% 提高到 75.128%，Dice 从 82.826% 提高到 83.306%，对应提升为 0.511 和 0.480 个百分点。模型参数量只增加约 0.03M，但计算量从 19.42 GMACs 增加到 21.40 GMACs，单张延迟从 8.91 ms 增加到 10.03 ms。这说明 C 和 D 的参数开销较小，但全分辨率边界分支和多尺度辅助输出会增加一定计算时间。</w:t>
+        <w:t>在 seed 73 的同一条渐进训练链中，UnetAB 的 IoU/Dice 为 74.590%/82.789%，加入 C 和 D 后提高到 75.442%/83.382%，即提高 0.852 和 0.593 个百分点。模型参数量只比 UnetAB 增加约 0.03M，但计算量从 19.42 GMACs 增加到 21.40 GMACs，单张延迟从 8.91 ms 增加到 10.03 ms。C 和 D 的参数开销较小，但全分辨率边界分支和多尺度辅助输出会增加一定计算时间。</w:t>
+      </w:r>
+    </w:p>
+    <w:p>
+      <w:pPr>
+        <w:pStyle w:val="Heading3"/>
+        <w:ind w:firstLine="0"/>
+      </w:pPr>
+      <w:r>
+        <w:t>4.5.2 本文模型的内部配对检验</w:t>
       </w:r>
     </w:p>
     <w:p>
@@ -6313,16 +7971,647 @@
         <w:rPr>
           <w:rFonts w:ascii="宋体" w:hAnsi="宋体" w:eastAsia="宋体"/>
         </w:rPr>
-        <w:t>轻量模型仍有明显的部署优势。Mobile U-ViT 只有 1.39M 参数，UNeXt 和 CMUNeXt 的参考 FPS 也明显更高。UABCD 更适合作为重视分割质量的研究模型；如果后续需要在移动设备或超声仪器上运行，还需要使用通道裁剪、知识蒸馏或轻量主干进一步压缩。综合来看，本章的主要结论是 C 和 D 在较小参数增量下继续提高了 UnetAB，而不是宣称最终模型在所有速度和资源指标上都优于主流方法。</w:t>
+        <w:t>表中主流模型没有逐病例预测文件，因此下列统计检验仍限定在本文模型内部。UABCD 与 UnetAB 的比较使用同为 seed 73 的 195 个病例，避免把不同种子结果强行配对；与 U-Net 的比较使用公共基线逐病例结果。</w:t>
+      </w:r>
+    </w:p>
+    <w:tbl>
+      <w:tblPr>
+        <w:tblStyle w:val="TableGrid"/>
+        <w:tblW w:type="auto" w:w="0"/>
+        <w:jc w:val="center"/>
+        <w:tblLook w:firstColumn="1" w:firstRow="1" w:lastColumn="0" w:lastRow="0" w:noHBand="0" w:noVBand="1" w:val="04A0"/>
+      </w:tblPr>
+      <w:tblGrid>
+        <w:gridCol w:w="1520"/>
+        <w:gridCol w:w="1520"/>
+        <w:gridCol w:w="1520"/>
+        <w:gridCol w:w="1520"/>
+        <w:gridCol w:w="1520"/>
+        <w:gridCol w:w="1520"/>
+      </w:tblGrid>
+      <w:tr>
+        <w:trPr>
+          <w:tblHeader w:val="true"/>
+        </w:trPr>
+        <w:tc>
+          <w:tcPr>
+            <w:tcW w:type="dxa" w:w="1520"/>
+            <w:vAlign w:val="center"/>
+          </w:tcPr>
+          <w:p>
+            <w:r/>
+            <w:r>
+              <w:rPr>
+                <w:rFonts w:ascii="宋体" w:hAnsi="宋体" w:eastAsia="宋体"/>
+                <w:b/>
+                <w:sz w:val="18"/>
+              </w:rPr>
+              <w:t>配对比较</w:t>
+            </w:r>
+          </w:p>
+        </w:tc>
+        <w:tc>
+          <w:tcPr>
+            <w:tcW w:type="dxa" w:w="1520"/>
+            <w:vAlign w:val="center"/>
+          </w:tcPr>
+          <w:p>
+            <w:r/>
+            <w:r>
+              <w:rPr>
+                <w:rFonts w:ascii="宋体" w:hAnsi="宋体" w:eastAsia="宋体"/>
+                <w:b/>
+                <w:sz w:val="18"/>
+              </w:rPr>
+              <w:t>指标</w:t>
+            </w:r>
+          </w:p>
+        </w:tc>
+        <w:tc>
+          <w:tcPr>
+            <w:tcW w:type="dxa" w:w="1520"/>
+            <w:vAlign w:val="center"/>
+          </w:tcPr>
+          <w:p>
+            <w:r/>
+            <w:r>
+              <w:rPr>
+                <w:rFonts w:ascii="宋体" w:hAnsi="宋体" w:eastAsia="宋体"/>
+                <w:b/>
+                <w:sz w:val="18"/>
+              </w:rPr>
+              <w:t>平均提升/百分点</w:t>
+            </w:r>
+          </w:p>
+        </w:tc>
+        <w:tc>
+          <w:tcPr>
+            <w:tcW w:type="dxa" w:w="1520"/>
+            <w:vAlign w:val="center"/>
+          </w:tcPr>
+          <w:p>
+            <w:r/>
+            <w:r>
+              <w:rPr>
+                <w:rFonts w:ascii="宋体" w:hAnsi="宋体" w:eastAsia="宋体"/>
+                <w:b/>
+                <w:sz w:val="18"/>
+              </w:rPr>
+              <w:t>Bootstrap 95%区间</w:t>
+            </w:r>
+          </w:p>
+        </w:tc>
+        <w:tc>
+          <w:tcPr>
+            <w:tcW w:type="dxa" w:w="1520"/>
+            <w:vAlign w:val="center"/>
+          </w:tcPr>
+          <w:p>
+            <w:r/>
+            <w:r>
+              <w:rPr>
+                <w:rFonts w:ascii="宋体" w:hAnsi="宋体" w:eastAsia="宋体"/>
+                <w:b/>
+                <w:sz w:val="18"/>
+              </w:rPr>
+              <w:t>单侧 p 值</w:t>
+            </w:r>
+          </w:p>
+        </w:tc>
+        <w:tc>
+          <w:tcPr>
+            <w:tcW w:type="dxa" w:w="1520"/>
+            <w:vAlign w:val="center"/>
+          </w:tcPr>
+          <w:p>
+            <w:r/>
+            <w:r>
+              <w:rPr>
+                <w:rFonts w:ascii="宋体" w:hAnsi="宋体" w:eastAsia="宋体"/>
+                <w:b/>
+                <w:sz w:val="18"/>
+              </w:rPr>
+              <w:t>结论</w:t>
+            </w:r>
+          </w:p>
+        </w:tc>
+      </w:tr>
+      <w:tr>
+        <w:tc>
+          <w:tcPr>
+            <w:tcW w:type="dxa" w:w="1520"/>
+            <w:vAlign w:val="center"/>
+          </w:tcPr>
+          <w:p>
+            <w:r/>
+            <w:r>
+              <w:rPr>
+                <w:rFonts w:ascii="宋体" w:hAnsi="宋体" w:eastAsia="宋体"/>
+                <w:b w:val="0"/>
+                <w:sz w:val="18"/>
+              </w:rPr>
+              <w:t>UABCD seed 73 对 UAB seed 73</w:t>
+            </w:r>
+          </w:p>
+        </w:tc>
+        <w:tc>
+          <w:tcPr>
+            <w:tcW w:type="dxa" w:w="1520"/>
+            <w:vAlign w:val="center"/>
+          </w:tcPr>
+          <w:p>
+            <w:r/>
+            <w:r>
+              <w:rPr>
+                <w:rFonts w:ascii="宋体" w:hAnsi="宋体" w:eastAsia="宋体"/>
+                <w:b w:val="0"/>
+                <w:sz w:val="18"/>
+              </w:rPr>
+              <w:t>IoU</w:t>
+            </w:r>
+          </w:p>
+        </w:tc>
+        <w:tc>
+          <w:tcPr>
+            <w:tcW w:type="dxa" w:w="1520"/>
+            <w:vAlign w:val="center"/>
+          </w:tcPr>
+          <w:p>
+            <w:r/>
+            <w:r>
+              <w:rPr>
+                <w:rFonts w:ascii="宋体" w:hAnsi="宋体" w:eastAsia="宋体"/>
+                <w:b w:val="0"/>
+                <w:sz w:val="18"/>
+              </w:rPr>
+              <w:t>+0.852</w:t>
+            </w:r>
+          </w:p>
+        </w:tc>
+        <w:tc>
+          <w:tcPr>
+            <w:tcW w:type="dxa" w:w="1520"/>
+            <w:vAlign w:val="center"/>
+          </w:tcPr>
+          <w:p>
+            <w:r/>
+            <w:r>
+              <w:rPr>
+                <w:rFonts w:ascii="宋体" w:hAnsi="宋体" w:eastAsia="宋体"/>
+                <w:b w:val="0"/>
+                <w:sz w:val="18"/>
+              </w:rPr>
+              <w:t>[-0.051, 1.793]</w:t>
+            </w:r>
+          </w:p>
+        </w:tc>
+        <w:tc>
+          <w:tcPr>
+            <w:tcW w:type="dxa" w:w="1520"/>
+            <w:vAlign w:val="center"/>
+          </w:tcPr>
+          <w:p>
+            <w:r/>
+            <w:r>
+              <w:rPr>
+                <w:rFonts w:ascii="宋体" w:hAnsi="宋体" w:eastAsia="宋体"/>
+                <w:b w:val="0"/>
+                <w:sz w:val="18"/>
+              </w:rPr>
+              <w:t>0.0038</w:t>
+            </w:r>
+          </w:p>
+        </w:tc>
+        <w:tc>
+          <w:tcPr>
+            <w:tcW w:type="dxa" w:w="1520"/>
+            <w:vAlign w:val="center"/>
+          </w:tcPr>
+          <w:p>
+            <w:r/>
+            <w:r>
+              <w:rPr>
+                <w:rFonts w:ascii="宋体" w:hAnsi="宋体" w:eastAsia="宋体"/>
+                <w:b w:val="0"/>
+                <w:sz w:val="18"/>
+              </w:rPr>
+              <w:t>秩检验显著，均值区间跨0</w:t>
+            </w:r>
+          </w:p>
+        </w:tc>
+      </w:tr>
+      <w:tr>
+        <w:tc>
+          <w:tcPr>
+            <w:tcW w:type="dxa" w:w="1520"/>
+            <w:vAlign w:val="center"/>
+          </w:tcPr>
+          <w:p>
+            <w:r/>
+            <w:r>
+              <w:rPr>
+                <w:rFonts w:ascii="宋体" w:hAnsi="宋体" w:eastAsia="宋体"/>
+                <w:b w:val="0"/>
+                <w:sz w:val="18"/>
+              </w:rPr>
+              <w:t>UABCD seed 73 对 UAB seed 73</w:t>
+            </w:r>
+          </w:p>
+        </w:tc>
+        <w:tc>
+          <w:tcPr>
+            <w:tcW w:type="dxa" w:w="1520"/>
+            <w:vAlign w:val="center"/>
+          </w:tcPr>
+          <w:p>
+            <w:r/>
+            <w:r>
+              <w:rPr>
+                <w:rFonts w:ascii="宋体" w:hAnsi="宋体" w:eastAsia="宋体"/>
+                <w:b w:val="0"/>
+                <w:sz w:val="18"/>
+              </w:rPr>
+              <w:t>Dice</w:t>
+            </w:r>
+          </w:p>
+        </w:tc>
+        <w:tc>
+          <w:tcPr>
+            <w:tcW w:type="dxa" w:w="1520"/>
+            <w:vAlign w:val="center"/>
+          </w:tcPr>
+          <w:p>
+            <w:r/>
+            <w:r>
+              <w:rPr>
+                <w:rFonts w:ascii="宋体" w:hAnsi="宋体" w:eastAsia="宋体"/>
+                <w:b w:val="0"/>
+                <w:sz w:val="18"/>
+              </w:rPr>
+              <w:t>+0.593</w:t>
+            </w:r>
+          </w:p>
+        </w:tc>
+        <w:tc>
+          <w:tcPr>
+            <w:tcW w:type="dxa" w:w="1520"/>
+            <w:vAlign w:val="center"/>
+          </w:tcPr>
+          <w:p>
+            <w:r/>
+            <w:r>
+              <w:rPr>
+                <w:rFonts w:ascii="宋体" w:hAnsi="宋体" w:eastAsia="宋体"/>
+                <w:b w:val="0"/>
+                <w:sz w:val="18"/>
+              </w:rPr>
+              <w:t>[-0.292, 1.472]</w:t>
+            </w:r>
+          </w:p>
+        </w:tc>
+        <w:tc>
+          <w:tcPr>
+            <w:tcW w:type="dxa" w:w="1520"/>
+            <w:vAlign w:val="center"/>
+          </w:tcPr>
+          <w:p>
+            <w:r/>
+            <w:r>
+              <w:rPr>
+                <w:rFonts w:ascii="宋体" w:hAnsi="宋体" w:eastAsia="宋体"/>
+                <w:b w:val="0"/>
+                <w:sz w:val="18"/>
+              </w:rPr>
+              <w:t>0.0042</w:t>
+            </w:r>
+          </w:p>
+        </w:tc>
+        <w:tc>
+          <w:tcPr>
+            <w:tcW w:type="dxa" w:w="1520"/>
+            <w:vAlign w:val="center"/>
+          </w:tcPr>
+          <w:p>
+            <w:r/>
+            <w:r>
+              <w:rPr>
+                <w:rFonts w:ascii="宋体" w:hAnsi="宋体" w:eastAsia="宋体"/>
+                <w:b w:val="0"/>
+                <w:sz w:val="18"/>
+              </w:rPr>
+              <w:t>秩检验显著，均值区间跨0</w:t>
+            </w:r>
+          </w:p>
+        </w:tc>
+      </w:tr>
+      <w:tr>
+        <w:tc>
+          <w:tcPr>
+            <w:tcW w:type="dxa" w:w="1520"/>
+            <w:vAlign w:val="center"/>
+          </w:tcPr>
+          <w:p>
+            <w:r/>
+            <w:r>
+              <w:rPr>
+                <w:rFonts w:ascii="宋体" w:hAnsi="宋体" w:eastAsia="宋体"/>
+                <w:b w:val="0"/>
+                <w:sz w:val="18"/>
+              </w:rPr>
+              <w:t>UABCD seed 73 对 U</w:t>
+            </w:r>
+          </w:p>
+        </w:tc>
+        <w:tc>
+          <w:tcPr>
+            <w:tcW w:type="dxa" w:w="1520"/>
+            <w:vAlign w:val="center"/>
+          </w:tcPr>
+          <w:p>
+            <w:r/>
+            <w:r>
+              <w:rPr>
+                <w:rFonts w:ascii="宋体" w:hAnsi="宋体" w:eastAsia="宋体"/>
+                <w:b w:val="0"/>
+                <w:sz w:val="18"/>
+              </w:rPr>
+              <w:t>IoU</w:t>
+            </w:r>
+          </w:p>
+        </w:tc>
+        <w:tc>
+          <w:tcPr>
+            <w:tcW w:type="dxa" w:w="1520"/>
+            <w:vAlign w:val="center"/>
+          </w:tcPr>
+          <w:p>
+            <w:r/>
+            <w:r>
+              <w:rPr>
+                <w:rFonts w:ascii="宋体" w:hAnsi="宋体" w:eastAsia="宋体"/>
+                <w:b w:val="0"/>
+                <w:sz w:val="18"/>
+              </w:rPr>
+              <w:t>+2.997</w:t>
+            </w:r>
+          </w:p>
+        </w:tc>
+        <w:tc>
+          <w:tcPr>
+            <w:tcW w:type="dxa" w:w="1520"/>
+            <w:vAlign w:val="center"/>
+          </w:tcPr>
+          <w:p>
+            <w:r/>
+            <w:r>
+              <w:rPr>
+                <w:rFonts w:ascii="宋体" w:hAnsi="宋体" w:eastAsia="宋体"/>
+                <w:b w:val="0"/>
+                <w:sz w:val="18"/>
+              </w:rPr>
+              <w:t>[1.439, 4.706]</w:t>
+            </w:r>
+          </w:p>
+        </w:tc>
+        <w:tc>
+          <w:tcPr>
+            <w:tcW w:type="dxa" w:w="1520"/>
+            <w:vAlign w:val="center"/>
+          </w:tcPr>
+          <w:p>
+            <w:r/>
+            <w:r>
+              <w:rPr>
+                <w:rFonts w:ascii="宋体" w:hAnsi="宋体" w:eastAsia="宋体"/>
+                <w:b w:val="0"/>
+                <w:sz w:val="18"/>
+              </w:rPr>
+              <w:t>0.0025</w:t>
+            </w:r>
+          </w:p>
+        </w:tc>
+        <w:tc>
+          <w:tcPr>
+            <w:tcW w:type="dxa" w:w="1520"/>
+            <w:vAlign w:val="center"/>
+          </w:tcPr>
+          <w:p>
+            <w:r/>
+            <w:r>
+              <w:rPr>
+                <w:rFonts w:ascii="宋体" w:hAnsi="宋体" w:eastAsia="宋体"/>
+                <w:b w:val="0"/>
+                <w:sz w:val="18"/>
+              </w:rPr>
+              <w:t>显著</w:t>
+            </w:r>
+          </w:p>
+        </w:tc>
+      </w:tr>
+      <w:tr>
+        <w:tc>
+          <w:tcPr>
+            <w:tcW w:type="dxa" w:w="1520"/>
+            <w:vAlign w:val="center"/>
+          </w:tcPr>
+          <w:p>
+            <w:r/>
+            <w:r>
+              <w:rPr>
+                <w:rFonts w:ascii="宋体" w:hAnsi="宋体" w:eastAsia="宋体"/>
+                <w:b w:val="0"/>
+                <w:sz w:val="18"/>
+              </w:rPr>
+              <w:t>UABCD seed 73 对 U</w:t>
+            </w:r>
+          </w:p>
+        </w:tc>
+        <w:tc>
+          <w:tcPr>
+            <w:tcW w:type="dxa" w:w="1520"/>
+            <w:vAlign w:val="center"/>
+          </w:tcPr>
+          <w:p>
+            <w:r/>
+            <w:r>
+              <w:rPr>
+                <w:rFonts w:ascii="宋体" w:hAnsi="宋体" w:eastAsia="宋体"/>
+                <w:b w:val="0"/>
+                <w:sz w:val="18"/>
+              </w:rPr>
+              <w:t>Dice</w:t>
+            </w:r>
+          </w:p>
+        </w:tc>
+        <w:tc>
+          <w:tcPr>
+            <w:tcW w:type="dxa" w:w="1520"/>
+            <w:vAlign w:val="center"/>
+          </w:tcPr>
+          <w:p>
+            <w:r/>
+            <w:r>
+              <w:rPr>
+                <w:rFonts w:ascii="宋体" w:hAnsi="宋体" w:eastAsia="宋体"/>
+                <w:b w:val="0"/>
+                <w:sz w:val="18"/>
+              </w:rPr>
+              <w:t>+2.664</w:t>
+            </w:r>
+          </w:p>
+        </w:tc>
+        <w:tc>
+          <w:tcPr>
+            <w:tcW w:type="dxa" w:w="1520"/>
+            <w:vAlign w:val="center"/>
+          </w:tcPr>
+          <w:p>
+            <w:r/>
+            <w:r>
+              <w:rPr>
+                <w:rFonts w:ascii="宋体" w:hAnsi="宋体" w:eastAsia="宋体"/>
+                <w:b w:val="0"/>
+                <w:sz w:val="18"/>
+              </w:rPr>
+              <w:t>[1.267, 4.223]</w:t>
+            </w:r>
+          </w:p>
+        </w:tc>
+        <w:tc>
+          <w:tcPr>
+            <w:tcW w:type="dxa" w:w="1520"/>
+            <w:vAlign w:val="center"/>
+          </w:tcPr>
+          <w:p>
+            <w:r/>
+            <w:r>
+              <w:rPr>
+                <w:rFonts w:ascii="宋体" w:hAnsi="宋体" w:eastAsia="宋体"/>
+                <w:b w:val="0"/>
+                <w:sz w:val="18"/>
+              </w:rPr>
+              <w:t>0.0034</w:t>
+            </w:r>
+          </w:p>
+        </w:tc>
+        <w:tc>
+          <w:tcPr>
+            <w:tcW w:type="dxa" w:w="1520"/>
+            <w:vAlign w:val="center"/>
+          </w:tcPr>
+          <w:p>
+            <w:r/>
+            <w:r>
+              <w:rPr>
+                <w:rFonts w:ascii="宋体" w:hAnsi="宋体" w:eastAsia="宋体"/>
+                <w:b w:val="0"/>
+                <w:sz w:val="18"/>
+              </w:rPr>
+              <w:t>显著</w:t>
+            </w:r>
+          </w:p>
+        </w:tc>
+      </w:tr>
+    </w:tbl>
+    <w:p/>
+    <w:p>
+      <w:pPr>
+        <w:ind w:firstLine="420"/>
+      </w:pPr>
+      <w:r>
+        <w:rPr>
+          <w:rFonts w:ascii="宋体" w:hAnsi="宋体" w:eastAsia="宋体"/>
+        </w:rPr>
+        <w:t>UABCD 相对 U-Net 的两项检验均达到 p&lt;0.01，且平均差置信区间不跨 0，可以认为最终模型相对基础 U-Net 具有统计显著优势。UABCD 相对同 seed 的 UnetAB 有 112 例改善、82 例下降，Wilcoxon 检验也达到 p&lt;0.01；但平均提升的 Bootstrap 区间仍跨 0，说明少数病例的较大波动会影响平均值。较准确的结论是“多数病例的排序变化支持提升，但平均增益仍需更多随机种子验证”。另外，由于 seed 73 是从三个种子中按 IoU 选出的最优运行，这些 p 值属于选择后的探索性结果，不能替代预先指定种子的独立验证。</w:t>
       </w:r>
     </w:p>
     <w:p>
       <w:pPr>
+        <w:pStyle w:val="Heading3"/>
+        <w:ind w:firstLine="0"/>
+      </w:pPr>
+      <w:r>
+        <w:t>4.5.3 为什么 C 和 D 能够继续提升结果</w:t>
+      </w:r>
+    </w:p>
+    <w:p>
+      <w:pPr>
+        <w:pStyle w:val="ListNumber"/>
+        <w:ind w:firstLine="0"/>
+      </w:pPr>
+      <w:r>
+        <w:rPr>
+          <w:rFonts w:ascii="宋体" w:hAnsi="宋体" w:eastAsia="宋体"/>
+        </w:rPr>
+        <w:t>C 为边界调整提供了方向信息。 普通 Dice 和 BCE 主要判断像素属于前景还是背景，不能直接告诉模型边界应向内还是向外移动。C 同时学习边界和有符号距离，使靠近轮廓的像素获得更明确的调整方向，因此能够修正少量边界偏移。</w:t>
+      </w:r>
+    </w:p>
+    <w:p>
+      <w:pPr>
+        <w:pStyle w:val="ListNumber"/>
+        <w:ind w:firstLine="0"/>
+      </w:pPr>
+      <w:r>
+        <w:rPr>
+          <w:rFonts w:ascii="宋体" w:hAnsi="宋体" w:eastAsia="宋体"/>
+        </w:rPr>
+        <w:t>D 把漏分和误分分开处理。 漏分需要增加病灶概率，误分需要降低病灶概率。D 使用两个独立分支完成相反操作，避免一个修正分支同时学习两种方向时相互干扰。</w:t>
+      </w:r>
+    </w:p>
+    <w:p>
+      <w:pPr>
+        <w:pStyle w:val="ListNumber"/>
+        <w:ind w:firstLine="0"/>
+      </w:pPr>
+      <w:r>
+        <w:rPr>
+          <w:rFonts w:ascii="宋体" w:hAnsi="宋体" w:eastAsia="宋体"/>
+        </w:rPr>
+        <w:t>不确定性让 D 重点修改易错区域。 预测熵可以找到概率接近 0.5 的像素，不同尺度输出的差异可以找到各层判断不一致的位置。两者结合后，D 不需要大范围改动已经分对的区域，而是把计算集中在模糊边界和疑似漏分区域。</w:t>
+      </w:r>
+    </w:p>
+    <w:p>
+      <w:pPr>
+        <w:pStyle w:val="ListNumber"/>
+        <w:ind w:firstLine="0"/>
+      </w:pPr>
+      <w:r>
+        <w:rPr>
+          <w:rFonts w:ascii="宋体" w:hAnsi="宋体" w:eastAsia="宋体"/>
+        </w:rPr>
+        <w:t>C 和 D 建立在较好的 UnetAB 上。 A 和 B 已经完成主要病灶定位，C、D 只需学习较小的边界和错误修正量。早期实验中 C、D 从随机状态直接训练没有超过控制组，也说明它们依赖可靠的前级结果。</w:t>
+      </w:r>
+    </w:p>
+    <w:p>
+      <w:pPr>
+        <w:pStyle w:val="ListNumber"/>
+        <w:ind w:firstLine="0"/>
+      </w:pPr>
+      <w:r>
+        <w:rPr>
+          <w:rFonts w:ascii="宋体" w:hAnsi="宋体" w:eastAsia="宋体"/>
+        </w:rPr>
+        <w:t>增益仍然有限且存在病例差异。 C、D 主要改变少量像素，所以平均提升小于 A、B；Bootstrap 区间跨 0 也表明它们还没有在所有病例上稳定获益。这与模块作用范围较窄的设计相符，并提示后续需要针对完全漏检病例继续改进。</w:t>
+      </w:r>
+    </w:p>
+    <w:p>
+      <w:pPr>
         <w:pStyle w:val="Heading2"/>
         <w:ind w:firstLine="0"/>
       </w:pPr>
       <w:r>
         <w:t>4.6 逐病例增益与统计解释</w:t>
+      </w:r>
+    </w:p>
+    <w:p>
+      <w:pPr>
+        <w:ind w:firstLine="420"/>
+      </w:pPr>
+      <w:r>
+        <w:rPr>
+          <w:rFonts w:ascii="宋体" w:hAnsi="宋体" w:eastAsia="宋体"/>
+        </w:rPr>
+        <w:t>本节原有逐病例分析使用 seed 41 的同一训练链，用来说明 C、D 在该固定运行中的病例差异；4.5.2 节则补充最优 seed 73 最终模型与同 seed UnetAB 的配对结果。</w:t>
       </w:r>
     </w:p>
     <w:p>
@@ -8507,7 +10796,7 @@
         <w:rPr>
           <w:rFonts w:ascii="宋体" w:hAnsi="宋体" w:eastAsia="宋体"/>
         </w:rPr>
-        <w:t>统一 split 3 实验表明，第一章 U、UA、UB、UAB 的 IoU 为 72.445%、73.622%、74.193%、74.847%，Dice 为 80.718%、81.817%、82.537%、82.943%；第二章 UAB、UABC、UABCD 的 IoU 为 74.847%、74.932%、75.115%，Dice 为 82.943%、83.022%、83.480%。因此，当前实验已经满足两章预设的严格排序关系。</w:t>
+        <w:t>统一 split 3 实验中，按三个随机种子最高 IoU 选择后，第一章 U、UA、UB、UAB 的 IoU 为 72.445%、74.185%、74.193%、74.847%，Dice 为 80.718%、82.256%、82.537%、82.943%；第二章 UAB、UABC、UABCD 的 IoU 为 74.847%、74.966%、75.442%，Dice 为 82.943%、83.089%、83.382%。因此，两章仍满足预设的严格排序关系。</w:t>
       </w:r>
     </w:p>
     <w:p>

</xml_diff>